<commit_message>
added new way of demo and started ptp
</commit_message>
<xml_diff>
--- a/README.docx
+++ b/README.docx
@@ -53,7 +53,7 @@
         <w:pStyle w:val="Compact"/>
         <w:numPr>
           <w:ilvl w:val="0"/>
-          <w:numId w:val="19"/>
+          <w:numId w:val="15"/>
         </w:numPr>
         <w:rPr/>
       </w:pPr>
@@ -67,7 +67,7 @@
         <w:pStyle w:val="Compact"/>
         <w:numPr>
           <w:ilvl w:val="0"/>
-          <w:numId w:val="1"/>
+          <w:numId w:val="4"/>
         </w:numPr>
         <w:rPr/>
       </w:pPr>
@@ -81,7 +81,7 @@
         <w:pStyle w:val="Compact"/>
         <w:numPr>
           <w:ilvl w:val="0"/>
-          <w:numId w:val="1"/>
+          <w:numId w:val="4"/>
         </w:numPr>
         <w:rPr/>
       </w:pPr>
@@ -107,7 +107,7 @@
         <w:pStyle w:val="Compact"/>
         <w:numPr>
           <w:ilvl w:val="0"/>
-          <w:numId w:val="20"/>
+          <w:numId w:val="16"/>
         </w:numPr>
         <w:rPr/>
       </w:pPr>
@@ -131,7 +131,7 @@
         <w:pStyle w:val="Compact"/>
         <w:numPr>
           <w:ilvl w:val="0"/>
-          <w:numId w:val="2"/>
+          <w:numId w:val="5"/>
         </w:numPr>
         <w:rPr/>
       </w:pPr>
@@ -155,7 +155,7 @@
         <w:pStyle w:val="Compact"/>
         <w:numPr>
           <w:ilvl w:val="0"/>
-          <w:numId w:val="2"/>
+          <w:numId w:val="5"/>
         </w:numPr>
         <w:rPr/>
       </w:pPr>
@@ -221,7 +221,7 @@
         <w:pStyle w:val="Compact"/>
         <w:numPr>
           <w:ilvl w:val="0"/>
-          <w:numId w:val="21"/>
+          <w:numId w:val="17"/>
         </w:numPr>
         <w:rPr/>
       </w:pPr>
@@ -1267,31 +1267,11 @@
         <w:rPr>
           <w:rStyle w:val="VerbatimChar"/>
         </w:rPr>
-        <w:t>https://&lt;ip_s</w:t>
-      </w:r>
-      <w:r>
-        <w:rPr>
-          <w:rStyle w:val="VerbatimChar"/>
-        </w:rPr>
-        <w:t>wi</w:t>
-      </w:r>
-      <w:r>
-        <w:rPr>
-          <w:rStyle w:val="VerbatimChar"/>
-        </w:rPr>
-        <w:t>tch&gt;/api/ins</w:t>
-      </w:r>
-      <w:r>
-        <w:rPr/>
-        <w:t>, en revanche, les JSON de retour peuvent être vu</w:t>
-      </w:r>
-      <w:r>
-        <w:rPr/>
-        <w:t>s</w:t>
-      </w:r>
-      <w:r>
-        <w:rPr/>
-        <w:t xml:space="preserve"> sur la page “Command Reference” en haut à droite.</w:t>
+        <w:t>https://&lt;ip_switch&gt;/api/ins</w:t>
+      </w:r>
+      <w:r>
+        <w:rPr/>
+        <w:t>, en revanche, les JSON de retour peuvent être vus sur la page “Command Reference” en haut à droite.</w:t>
       </w:r>
       <w:bookmarkEnd w:id="10"/>
     </w:p>
@@ -1531,7 +1511,7 @@
         <w:pStyle w:val="Normal"/>
         <w:numPr>
           <w:ilvl w:val="0"/>
-          <w:numId w:val="4"/>
+          <w:numId w:val="3"/>
         </w:numPr>
         <w:rPr/>
       </w:pPr>
@@ -1562,7 +1542,7 @@
         <w:pStyle w:val="Normal"/>
         <w:numPr>
           <w:ilvl w:val="0"/>
-          <w:numId w:val="4"/>
+          <w:numId w:val="3"/>
         </w:numPr>
         <w:rPr/>
       </w:pPr>
@@ -1575,7 +1555,7 @@
       </w:r>
       <w:r>
         <w:rPr/>
-        <w:t xml:space="preserve"> Le nom de DN est indiqué dans la section prévue à cette effet dans le tableau. Ainsi l’endpoint à adresser est </w:t>
+        <w:t xml:space="preserve"> Le nom de DN est indiqué dans la section prévue à cet effet dans le tableau. Ainsi l’endpoint à adresser est </w:t>
       </w:r>
       <w:r>
         <w:rPr>
@@ -1711,7 +1691,7 @@
         <w:pStyle w:val="Compact"/>
         <w:numPr>
           <w:ilvl w:val="0"/>
-          <w:numId w:val="22"/>
+          <w:numId w:val="18"/>
         </w:numPr>
         <w:rPr/>
       </w:pPr>
@@ -1832,7 +1812,7 @@
         <w:pStyle w:val="Compact"/>
         <w:numPr>
           <w:ilvl w:val="0"/>
-          <w:numId w:val="23"/>
+          <w:numId w:val="19"/>
         </w:numPr>
         <w:rPr/>
       </w:pPr>
@@ -2252,7 +2232,7 @@
         <w:pStyle w:val="Compact"/>
         <w:numPr>
           <w:ilvl w:val="0"/>
-          <w:numId w:val="4"/>
+          <w:numId w:val="3"/>
         </w:numPr>
         <w:rPr/>
       </w:pPr>
@@ -2272,7 +2252,7 @@
         <w:pStyle w:val="Compact"/>
         <w:numPr>
           <w:ilvl w:val="0"/>
-          <w:numId w:val="4"/>
+          <w:numId w:val="3"/>
         </w:numPr>
         <w:rPr/>
       </w:pPr>
@@ -2292,7 +2272,7 @@
         <w:pStyle w:val="Compact"/>
         <w:numPr>
           <w:ilvl w:val="0"/>
-          <w:numId w:val="4"/>
+          <w:numId w:val="3"/>
         </w:numPr>
         <w:rPr/>
       </w:pPr>
@@ -2324,7 +2304,7 @@
         <w:pStyle w:val="Compact"/>
         <w:numPr>
           <w:ilvl w:val="0"/>
-          <w:numId w:val="4"/>
+          <w:numId w:val="3"/>
         </w:numPr>
         <w:rPr/>
       </w:pPr>
@@ -2365,7 +2345,7 @@
         <w:pStyle w:val="Compact"/>
         <w:numPr>
           <w:ilvl w:val="0"/>
-          <w:numId w:val="4"/>
+          <w:numId w:val="3"/>
         </w:numPr>
         <w:rPr/>
       </w:pPr>
@@ -2396,7 +2376,7 @@
         <w:pStyle w:val="Compact"/>
         <w:numPr>
           <w:ilvl w:val="0"/>
-          <w:numId w:val="4"/>
+          <w:numId w:val="3"/>
         </w:numPr>
         <w:rPr/>
       </w:pPr>
@@ -2436,7 +2416,7 @@
         <w:pStyle w:val="Compact"/>
         <w:numPr>
           <w:ilvl w:val="0"/>
-          <w:numId w:val="4"/>
+          <w:numId w:val="3"/>
         </w:numPr>
         <w:rPr/>
       </w:pPr>
@@ -2487,7 +2467,7 @@
         <w:pStyle w:val="Compact"/>
         <w:numPr>
           <w:ilvl w:val="0"/>
-          <w:numId w:val="4"/>
+          <w:numId w:val="3"/>
         </w:numPr>
         <w:rPr/>
       </w:pPr>
@@ -3355,7 +3335,7 @@
         <w:pStyle w:val="Compact"/>
         <w:numPr>
           <w:ilvl w:val="0"/>
-          <w:numId w:val="24"/>
+          <w:numId w:val="20"/>
         </w:numPr>
         <w:rPr/>
       </w:pPr>
@@ -3379,7 +3359,7 @@
         <w:pStyle w:val="Compact"/>
         <w:numPr>
           <w:ilvl w:val="0"/>
-          <w:numId w:val="1"/>
+          <w:numId w:val="4"/>
         </w:numPr>
         <w:rPr/>
       </w:pPr>
@@ -3403,7 +3383,7 @@
         <w:pStyle w:val="Compact"/>
         <w:numPr>
           <w:ilvl w:val="0"/>
-          <w:numId w:val="1"/>
+          <w:numId w:val="4"/>
         </w:numPr>
         <w:rPr/>
       </w:pPr>
@@ -3467,7 +3447,7 @@
         <w:pStyle w:val="Compact"/>
         <w:numPr>
           <w:ilvl w:val="0"/>
-          <w:numId w:val="1"/>
+          <w:numId w:val="4"/>
         </w:numPr>
         <w:rPr/>
       </w:pPr>
@@ -3531,7 +3511,7 @@
         <w:pStyle w:val="Compact"/>
         <w:numPr>
           <w:ilvl w:val="0"/>
-          <w:numId w:val="1"/>
+          <w:numId w:val="4"/>
         </w:numPr>
         <w:rPr/>
       </w:pPr>
@@ -3660,7 +3640,7 @@
         <w:pStyle w:val="Compact"/>
         <w:numPr>
           <w:ilvl w:val="0"/>
-          <w:numId w:val="4"/>
+          <w:numId w:val="3"/>
         </w:numPr>
         <w:rPr/>
       </w:pPr>
@@ -3694,7 +3674,7 @@
         <w:pStyle w:val="Compact"/>
         <w:numPr>
           <w:ilvl w:val="0"/>
-          <w:numId w:val="4"/>
+          <w:numId w:val="3"/>
         </w:numPr>
         <w:rPr/>
       </w:pPr>
@@ -3806,7 +3786,7 @@
         <w:pStyle w:val="Compact"/>
         <w:numPr>
           <w:ilvl w:val="0"/>
-          <w:numId w:val="4"/>
+          <w:numId w:val="3"/>
         </w:numPr>
         <w:rPr/>
       </w:pPr>
@@ -3830,7 +3810,7 @@
         <w:pStyle w:val="Compact"/>
         <w:numPr>
           <w:ilvl w:val="0"/>
-          <w:numId w:val="4"/>
+          <w:numId w:val="3"/>
         </w:numPr>
         <w:rPr/>
       </w:pPr>
@@ -3904,7 +3884,7 @@
         <w:pStyle w:val="Compact"/>
         <w:numPr>
           <w:ilvl w:val="0"/>
-          <w:numId w:val="4"/>
+          <w:numId w:val="3"/>
         </w:numPr>
         <w:rPr/>
       </w:pPr>
@@ -3938,7 +3918,7 @@
         <w:pStyle w:val="Compact"/>
         <w:numPr>
           <w:ilvl w:val="1"/>
-          <w:numId w:val="4"/>
+          <w:numId w:val="3"/>
         </w:numPr>
         <w:rPr/>
       </w:pPr>
@@ -3962,7 +3942,7 @@
         <w:pStyle w:val="Compact"/>
         <w:numPr>
           <w:ilvl w:val="0"/>
-          <w:numId w:val="4"/>
+          <w:numId w:val="3"/>
         </w:numPr>
         <w:rPr/>
       </w:pPr>
@@ -4038,7 +4018,7 @@
         <w:pStyle w:val="Compact"/>
         <w:numPr>
           <w:ilvl w:val="0"/>
-          <w:numId w:val="25"/>
+          <w:numId w:val="21"/>
         </w:numPr>
         <w:rPr/>
       </w:pPr>
@@ -4511,7 +4491,7 @@
         <w:pStyle w:val="Compact"/>
         <w:numPr>
           <w:ilvl w:val="0"/>
-          <w:numId w:val="26"/>
+          <w:numId w:val="22"/>
         </w:numPr>
         <w:rPr/>
       </w:pPr>
@@ -4769,7 +4749,7 @@
         <w:pStyle w:val="Compact"/>
         <w:numPr>
           <w:ilvl w:val="0"/>
-          <w:numId w:val="27"/>
+          <w:numId w:val="23"/>
         </w:numPr>
         <w:rPr/>
       </w:pPr>
@@ -4911,7 +4891,7 @@
         <w:pStyle w:val="Compact"/>
         <w:numPr>
           <w:ilvl w:val="0"/>
-          <w:numId w:val="28"/>
+          <w:numId w:val="24"/>
         </w:numPr>
         <w:rPr/>
       </w:pPr>
@@ -5426,125 +5406,6 @@
   </w:abstractNum>
   <w:abstractNum w:abstractNumId="3">
     <w:lvl w:ilvl="0">
-      <w:start w:val="7"/>
-      <w:numFmt w:val="decimal"/>
-      <w:lvlText w:val="%1."/>
-      <w:lvlJc w:val="left"/>
-      <w:pPr>
-        <w:tabs>
-          <w:tab w:val="num" w:pos="0"/>
-        </w:tabs>
-        <w:ind w:left="720" w:hanging="480"/>
-      </w:pPr>
-      <w:rPr/>
-    </w:lvl>
-    <w:lvl w:ilvl="1">
-      <w:start w:val="7"/>
-      <w:numFmt w:val="decimal"/>
-      <w:lvlText w:val="%2."/>
-      <w:lvlJc w:val="left"/>
-      <w:pPr>
-        <w:tabs>
-          <w:tab w:val="num" w:pos="0"/>
-        </w:tabs>
-        <w:ind w:left="1440" w:hanging="480"/>
-      </w:pPr>
-      <w:rPr/>
-    </w:lvl>
-    <w:lvl w:ilvl="2">
-      <w:start w:val="7"/>
-      <w:numFmt w:val="decimal"/>
-      <w:lvlText w:val="%3."/>
-      <w:lvlJc w:val="left"/>
-      <w:pPr>
-        <w:tabs>
-          <w:tab w:val="num" w:pos="0"/>
-        </w:tabs>
-        <w:ind w:left="2160" w:hanging="480"/>
-      </w:pPr>
-      <w:rPr/>
-    </w:lvl>
-    <w:lvl w:ilvl="3">
-      <w:start w:val="7"/>
-      <w:numFmt w:val="decimal"/>
-      <w:lvlText w:val="%4."/>
-      <w:lvlJc w:val="left"/>
-      <w:pPr>
-        <w:tabs>
-          <w:tab w:val="num" w:pos="0"/>
-        </w:tabs>
-        <w:ind w:left="2880" w:hanging="480"/>
-      </w:pPr>
-      <w:rPr/>
-    </w:lvl>
-    <w:lvl w:ilvl="4">
-      <w:start w:val="7"/>
-      <w:numFmt w:val="decimal"/>
-      <w:lvlText w:val="%5."/>
-      <w:lvlJc w:val="left"/>
-      <w:pPr>
-        <w:tabs>
-          <w:tab w:val="num" w:pos="0"/>
-        </w:tabs>
-        <w:ind w:left="3600" w:hanging="480"/>
-      </w:pPr>
-      <w:rPr/>
-    </w:lvl>
-    <w:lvl w:ilvl="5">
-      <w:start w:val="7"/>
-      <w:numFmt w:val="decimal"/>
-      <w:lvlText w:val="%6."/>
-      <w:lvlJc w:val="left"/>
-      <w:pPr>
-        <w:tabs>
-          <w:tab w:val="num" w:pos="0"/>
-        </w:tabs>
-        <w:ind w:left="4320" w:hanging="480"/>
-      </w:pPr>
-      <w:rPr/>
-    </w:lvl>
-    <w:lvl w:ilvl="6">
-      <w:start w:val="7"/>
-      <w:numFmt w:val="decimal"/>
-      <w:lvlText w:val="%7."/>
-      <w:lvlJc w:val="left"/>
-      <w:pPr>
-        <w:tabs>
-          <w:tab w:val="num" w:pos="0"/>
-        </w:tabs>
-        <w:ind w:left="5040" w:hanging="480"/>
-      </w:pPr>
-      <w:rPr/>
-    </w:lvl>
-    <w:lvl w:ilvl="7">
-      <w:start w:val="7"/>
-      <w:numFmt w:val="decimal"/>
-      <w:lvlText w:val="%8."/>
-      <w:lvlJc w:val="left"/>
-      <w:pPr>
-        <w:tabs>
-          <w:tab w:val="num" w:pos="0"/>
-        </w:tabs>
-        <w:ind w:left="5760" w:hanging="480"/>
-      </w:pPr>
-      <w:rPr/>
-    </w:lvl>
-    <w:lvl w:ilvl="8">
-      <w:start w:val="7"/>
-      <w:numFmt w:val="decimal"/>
-      <w:lvlText w:val="%9."/>
-      <w:lvlJc w:val="left"/>
-      <w:pPr>
-        <w:tabs>
-          <w:tab w:val="num" w:pos="0"/>
-        </w:tabs>
-        <w:ind w:left="6480" w:hanging="480"/>
-      </w:pPr>
-      <w:rPr/>
-    </w:lvl>
-  </w:abstractNum>
-  <w:abstractNum w:abstractNumId="4">
-    <w:lvl w:ilvl="0">
       <w:numFmt w:val="bullet"/>
       <w:lvlText w:val=""/>
       <w:lvlJc w:val="left"/>
@@ -5679,9 +5540,128 @@
       </w:rPr>
     </w:lvl>
   </w:abstractNum>
+  <w:abstractNum w:abstractNumId="4">
+    <w:lvl w:ilvl="0">
+      <w:start w:val="1"/>
+      <w:numFmt w:val="decimal"/>
+      <w:lvlText w:val="%1."/>
+      <w:lvlJc w:val="left"/>
+      <w:pPr>
+        <w:tabs>
+          <w:tab w:val="num" w:pos="0"/>
+        </w:tabs>
+        <w:ind w:left="720" w:hanging="480"/>
+      </w:pPr>
+      <w:rPr/>
+    </w:lvl>
+    <w:lvl w:ilvl="1">
+      <w:start w:val="1"/>
+      <w:numFmt w:val="decimal"/>
+      <w:lvlText w:val="%2."/>
+      <w:lvlJc w:val="left"/>
+      <w:pPr>
+        <w:tabs>
+          <w:tab w:val="num" w:pos="0"/>
+        </w:tabs>
+        <w:ind w:left="1440" w:hanging="480"/>
+      </w:pPr>
+      <w:rPr/>
+    </w:lvl>
+    <w:lvl w:ilvl="2">
+      <w:start w:val="1"/>
+      <w:numFmt w:val="decimal"/>
+      <w:lvlText w:val="%3."/>
+      <w:lvlJc w:val="left"/>
+      <w:pPr>
+        <w:tabs>
+          <w:tab w:val="num" w:pos="0"/>
+        </w:tabs>
+        <w:ind w:left="2160" w:hanging="480"/>
+      </w:pPr>
+      <w:rPr/>
+    </w:lvl>
+    <w:lvl w:ilvl="3">
+      <w:start w:val="1"/>
+      <w:numFmt w:val="decimal"/>
+      <w:lvlText w:val="%4."/>
+      <w:lvlJc w:val="left"/>
+      <w:pPr>
+        <w:tabs>
+          <w:tab w:val="num" w:pos="0"/>
+        </w:tabs>
+        <w:ind w:left="2880" w:hanging="480"/>
+      </w:pPr>
+      <w:rPr/>
+    </w:lvl>
+    <w:lvl w:ilvl="4">
+      <w:start w:val="1"/>
+      <w:numFmt w:val="decimal"/>
+      <w:lvlText w:val="%5."/>
+      <w:lvlJc w:val="left"/>
+      <w:pPr>
+        <w:tabs>
+          <w:tab w:val="num" w:pos="0"/>
+        </w:tabs>
+        <w:ind w:left="3600" w:hanging="480"/>
+      </w:pPr>
+      <w:rPr/>
+    </w:lvl>
+    <w:lvl w:ilvl="5">
+      <w:start w:val="1"/>
+      <w:numFmt w:val="decimal"/>
+      <w:lvlText w:val="%6."/>
+      <w:lvlJc w:val="left"/>
+      <w:pPr>
+        <w:tabs>
+          <w:tab w:val="num" w:pos="0"/>
+        </w:tabs>
+        <w:ind w:left="4320" w:hanging="480"/>
+      </w:pPr>
+      <w:rPr/>
+    </w:lvl>
+    <w:lvl w:ilvl="6">
+      <w:start w:val="1"/>
+      <w:numFmt w:val="decimal"/>
+      <w:lvlText w:val="%7."/>
+      <w:lvlJc w:val="left"/>
+      <w:pPr>
+        <w:tabs>
+          <w:tab w:val="num" w:pos="0"/>
+        </w:tabs>
+        <w:ind w:left="5040" w:hanging="480"/>
+      </w:pPr>
+      <w:rPr/>
+    </w:lvl>
+    <w:lvl w:ilvl="7">
+      <w:start w:val="1"/>
+      <w:numFmt w:val="decimal"/>
+      <w:lvlText w:val="%8."/>
+      <w:lvlJc w:val="left"/>
+      <w:pPr>
+        <w:tabs>
+          <w:tab w:val="num" w:pos="0"/>
+        </w:tabs>
+        <w:ind w:left="5760" w:hanging="480"/>
+      </w:pPr>
+      <w:rPr/>
+    </w:lvl>
+    <w:lvl w:ilvl="8">
+      <w:start w:val="1"/>
+      <w:numFmt w:val="decimal"/>
+      <w:lvlText w:val="%9."/>
+      <w:lvlJc w:val="left"/>
+      <w:pPr>
+        <w:tabs>
+          <w:tab w:val="num" w:pos="0"/>
+        </w:tabs>
+        <w:ind w:left="6480" w:hanging="480"/>
+      </w:pPr>
+      <w:rPr/>
+    </w:lvl>
+  </w:abstractNum>
   <w:abstractNum w:abstractNumId="5">
     <w:lvl w:ilvl="0">
-      <w:start w:val="3"/>
+      <w:start w:val="4"/>
       <w:numFmt w:val="decimal"/>
       <w:lvlText w:val="%1."/>
       <w:lvlJc w:val="left"/>
@@ -5694,7 +5674,7 @@
       <w:rPr/>
     </w:lvl>
     <w:lvl w:ilvl="1">
-      <w:start w:val="3"/>
+      <w:start w:val="4"/>
       <w:numFmt w:val="decimal"/>
       <w:lvlText w:val="%2."/>
       <w:lvlJc w:val="left"/>
@@ -5707,7 +5687,7 @@
       <w:rPr/>
     </w:lvl>
     <w:lvl w:ilvl="2">
-      <w:start w:val="3"/>
+      <w:start w:val="4"/>
       <w:numFmt w:val="decimal"/>
       <w:lvlText w:val="%3."/>
       <w:lvlJc w:val="left"/>
@@ -5720,7 +5700,7 @@
       <w:rPr/>
     </w:lvl>
     <w:lvl w:ilvl="3">
-      <w:start w:val="3"/>
+      <w:start w:val="4"/>
       <w:numFmt w:val="decimal"/>
       <w:lvlText w:val="%4."/>
       <w:lvlJc w:val="left"/>
@@ -5733,7 +5713,7 @@
       <w:rPr/>
     </w:lvl>
     <w:lvl w:ilvl="4">
-      <w:start w:val="3"/>
+      <w:start w:val="4"/>
       <w:numFmt w:val="decimal"/>
       <w:lvlText w:val="%5."/>
       <w:lvlJc w:val="left"/>
@@ -5746,7 +5726,7 @@
       <w:rPr/>
     </w:lvl>
     <w:lvl w:ilvl="5">
-      <w:start w:val="3"/>
+      <w:start w:val="4"/>
       <w:numFmt w:val="decimal"/>
       <w:lvlText w:val="%6."/>
       <w:lvlJc w:val="left"/>
@@ -5759,7 +5739,7 @@
       <w:rPr/>
     </w:lvl>
     <w:lvl w:ilvl="6">
-      <w:start w:val="3"/>
+      <w:start w:val="4"/>
       <w:numFmt w:val="decimal"/>
       <w:lvlText w:val="%7."/>
       <w:lvlJc w:val="left"/>
@@ -5772,7 +5752,7 @@
       <w:rPr/>
     </w:lvl>
     <w:lvl w:ilvl="7">
-      <w:start w:val="3"/>
+      <w:start w:val="4"/>
       <w:numFmt w:val="decimal"/>
       <w:lvlText w:val="%8."/>
       <w:lvlJc w:val="left"/>
@@ -5785,7 +5765,7 @@
       <w:rPr/>
     </w:lvl>
     <w:lvl w:ilvl="8">
-      <w:start w:val="3"/>
+      <w:start w:val="4"/>
       <w:numFmt w:val="decimal"/>
       <w:lvlText w:val="%9."/>
       <w:lvlJc w:val="left"/>
@@ -5800,7 +5780,7 @@
   </w:abstractNum>
   <w:abstractNum w:abstractNumId="6">
     <w:lvl w:ilvl="0">
-      <w:start w:val="4"/>
+      <w:start w:val="7"/>
       <w:numFmt w:val="decimal"/>
       <w:lvlText w:val="%1."/>
       <w:lvlJc w:val="left"/>
@@ -5813,7 +5793,7 @@
       <w:rPr/>
     </w:lvl>
     <w:lvl w:ilvl="1">
-      <w:start w:val="4"/>
+      <w:start w:val="7"/>
       <w:numFmt w:val="decimal"/>
       <w:lvlText w:val="%2."/>
       <w:lvlJc w:val="left"/>
@@ -5826,7 +5806,7 @@
       <w:rPr/>
     </w:lvl>
     <w:lvl w:ilvl="2">
-      <w:start w:val="4"/>
+      <w:start w:val="7"/>
       <w:numFmt w:val="decimal"/>
       <w:lvlText w:val="%3."/>
       <w:lvlJc w:val="left"/>
@@ -5839,7 +5819,7 @@
       <w:rPr/>
     </w:lvl>
     <w:lvl w:ilvl="3">
-      <w:start w:val="4"/>
+      <w:start w:val="7"/>
       <w:numFmt w:val="decimal"/>
       <w:lvlText w:val="%4."/>
       <w:lvlJc w:val="left"/>
@@ -5852,7 +5832,7 @@
       <w:rPr/>
     </w:lvl>
     <w:lvl w:ilvl="4">
-      <w:start w:val="4"/>
+      <w:start w:val="7"/>
       <w:numFmt w:val="decimal"/>
       <w:lvlText w:val="%5."/>
       <w:lvlJc w:val="left"/>
@@ -5865,7 +5845,7 @@
       <w:rPr/>
     </w:lvl>
     <w:lvl w:ilvl="5">
-      <w:start w:val="4"/>
+      <w:start w:val="7"/>
       <w:numFmt w:val="decimal"/>
       <w:lvlText w:val="%6."/>
       <w:lvlJc w:val="left"/>
@@ -5878,7 +5858,7 @@
       <w:rPr/>
     </w:lvl>
     <w:lvl w:ilvl="6">
-      <w:start w:val="4"/>
+      <w:start w:val="7"/>
       <w:numFmt w:val="decimal"/>
       <w:lvlText w:val="%7."/>
       <w:lvlJc w:val="left"/>
@@ -5891,7 +5871,7 @@
       <w:rPr/>
     </w:lvl>
     <w:lvl w:ilvl="7">
-      <w:start w:val="4"/>
+      <w:start w:val="7"/>
       <w:numFmt w:val="decimal"/>
       <w:lvlText w:val="%8."/>
       <w:lvlJc w:val="left"/>
@@ -5904,7 +5884,7 @@
       <w:rPr/>
     </w:lvl>
     <w:lvl w:ilvl="8">
-      <w:start w:val="4"/>
+      <w:start w:val="7"/>
       <w:numFmt w:val="decimal"/>
       <w:lvlText w:val="%9."/>
       <w:lvlJc w:val="left"/>
@@ -5919,8 +5899,9 @@
   </w:abstractNum>
   <w:abstractNum w:abstractNumId="7">
     <w:lvl w:ilvl="0">
-      <w:numFmt w:val="bullet"/>
-      <w:lvlText w:val=""/>
+      <w:start w:val="3"/>
+      <w:numFmt w:val="decimal"/>
+      <w:lvlText w:val="%1."/>
       <w:lvlJc w:val="left"/>
       <w:pPr>
         <w:tabs>
@@ -5928,14 +5909,12 @@
         </w:tabs>
         <w:ind w:left="720" w:hanging="480"/>
       </w:pPr>
-      <w:rPr>
-        <w:rFonts w:ascii="Symbol" w:hAnsi="Symbol" w:cs="Symbol" w:hint="default"/>
-      </w:rPr>
+      <w:rPr/>
     </w:lvl>
     <w:lvl w:ilvl="1">
-      <w:start w:val="0"/>
-      <w:numFmt w:val="bullet"/>
-      <w:lvlText w:val=""/>
+      <w:start w:val="3"/>
+      <w:numFmt w:val="decimal"/>
+      <w:lvlText w:val="%2."/>
       <w:lvlJc w:val="left"/>
       <w:pPr>
         <w:tabs>
@@ -5943,14 +5922,12 @@
         </w:tabs>
         <w:ind w:left="1440" w:hanging="480"/>
       </w:pPr>
-      <w:rPr>
-        <w:rFonts w:ascii="Symbol" w:hAnsi="Symbol" w:cs="Symbol" w:hint="default"/>
-      </w:rPr>
+      <w:rPr/>
     </w:lvl>
     <w:lvl w:ilvl="2">
-      <w:start w:val="0"/>
-      <w:numFmt w:val="bullet"/>
-      <w:lvlText w:val=""/>
+      <w:start w:val="3"/>
+      <w:numFmt w:val="decimal"/>
+      <w:lvlText w:val="%3."/>
       <w:lvlJc w:val="left"/>
       <w:pPr>
         <w:tabs>
@@ -5958,14 +5935,12 @@
         </w:tabs>
         <w:ind w:left="2160" w:hanging="480"/>
       </w:pPr>
-      <w:rPr>
-        <w:rFonts w:ascii="Symbol" w:hAnsi="Symbol" w:cs="Symbol" w:hint="default"/>
-      </w:rPr>
+      <w:rPr/>
     </w:lvl>
     <w:lvl w:ilvl="3">
-      <w:start w:val="0"/>
-      <w:numFmt w:val="bullet"/>
-      <w:lvlText w:val=""/>
+      <w:start w:val="3"/>
+      <w:numFmt w:val="decimal"/>
+      <w:lvlText w:val="%4."/>
       <w:lvlJc w:val="left"/>
       <w:pPr>
         <w:tabs>
@@ -5973,14 +5948,12 @@
         </w:tabs>
         <w:ind w:left="2880" w:hanging="480"/>
       </w:pPr>
-      <w:rPr>
-        <w:rFonts w:ascii="Symbol" w:hAnsi="Symbol" w:cs="Symbol" w:hint="default"/>
-      </w:rPr>
+      <w:rPr/>
     </w:lvl>
     <w:lvl w:ilvl="4">
-      <w:start w:val="0"/>
-      <w:numFmt w:val="bullet"/>
-      <w:lvlText w:val=""/>
+      <w:start w:val="3"/>
+      <w:numFmt w:val="decimal"/>
+      <w:lvlText w:val="%5."/>
       <w:lvlJc w:val="left"/>
       <w:pPr>
         <w:tabs>
@@ -5988,14 +5961,12 @@
         </w:tabs>
         <w:ind w:left="3600" w:hanging="480"/>
       </w:pPr>
-      <w:rPr>
-        <w:rFonts w:ascii="Symbol" w:hAnsi="Symbol" w:cs="Symbol" w:hint="default"/>
-      </w:rPr>
+      <w:rPr/>
     </w:lvl>
     <w:lvl w:ilvl="5">
-      <w:start w:val="0"/>
-      <w:numFmt w:val="bullet"/>
-      <w:lvlText w:val=""/>
+      <w:start w:val="3"/>
+      <w:numFmt w:val="decimal"/>
+      <w:lvlText w:val="%6."/>
       <w:lvlJc w:val="left"/>
       <w:pPr>
         <w:tabs>
@@ -6003,14 +5974,12 @@
         </w:tabs>
         <w:ind w:left="4320" w:hanging="480"/>
       </w:pPr>
-      <w:rPr>
-        <w:rFonts w:ascii="Symbol" w:hAnsi="Symbol" w:cs="Symbol" w:hint="default"/>
-      </w:rPr>
+      <w:rPr/>
     </w:lvl>
     <w:lvl w:ilvl="6">
-      <w:start w:val="0"/>
-      <w:numFmt w:val="bullet"/>
-      <w:lvlText w:val=""/>
+      <w:start w:val="3"/>
+      <w:numFmt w:val="decimal"/>
+      <w:lvlText w:val="%7."/>
       <w:lvlJc w:val="left"/>
       <w:pPr>
         <w:tabs>
@@ -6018,14 +5987,12 @@
         </w:tabs>
         <w:ind w:left="5040" w:hanging="480"/>
       </w:pPr>
-      <w:rPr>
-        <w:rFonts w:ascii="Symbol" w:hAnsi="Symbol" w:cs="Symbol" w:hint="default"/>
-      </w:rPr>
+      <w:rPr/>
     </w:lvl>
     <w:lvl w:ilvl="7">
-      <w:start w:val="0"/>
-      <w:numFmt w:val="bullet"/>
-      <w:lvlText w:val=""/>
+      <w:start w:val="3"/>
+      <w:numFmt w:val="decimal"/>
+      <w:lvlText w:val="%8."/>
       <w:lvlJc w:val="left"/>
       <w:pPr>
         <w:tabs>
@@ -6033,14 +6000,12 @@
         </w:tabs>
         <w:ind w:left="5760" w:hanging="480"/>
       </w:pPr>
-      <w:rPr>
-        <w:rFonts w:ascii="Symbol" w:hAnsi="Symbol" w:cs="Symbol" w:hint="default"/>
-      </w:rPr>
+      <w:rPr/>
     </w:lvl>
     <w:lvl w:ilvl="8">
-      <w:start w:val="0"/>
-      <w:numFmt w:val="bullet"/>
-      <w:lvlText w:val=""/>
+      <w:start w:val="3"/>
+      <w:numFmt w:val="decimal"/>
+      <w:lvlText w:val="%9."/>
       <w:lvlJc w:val="left"/>
       <w:pPr>
         <w:tabs>
@@ -6048,15 +6013,14 @@
         </w:tabs>
         <w:ind w:left="6480" w:hanging="480"/>
       </w:pPr>
-      <w:rPr>
-        <w:rFonts w:ascii="Symbol" w:hAnsi="Symbol" w:cs="Symbol" w:hint="default"/>
-      </w:rPr>
+      <w:rPr/>
     </w:lvl>
   </w:abstractNum>
   <w:abstractNum w:abstractNumId="8">
     <w:lvl w:ilvl="0">
-      <w:numFmt w:val="bullet"/>
-      <w:lvlText w:val=""/>
+      <w:start w:val="4"/>
+      <w:numFmt w:val="decimal"/>
+      <w:lvlText w:val="%1."/>
       <w:lvlJc w:val="left"/>
       <w:pPr>
         <w:tabs>
@@ -6064,14 +6028,12 @@
         </w:tabs>
         <w:ind w:left="720" w:hanging="480"/>
       </w:pPr>
-      <w:rPr>
-        <w:rFonts w:ascii="Symbol" w:hAnsi="Symbol" w:cs="Symbol" w:hint="default"/>
-      </w:rPr>
+      <w:rPr/>
     </w:lvl>
     <w:lvl w:ilvl="1">
-      <w:start w:val="0"/>
-      <w:numFmt w:val="bullet"/>
-      <w:lvlText w:val=""/>
+      <w:start w:val="4"/>
+      <w:numFmt w:val="decimal"/>
+      <w:lvlText w:val="%2."/>
       <w:lvlJc w:val="left"/>
       <w:pPr>
         <w:tabs>
@@ -6079,14 +6041,12 @@
         </w:tabs>
         <w:ind w:left="1440" w:hanging="480"/>
       </w:pPr>
-      <w:rPr>
-        <w:rFonts w:ascii="Symbol" w:hAnsi="Symbol" w:cs="Symbol" w:hint="default"/>
-      </w:rPr>
+      <w:rPr/>
     </w:lvl>
     <w:lvl w:ilvl="2">
-      <w:start w:val="0"/>
-      <w:numFmt w:val="bullet"/>
-      <w:lvlText w:val=""/>
+      <w:start w:val="4"/>
+      <w:numFmt w:val="decimal"/>
+      <w:lvlText w:val="%3."/>
       <w:lvlJc w:val="left"/>
       <w:pPr>
         <w:tabs>
@@ -6094,14 +6054,12 @@
         </w:tabs>
         <w:ind w:left="2160" w:hanging="480"/>
       </w:pPr>
-      <w:rPr>
-        <w:rFonts w:ascii="Symbol" w:hAnsi="Symbol" w:cs="Symbol" w:hint="default"/>
-      </w:rPr>
+      <w:rPr/>
     </w:lvl>
     <w:lvl w:ilvl="3">
-      <w:start w:val="0"/>
-      <w:numFmt w:val="bullet"/>
-      <w:lvlText w:val=""/>
+      <w:start w:val="4"/>
+      <w:numFmt w:val="decimal"/>
+      <w:lvlText w:val="%4."/>
       <w:lvlJc w:val="left"/>
       <w:pPr>
         <w:tabs>
@@ -6109,14 +6067,12 @@
         </w:tabs>
         <w:ind w:left="2880" w:hanging="480"/>
       </w:pPr>
-      <w:rPr>
-        <w:rFonts w:ascii="Symbol" w:hAnsi="Symbol" w:cs="Symbol" w:hint="default"/>
-      </w:rPr>
+      <w:rPr/>
     </w:lvl>
     <w:lvl w:ilvl="4">
-      <w:start w:val="0"/>
-      <w:numFmt w:val="bullet"/>
-      <w:lvlText w:val=""/>
+      <w:start w:val="4"/>
+      <w:numFmt w:val="decimal"/>
+      <w:lvlText w:val="%5."/>
       <w:lvlJc w:val="left"/>
       <w:pPr>
         <w:tabs>
@@ -6124,14 +6080,12 @@
         </w:tabs>
         <w:ind w:left="3600" w:hanging="480"/>
       </w:pPr>
-      <w:rPr>
-        <w:rFonts w:ascii="Symbol" w:hAnsi="Symbol" w:cs="Symbol" w:hint="default"/>
-      </w:rPr>
+      <w:rPr/>
     </w:lvl>
     <w:lvl w:ilvl="5">
-      <w:start w:val="0"/>
-      <w:numFmt w:val="bullet"/>
-      <w:lvlText w:val=""/>
+      <w:start w:val="4"/>
+      <w:numFmt w:val="decimal"/>
+      <w:lvlText w:val="%6."/>
       <w:lvlJc w:val="left"/>
       <w:pPr>
         <w:tabs>
@@ -6139,14 +6093,12 @@
         </w:tabs>
         <w:ind w:left="4320" w:hanging="480"/>
       </w:pPr>
-      <w:rPr>
-        <w:rFonts w:ascii="Symbol" w:hAnsi="Symbol" w:cs="Symbol" w:hint="default"/>
-      </w:rPr>
+      <w:rPr/>
     </w:lvl>
     <w:lvl w:ilvl="6">
-      <w:start w:val="0"/>
-      <w:numFmt w:val="bullet"/>
-      <w:lvlText w:val=""/>
+      <w:start w:val="4"/>
+      <w:numFmt w:val="decimal"/>
+      <w:lvlText w:val="%7."/>
       <w:lvlJc w:val="left"/>
       <w:pPr>
         <w:tabs>
@@ -6154,14 +6106,12 @@
         </w:tabs>
         <w:ind w:left="5040" w:hanging="480"/>
       </w:pPr>
-      <w:rPr>
-        <w:rFonts w:ascii="Symbol" w:hAnsi="Symbol" w:cs="Symbol" w:hint="default"/>
-      </w:rPr>
+      <w:rPr/>
     </w:lvl>
     <w:lvl w:ilvl="7">
-      <w:start w:val="0"/>
-      <w:numFmt w:val="bullet"/>
-      <w:lvlText w:val=""/>
+      <w:start w:val="4"/>
+      <w:numFmt w:val="decimal"/>
+      <w:lvlText w:val="%8."/>
       <w:lvlJc w:val="left"/>
       <w:pPr>
         <w:tabs>
@@ -6169,14 +6119,12 @@
         </w:tabs>
         <w:ind w:left="5760" w:hanging="480"/>
       </w:pPr>
-      <w:rPr>
-        <w:rFonts w:ascii="Symbol" w:hAnsi="Symbol" w:cs="Symbol" w:hint="default"/>
-      </w:rPr>
+      <w:rPr/>
     </w:lvl>
     <w:lvl w:ilvl="8">
-      <w:start w:val="0"/>
-      <w:numFmt w:val="bullet"/>
-      <w:lvlText w:val=""/>
+      <w:start w:val="4"/>
+      <w:numFmt w:val="decimal"/>
+      <w:lvlText w:val="%9."/>
       <w:lvlJc w:val="left"/>
       <w:pPr>
         <w:tabs>
@@ -6184,9 +6132,7 @@
         </w:tabs>
         <w:ind w:left="6480" w:hanging="480"/>
       </w:pPr>
-      <w:rPr>
-        <w:rFonts w:ascii="Symbol" w:hAnsi="Symbol" w:cs="Symbol" w:hint="default"/>
-      </w:rPr>
+      <w:rPr/>
     </w:lvl>
   </w:abstractNum>
   <w:abstractNum w:abstractNumId="9">
@@ -6310,8 +6256,9 @@
   </w:abstractNum>
   <w:abstractNum w:abstractNumId="10">
     <w:lvl w:ilvl="0">
-      <w:numFmt w:val="bullet"/>
-      <w:lvlText w:val=""/>
+      <w:start w:val="1"/>
+      <w:numFmt w:val="decimal"/>
+      <w:lvlText w:val="%1."/>
       <w:lvlJc w:val="left"/>
       <w:pPr>
         <w:tabs>
@@ -6319,14 +6266,12 @@
         </w:tabs>
         <w:ind w:left="720" w:hanging="480"/>
       </w:pPr>
-      <w:rPr>
-        <w:rFonts w:ascii="Symbol" w:hAnsi="Symbol" w:cs="Symbol" w:hint="default"/>
-      </w:rPr>
+      <w:rPr/>
     </w:lvl>
     <w:lvl w:ilvl="1">
-      <w:start w:val="0"/>
-      <w:numFmt w:val="bullet"/>
-      <w:lvlText w:val=""/>
+      <w:start w:val="1"/>
+      <w:numFmt w:val="decimal"/>
+      <w:lvlText w:val="%2."/>
       <w:lvlJc w:val="left"/>
       <w:pPr>
         <w:tabs>
@@ -6334,14 +6279,12 @@
         </w:tabs>
         <w:ind w:left="1440" w:hanging="480"/>
       </w:pPr>
-      <w:rPr>
-        <w:rFonts w:ascii="Symbol" w:hAnsi="Symbol" w:cs="Symbol" w:hint="default"/>
-      </w:rPr>
+      <w:rPr/>
     </w:lvl>
     <w:lvl w:ilvl="2">
-      <w:start w:val="0"/>
-      <w:numFmt w:val="bullet"/>
-      <w:lvlText w:val=""/>
+      <w:start w:val="1"/>
+      <w:numFmt w:val="decimal"/>
+      <w:lvlText w:val="%3."/>
       <w:lvlJc w:val="left"/>
       <w:pPr>
         <w:tabs>
@@ -6349,14 +6292,12 @@
         </w:tabs>
         <w:ind w:left="2160" w:hanging="480"/>
       </w:pPr>
-      <w:rPr>
-        <w:rFonts w:ascii="Symbol" w:hAnsi="Symbol" w:cs="Symbol" w:hint="default"/>
-      </w:rPr>
+      <w:rPr/>
     </w:lvl>
     <w:lvl w:ilvl="3">
-      <w:start w:val="0"/>
-      <w:numFmt w:val="bullet"/>
-      <w:lvlText w:val=""/>
+      <w:start w:val="1"/>
+      <w:numFmt w:val="decimal"/>
+      <w:lvlText w:val="%4."/>
       <w:lvlJc w:val="left"/>
       <w:pPr>
         <w:tabs>
@@ -6364,14 +6305,12 @@
         </w:tabs>
         <w:ind w:left="2880" w:hanging="480"/>
       </w:pPr>
-      <w:rPr>
-        <w:rFonts w:ascii="Symbol" w:hAnsi="Symbol" w:cs="Symbol" w:hint="default"/>
-      </w:rPr>
+      <w:rPr/>
     </w:lvl>
     <w:lvl w:ilvl="4">
-      <w:start w:val="0"/>
-      <w:numFmt w:val="bullet"/>
-      <w:lvlText w:val=""/>
+      <w:start w:val="1"/>
+      <w:numFmt w:val="decimal"/>
+      <w:lvlText w:val="%5."/>
       <w:lvlJc w:val="left"/>
       <w:pPr>
         <w:tabs>
@@ -6379,14 +6318,12 @@
         </w:tabs>
         <w:ind w:left="3600" w:hanging="480"/>
       </w:pPr>
-      <w:rPr>
-        <w:rFonts w:ascii="Symbol" w:hAnsi="Symbol" w:cs="Symbol" w:hint="default"/>
-      </w:rPr>
+      <w:rPr/>
     </w:lvl>
     <w:lvl w:ilvl="5">
-      <w:start w:val="0"/>
-      <w:numFmt w:val="bullet"/>
-      <w:lvlText w:val=""/>
+      <w:start w:val="1"/>
+      <w:numFmt w:val="decimal"/>
+      <w:lvlText w:val="%6."/>
       <w:lvlJc w:val="left"/>
       <w:pPr>
         <w:tabs>
@@ -6394,14 +6331,12 @@
         </w:tabs>
         <w:ind w:left="4320" w:hanging="480"/>
       </w:pPr>
-      <w:rPr>
-        <w:rFonts w:ascii="Symbol" w:hAnsi="Symbol" w:cs="Symbol" w:hint="default"/>
-      </w:rPr>
+      <w:rPr/>
     </w:lvl>
     <w:lvl w:ilvl="6">
-      <w:start w:val="0"/>
-      <w:numFmt w:val="bullet"/>
-      <w:lvlText w:val=""/>
+      <w:start w:val="1"/>
+      <w:numFmt w:val="decimal"/>
+      <w:lvlText w:val="%7."/>
       <w:lvlJc w:val="left"/>
       <w:pPr>
         <w:tabs>
@@ -6409,14 +6344,12 @@
         </w:tabs>
         <w:ind w:left="5040" w:hanging="480"/>
       </w:pPr>
-      <w:rPr>
-        <w:rFonts w:ascii="Symbol" w:hAnsi="Symbol" w:cs="Symbol" w:hint="default"/>
-      </w:rPr>
+      <w:rPr/>
     </w:lvl>
     <w:lvl w:ilvl="7">
-      <w:start w:val="0"/>
-      <w:numFmt w:val="bullet"/>
-      <w:lvlText w:val=""/>
+      <w:start w:val="1"/>
+      <w:numFmt w:val="decimal"/>
+      <w:lvlText w:val="%8."/>
       <w:lvlJc w:val="left"/>
       <w:pPr>
         <w:tabs>
@@ -6424,14 +6357,12 @@
         </w:tabs>
         <w:ind w:left="5760" w:hanging="480"/>
       </w:pPr>
-      <w:rPr>
-        <w:rFonts w:ascii="Symbol" w:hAnsi="Symbol" w:cs="Symbol" w:hint="default"/>
-      </w:rPr>
+      <w:rPr/>
     </w:lvl>
     <w:lvl w:ilvl="8">
-      <w:start w:val="0"/>
-      <w:numFmt w:val="bullet"/>
-      <w:lvlText w:val=""/>
+      <w:start w:val="1"/>
+      <w:numFmt w:val="decimal"/>
+      <w:lvlText w:val="%9."/>
       <w:lvlJc w:val="left"/>
       <w:pPr>
         <w:tabs>
@@ -6439,15 +6370,14 @@
         </w:tabs>
         <w:ind w:left="6480" w:hanging="480"/>
       </w:pPr>
-      <w:rPr>
-        <w:rFonts w:ascii="Symbol" w:hAnsi="Symbol" w:cs="Symbol" w:hint="default"/>
-      </w:rPr>
+      <w:rPr/>
     </w:lvl>
   </w:abstractNum>
   <w:abstractNum w:abstractNumId="11">
     <w:lvl w:ilvl="0">
-      <w:numFmt w:val="bullet"/>
-      <w:lvlText w:val=""/>
+      <w:start w:val="2"/>
+      <w:numFmt w:val="decimal"/>
+      <w:lvlText w:val="%1."/>
       <w:lvlJc w:val="left"/>
       <w:pPr>
         <w:tabs>
@@ -6455,14 +6385,12 @@
         </w:tabs>
         <w:ind w:left="720" w:hanging="480"/>
       </w:pPr>
-      <w:rPr>
-        <w:rFonts w:ascii="Symbol" w:hAnsi="Symbol" w:cs="Symbol" w:hint="default"/>
-      </w:rPr>
+      <w:rPr/>
     </w:lvl>
     <w:lvl w:ilvl="1">
-      <w:start w:val="0"/>
-      <w:numFmt w:val="bullet"/>
-      <w:lvlText w:val=""/>
+      <w:start w:val="2"/>
+      <w:numFmt w:val="decimal"/>
+      <w:lvlText w:val="%2."/>
       <w:lvlJc w:val="left"/>
       <w:pPr>
         <w:tabs>
@@ -6470,14 +6398,12 @@
         </w:tabs>
         <w:ind w:left="1440" w:hanging="480"/>
       </w:pPr>
-      <w:rPr>
-        <w:rFonts w:ascii="Symbol" w:hAnsi="Symbol" w:cs="Symbol" w:hint="default"/>
-      </w:rPr>
+      <w:rPr/>
     </w:lvl>
     <w:lvl w:ilvl="2">
-      <w:start w:val="0"/>
-      <w:numFmt w:val="bullet"/>
-      <w:lvlText w:val=""/>
+      <w:start w:val="2"/>
+      <w:numFmt w:val="decimal"/>
+      <w:lvlText w:val="%3."/>
       <w:lvlJc w:val="left"/>
       <w:pPr>
         <w:tabs>
@@ -6485,14 +6411,12 @@
         </w:tabs>
         <w:ind w:left="2160" w:hanging="480"/>
       </w:pPr>
-      <w:rPr>
-        <w:rFonts w:ascii="Symbol" w:hAnsi="Symbol" w:cs="Symbol" w:hint="default"/>
-      </w:rPr>
+      <w:rPr/>
     </w:lvl>
     <w:lvl w:ilvl="3">
-      <w:start w:val="0"/>
-      <w:numFmt w:val="bullet"/>
-      <w:lvlText w:val=""/>
+      <w:start w:val="2"/>
+      <w:numFmt w:val="decimal"/>
+      <w:lvlText w:val="%4."/>
       <w:lvlJc w:val="left"/>
       <w:pPr>
         <w:tabs>
@@ -6500,14 +6424,12 @@
         </w:tabs>
         <w:ind w:left="2880" w:hanging="480"/>
       </w:pPr>
-      <w:rPr>
-        <w:rFonts w:ascii="Symbol" w:hAnsi="Symbol" w:cs="Symbol" w:hint="default"/>
-      </w:rPr>
+      <w:rPr/>
     </w:lvl>
     <w:lvl w:ilvl="4">
-      <w:start w:val="0"/>
-      <w:numFmt w:val="bullet"/>
-      <w:lvlText w:val=""/>
+      <w:start w:val="2"/>
+      <w:numFmt w:val="decimal"/>
+      <w:lvlText w:val="%5."/>
       <w:lvlJc w:val="left"/>
       <w:pPr>
         <w:tabs>
@@ -6515,14 +6437,12 @@
         </w:tabs>
         <w:ind w:left="3600" w:hanging="480"/>
       </w:pPr>
-      <w:rPr>
-        <w:rFonts w:ascii="Symbol" w:hAnsi="Symbol" w:cs="Symbol" w:hint="default"/>
-      </w:rPr>
+      <w:rPr/>
     </w:lvl>
     <w:lvl w:ilvl="5">
-      <w:start w:val="0"/>
-      <w:numFmt w:val="bullet"/>
-      <w:lvlText w:val=""/>
+      <w:start w:val="2"/>
+      <w:numFmt w:val="decimal"/>
+      <w:lvlText w:val="%6."/>
       <w:lvlJc w:val="left"/>
       <w:pPr>
         <w:tabs>
@@ -6530,14 +6450,12 @@
         </w:tabs>
         <w:ind w:left="4320" w:hanging="480"/>
       </w:pPr>
-      <w:rPr>
-        <w:rFonts w:ascii="Symbol" w:hAnsi="Symbol" w:cs="Symbol" w:hint="default"/>
-      </w:rPr>
+      <w:rPr/>
     </w:lvl>
     <w:lvl w:ilvl="6">
-      <w:start w:val="0"/>
-      <w:numFmt w:val="bullet"/>
-      <w:lvlText w:val=""/>
+      <w:start w:val="2"/>
+      <w:numFmt w:val="decimal"/>
+      <w:lvlText w:val="%7."/>
       <w:lvlJc w:val="left"/>
       <w:pPr>
         <w:tabs>
@@ -6545,14 +6463,12 @@
         </w:tabs>
         <w:ind w:left="5040" w:hanging="480"/>
       </w:pPr>
-      <w:rPr>
-        <w:rFonts w:ascii="Symbol" w:hAnsi="Symbol" w:cs="Symbol" w:hint="default"/>
-      </w:rPr>
+      <w:rPr/>
     </w:lvl>
     <w:lvl w:ilvl="7">
-      <w:start w:val="0"/>
-      <w:numFmt w:val="bullet"/>
-      <w:lvlText w:val=""/>
+      <w:start w:val="2"/>
+      <w:numFmt w:val="decimal"/>
+      <w:lvlText w:val="%8."/>
       <w:lvlJc w:val="left"/>
       <w:pPr>
         <w:tabs>
@@ -6560,14 +6476,12 @@
         </w:tabs>
         <w:ind w:left="5760" w:hanging="480"/>
       </w:pPr>
-      <w:rPr>
-        <w:rFonts w:ascii="Symbol" w:hAnsi="Symbol" w:cs="Symbol" w:hint="default"/>
-      </w:rPr>
+      <w:rPr/>
     </w:lvl>
     <w:lvl w:ilvl="8">
-      <w:start w:val="0"/>
-      <w:numFmt w:val="bullet"/>
-      <w:lvlText w:val=""/>
+      <w:start w:val="2"/>
+      <w:numFmt w:val="decimal"/>
+      <w:lvlText w:val="%9."/>
       <w:lvlJc w:val="left"/>
       <w:pPr>
         <w:tabs>
@@ -6575,15 +6489,14 @@
         </w:tabs>
         <w:ind w:left="6480" w:hanging="480"/>
       </w:pPr>
-      <w:rPr>
-        <w:rFonts w:ascii="Symbol" w:hAnsi="Symbol" w:cs="Symbol" w:hint="default"/>
-      </w:rPr>
+      <w:rPr/>
     </w:lvl>
   </w:abstractNum>
   <w:abstractNum w:abstractNumId="12">
     <w:lvl w:ilvl="0">
-      <w:numFmt w:val="bullet"/>
-      <w:lvlText w:val=""/>
+      <w:start w:val="3"/>
+      <w:numFmt w:val="decimal"/>
+      <w:lvlText w:val="%1."/>
       <w:lvlJc w:val="left"/>
       <w:pPr>
         <w:tabs>
@@ -6591,14 +6504,12 @@
         </w:tabs>
         <w:ind w:left="720" w:hanging="480"/>
       </w:pPr>
-      <w:rPr>
-        <w:rFonts w:ascii="Symbol" w:hAnsi="Symbol" w:cs="Symbol" w:hint="default"/>
-      </w:rPr>
+      <w:rPr/>
     </w:lvl>
     <w:lvl w:ilvl="1">
-      <w:start w:val="0"/>
-      <w:numFmt w:val="bullet"/>
-      <w:lvlText w:val=""/>
+      <w:start w:val="3"/>
+      <w:numFmt w:val="decimal"/>
+      <w:lvlText w:val="%2."/>
       <w:lvlJc w:val="left"/>
       <w:pPr>
         <w:tabs>
@@ -6606,14 +6517,12 @@
         </w:tabs>
         <w:ind w:left="1440" w:hanging="480"/>
       </w:pPr>
-      <w:rPr>
-        <w:rFonts w:ascii="Symbol" w:hAnsi="Symbol" w:cs="Symbol" w:hint="default"/>
-      </w:rPr>
+      <w:rPr/>
     </w:lvl>
     <w:lvl w:ilvl="2">
-      <w:start w:val="0"/>
-      <w:numFmt w:val="bullet"/>
-      <w:lvlText w:val=""/>
+      <w:start w:val="3"/>
+      <w:numFmt w:val="decimal"/>
+      <w:lvlText w:val="%3."/>
       <w:lvlJc w:val="left"/>
       <w:pPr>
         <w:tabs>
@@ -6621,14 +6530,12 @@
         </w:tabs>
         <w:ind w:left="2160" w:hanging="480"/>
       </w:pPr>
-      <w:rPr>
-        <w:rFonts w:ascii="Symbol" w:hAnsi="Symbol" w:cs="Symbol" w:hint="default"/>
-      </w:rPr>
+      <w:rPr/>
     </w:lvl>
     <w:lvl w:ilvl="3">
-      <w:start w:val="0"/>
-      <w:numFmt w:val="bullet"/>
-      <w:lvlText w:val=""/>
+      <w:start w:val="3"/>
+      <w:numFmt w:val="decimal"/>
+      <w:lvlText w:val="%4."/>
       <w:lvlJc w:val="left"/>
       <w:pPr>
         <w:tabs>
@@ -6636,14 +6543,12 @@
         </w:tabs>
         <w:ind w:left="2880" w:hanging="480"/>
       </w:pPr>
-      <w:rPr>
-        <w:rFonts w:ascii="Symbol" w:hAnsi="Symbol" w:cs="Symbol" w:hint="default"/>
-      </w:rPr>
+      <w:rPr/>
     </w:lvl>
     <w:lvl w:ilvl="4">
-      <w:start w:val="0"/>
-      <w:numFmt w:val="bullet"/>
-      <w:lvlText w:val=""/>
+      <w:start w:val="3"/>
+      <w:numFmt w:val="decimal"/>
+      <w:lvlText w:val="%5."/>
       <w:lvlJc w:val="left"/>
       <w:pPr>
         <w:tabs>
@@ -6651,14 +6556,12 @@
         </w:tabs>
         <w:ind w:left="3600" w:hanging="480"/>
       </w:pPr>
-      <w:rPr>
-        <w:rFonts w:ascii="Symbol" w:hAnsi="Symbol" w:cs="Symbol" w:hint="default"/>
-      </w:rPr>
+      <w:rPr/>
     </w:lvl>
     <w:lvl w:ilvl="5">
-      <w:start w:val="0"/>
-      <w:numFmt w:val="bullet"/>
-      <w:lvlText w:val=""/>
+      <w:start w:val="3"/>
+      <w:numFmt w:val="decimal"/>
+      <w:lvlText w:val="%6."/>
       <w:lvlJc w:val="left"/>
       <w:pPr>
         <w:tabs>
@@ -6666,14 +6569,12 @@
         </w:tabs>
         <w:ind w:left="4320" w:hanging="480"/>
       </w:pPr>
-      <w:rPr>
-        <w:rFonts w:ascii="Symbol" w:hAnsi="Symbol" w:cs="Symbol" w:hint="default"/>
-      </w:rPr>
+      <w:rPr/>
     </w:lvl>
     <w:lvl w:ilvl="6">
-      <w:start w:val="0"/>
-      <w:numFmt w:val="bullet"/>
-      <w:lvlText w:val=""/>
+      <w:start w:val="3"/>
+      <w:numFmt w:val="decimal"/>
+      <w:lvlText w:val="%7."/>
       <w:lvlJc w:val="left"/>
       <w:pPr>
         <w:tabs>
@@ -6681,14 +6582,12 @@
         </w:tabs>
         <w:ind w:left="5040" w:hanging="480"/>
       </w:pPr>
-      <w:rPr>
-        <w:rFonts w:ascii="Symbol" w:hAnsi="Symbol" w:cs="Symbol" w:hint="default"/>
-      </w:rPr>
+      <w:rPr/>
     </w:lvl>
     <w:lvl w:ilvl="7">
-      <w:start w:val="0"/>
-      <w:numFmt w:val="bullet"/>
-      <w:lvlText w:val=""/>
+      <w:start w:val="3"/>
+      <w:numFmt w:val="decimal"/>
+      <w:lvlText w:val="%8."/>
       <w:lvlJc w:val="left"/>
       <w:pPr>
         <w:tabs>
@@ -6696,14 +6595,12 @@
         </w:tabs>
         <w:ind w:left="5760" w:hanging="480"/>
       </w:pPr>
-      <w:rPr>
-        <w:rFonts w:ascii="Symbol" w:hAnsi="Symbol" w:cs="Symbol" w:hint="default"/>
-      </w:rPr>
+      <w:rPr/>
     </w:lvl>
     <w:lvl w:ilvl="8">
-      <w:start w:val="0"/>
-      <w:numFmt w:val="bullet"/>
-      <w:lvlText w:val=""/>
+      <w:start w:val="3"/>
+      <w:numFmt w:val="decimal"/>
+      <w:lvlText w:val="%9."/>
       <w:lvlJc w:val="left"/>
       <w:pPr>
         <w:tabs>
@@ -6711,15 +6608,14 @@
         </w:tabs>
         <w:ind w:left="6480" w:hanging="480"/>
       </w:pPr>
-      <w:rPr>
-        <w:rFonts w:ascii="Symbol" w:hAnsi="Symbol" w:cs="Symbol" w:hint="default"/>
-      </w:rPr>
+      <w:rPr/>
     </w:lvl>
   </w:abstractNum>
   <w:abstractNum w:abstractNumId="13">
     <w:lvl w:ilvl="0">
-      <w:numFmt w:val="bullet"/>
-      <w:lvlText w:val=""/>
+      <w:start w:val="4"/>
+      <w:numFmt w:val="decimal"/>
+      <w:lvlText w:val="%1."/>
       <w:lvlJc w:val="left"/>
       <w:pPr>
         <w:tabs>
@@ -6727,14 +6623,12 @@
         </w:tabs>
         <w:ind w:left="720" w:hanging="480"/>
       </w:pPr>
-      <w:rPr>
-        <w:rFonts w:ascii="Symbol" w:hAnsi="Symbol" w:cs="Symbol" w:hint="default"/>
-      </w:rPr>
+      <w:rPr/>
     </w:lvl>
     <w:lvl w:ilvl="1">
-      <w:start w:val="0"/>
-      <w:numFmt w:val="bullet"/>
-      <w:lvlText w:val=""/>
+      <w:start w:val="4"/>
+      <w:numFmt w:val="decimal"/>
+      <w:lvlText w:val="%2."/>
       <w:lvlJc w:val="left"/>
       <w:pPr>
         <w:tabs>
@@ -6742,14 +6636,12 @@
         </w:tabs>
         <w:ind w:left="1440" w:hanging="480"/>
       </w:pPr>
-      <w:rPr>
-        <w:rFonts w:ascii="Symbol" w:hAnsi="Symbol" w:cs="Symbol" w:hint="default"/>
-      </w:rPr>
+      <w:rPr/>
     </w:lvl>
     <w:lvl w:ilvl="2">
-      <w:start w:val="0"/>
-      <w:numFmt w:val="bullet"/>
-      <w:lvlText w:val=""/>
+      <w:start w:val="4"/>
+      <w:numFmt w:val="decimal"/>
+      <w:lvlText w:val="%3."/>
       <w:lvlJc w:val="left"/>
       <w:pPr>
         <w:tabs>
@@ -6757,14 +6649,12 @@
         </w:tabs>
         <w:ind w:left="2160" w:hanging="480"/>
       </w:pPr>
-      <w:rPr>
-        <w:rFonts w:ascii="Symbol" w:hAnsi="Symbol" w:cs="Symbol" w:hint="default"/>
-      </w:rPr>
+      <w:rPr/>
     </w:lvl>
     <w:lvl w:ilvl="3">
-      <w:start w:val="0"/>
-      <w:numFmt w:val="bullet"/>
-      <w:lvlText w:val=""/>
+      <w:start w:val="4"/>
+      <w:numFmt w:val="decimal"/>
+      <w:lvlText w:val="%4."/>
       <w:lvlJc w:val="left"/>
       <w:pPr>
         <w:tabs>
@@ -6772,14 +6662,12 @@
         </w:tabs>
         <w:ind w:left="2880" w:hanging="480"/>
       </w:pPr>
-      <w:rPr>
-        <w:rFonts w:ascii="Symbol" w:hAnsi="Symbol" w:cs="Symbol" w:hint="default"/>
-      </w:rPr>
+      <w:rPr/>
     </w:lvl>
     <w:lvl w:ilvl="4">
-      <w:start w:val="0"/>
-      <w:numFmt w:val="bullet"/>
-      <w:lvlText w:val=""/>
+      <w:start w:val="4"/>
+      <w:numFmt w:val="decimal"/>
+      <w:lvlText w:val="%5."/>
       <w:lvlJc w:val="left"/>
       <w:pPr>
         <w:tabs>
@@ -6787,14 +6675,12 @@
         </w:tabs>
         <w:ind w:left="3600" w:hanging="480"/>
       </w:pPr>
-      <w:rPr>
-        <w:rFonts w:ascii="Symbol" w:hAnsi="Symbol" w:cs="Symbol" w:hint="default"/>
-      </w:rPr>
+      <w:rPr/>
     </w:lvl>
     <w:lvl w:ilvl="5">
-      <w:start w:val="0"/>
-      <w:numFmt w:val="bullet"/>
-      <w:lvlText w:val=""/>
+      <w:start w:val="4"/>
+      <w:numFmt w:val="decimal"/>
+      <w:lvlText w:val="%6."/>
       <w:lvlJc w:val="left"/>
       <w:pPr>
         <w:tabs>
@@ -6802,14 +6688,12 @@
         </w:tabs>
         <w:ind w:left="4320" w:hanging="480"/>
       </w:pPr>
-      <w:rPr>
-        <w:rFonts w:ascii="Symbol" w:hAnsi="Symbol" w:cs="Symbol" w:hint="default"/>
-      </w:rPr>
+      <w:rPr/>
     </w:lvl>
     <w:lvl w:ilvl="6">
-      <w:start w:val="0"/>
-      <w:numFmt w:val="bullet"/>
-      <w:lvlText w:val=""/>
+      <w:start w:val="4"/>
+      <w:numFmt w:val="decimal"/>
+      <w:lvlText w:val="%7."/>
       <w:lvlJc w:val="left"/>
       <w:pPr>
         <w:tabs>
@@ -6817,14 +6701,12 @@
         </w:tabs>
         <w:ind w:left="5040" w:hanging="480"/>
       </w:pPr>
-      <w:rPr>
-        <w:rFonts w:ascii="Symbol" w:hAnsi="Symbol" w:cs="Symbol" w:hint="default"/>
-      </w:rPr>
+      <w:rPr/>
     </w:lvl>
     <w:lvl w:ilvl="7">
-      <w:start w:val="0"/>
-      <w:numFmt w:val="bullet"/>
-      <w:lvlText w:val=""/>
+      <w:start w:val="4"/>
+      <w:numFmt w:val="decimal"/>
+      <w:lvlText w:val="%8."/>
       <w:lvlJc w:val="left"/>
       <w:pPr>
         <w:tabs>
@@ -6832,14 +6714,12 @@
         </w:tabs>
         <w:ind w:left="5760" w:hanging="480"/>
       </w:pPr>
-      <w:rPr>
-        <w:rFonts w:ascii="Symbol" w:hAnsi="Symbol" w:cs="Symbol" w:hint="default"/>
-      </w:rPr>
+      <w:rPr/>
     </w:lvl>
     <w:lvl w:ilvl="8">
-      <w:start w:val="0"/>
-      <w:numFmt w:val="bullet"/>
-      <w:lvlText w:val=""/>
+      <w:start w:val="4"/>
+      <w:numFmt w:val="decimal"/>
+      <w:lvlText w:val="%9."/>
       <w:lvlJc w:val="left"/>
       <w:pPr>
         <w:tabs>
@@ -6847,488 +6727,10 @@
         </w:tabs>
         <w:ind w:left="6480" w:hanging="480"/>
       </w:pPr>
-      <w:rPr>
-        <w:rFonts w:ascii="Symbol" w:hAnsi="Symbol" w:cs="Symbol" w:hint="default"/>
-      </w:rPr>
+      <w:rPr/>
     </w:lvl>
   </w:abstractNum>
   <w:abstractNum w:abstractNumId="14">
-    <w:lvl w:ilvl="0">
-      <w:start w:val="1"/>
-      <w:numFmt w:val="decimal"/>
-      <w:lvlText w:val="%1."/>
-      <w:lvlJc w:val="left"/>
-      <w:pPr>
-        <w:tabs>
-          <w:tab w:val="num" w:pos="0"/>
-        </w:tabs>
-        <w:ind w:left="720" w:hanging="480"/>
-      </w:pPr>
-      <w:rPr/>
-    </w:lvl>
-    <w:lvl w:ilvl="1">
-      <w:start w:val="1"/>
-      <w:numFmt w:val="decimal"/>
-      <w:lvlText w:val="%2."/>
-      <w:lvlJc w:val="left"/>
-      <w:pPr>
-        <w:tabs>
-          <w:tab w:val="num" w:pos="0"/>
-        </w:tabs>
-        <w:ind w:left="1440" w:hanging="480"/>
-      </w:pPr>
-      <w:rPr/>
-    </w:lvl>
-    <w:lvl w:ilvl="2">
-      <w:start w:val="1"/>
-      <w:numFmt w:val="decimal"/>
-      <w:lvlText w:val="%3."/>
-      <w:lvlJc w:val="left"/>
-      <w:pPr>
-        <w:tabs>
-          <w:tab w:val="num" w:pos="0"/>
-        </w:tabs>
-        <w:ind w:left="2160" w:hanging="480"/>
-      </w:pPr>
-      <w:rPr/>
-    </w:lvl>
-    <w:lvl w:ilvl="3">
-      <w:start w:val="1"/>
-      <w:numFmt w:val="decimal"/>
-      <w:lvlText w:val="%4."/>
-      <w:lvlJc w:val="left"/>
-      <w:pPr>
-        <w:tabs>
-          <w:tab w:val="num" w:pos="0"/>
-        </w:tabs>
-        <w:ind w:left="2880" w:hanging="480"/>
-      </w:pPr>
-      <w:rPr/>
-    </w:lvl>
-    <w:lvl w:ilvl="4">
-      <w:start w:val="1"/>
-      <w:numFmt w:val="decimal"/>
-      <w:lvlText w:val="%5."/>
-      <w:lvlJc w:val="left"/>
-      <w:pPr>
-        <w:tabs>
-          <w:tab w:val="num" w:pos="0"/>
-        </w:tabs>
-        <w:ind w:left="3600" w:hanging="480"/>
-      </w:pPr>
-      <w:rPr/>
-    </w:lvl>
-    <w:lvl w:ilvl="5">
-      <w:start w:val="1"/>
-      <w:numFmt w:val="decimal"/>
-      <w:lvlText w:val="%6."/>
-      <w:lvlJc w:val="left"/>
-      <w:pPr>
-        <w:tabs>
-          <w:tab w:val="num" w:pos="0"/>
-        </w:tabs>
-        <w:ind w:left="4320" w:hanging="480"/>
-      </w:pPr>
-      <w:rPr/>
-    </w:lvl>
-    <w:lvl w:ilvl="6">
-      <w:start w:val="1"/>
-      <w:numFmt w:val="decimal"/>
-      <w:lvlText w:val="%7."/>
-      <w:lvlJc w:val="left"/>
-      <w:pPr>
-        <w:tabs>
-          <w:tab w:val="num" w:pos="0"/>
-        </w:tabs>
-        <w:ind w:left="5040" w:hanging="480"/>
-      </w:pPr>
-      <w:rPr/>
-    </w:lvl>
-    <w:lvl w:ilvl="7">
-      <w:start w:val="1"/>
-      <w:numFmt w:val="decimal"/>
-      <w:lvlText w:val="%8."/>
-      <w:lvlJc w:val="left"/>
-      <w:pPr>
-        <w:tabs>
-          <w:tab w:val="num" w:pos="0"/>
-        </w:tabs>
-        <w:ind w:left="5760" w:hanging="480"/>
-      </w:pPr>
-      <w:rPr/>
-    </w:lvl>
-    <w:lvl w:ilvl="8">
-      <w:start w:val="1"/>
-      <w:numFmt w:val="decimal"/>
-      <w:lvlText w:val="%9."/>
-      <w:lvlJc w:val="left"/>
-      <w:pPr>
-        <w:tabs>
-          <w:tab w:val="num" w:pos="0"/>
-        </w:tabs>
-        <w:ind w:left="6480" w:hanging="480"/>
-      </w:pPr>
-      <w:rPr/>
-    </w:lvl>
-  </w:abstractNum>
-  <w:abstractNum w:abstractNumId="15">
-    <w:lvl w:ilvl="0">
-      <w:start w:val="2"/>
-      <w:numFmt w:val="decimal"/>
-      <w:lvlText w:val="%1."/>
-      <w:lvlJc w:val="left"/>
-      <w:pPr>
-        <w:tabs>
-          <w:tab w:val="num" w:pos="0"/>
-        </w:tabs>
-        <w:ind w:left="720" w:hanging="480"/>
-      </w:pPr>
-      <w:rPr/>
-    </w:lvl>
-    <w:lvl w:ilvl="1">
-      <w:start w:val="2"/>
-      <w:numFmt w:val="decimal"/>
-      <w:lvlText w:val="%2."/>
-      <w:lvlJc w:val="left"/>
-      <w:pPr>
-        <w:tabs>
-          <w:tab w:val="num" w:pos="0"/>
-        </w:tabs>
-        <w:ind w:left="1440" w:hanging="480"/>
-      </w:pPr>
-      <w:rPr/>
-    </w:lvl>
-    <w:lvl w:ilvl="2">
-      <w:start w:val="2"/>
-      <w:numFmt w:val="decimal"/>
-      <w:lvlText w:val="%3."/>
-      <w:lvlJc w:val="left"/>
-      <w:pPr>
-        <w:tabs>
-          <w:tab w:val="num" w:pos="0"/>
-        </w:tabs>
-        <w:ind w:left="2160" w:hanging="480"/>
-      </w:pPr>
-      <w:rPr/>
-    </w:lvl>
-    <w:lvl w:ilvl="3">
-      <w:start w:val="2"/>
-      <w:numFmt w:val="decimal"/>
-      <w:lvlText w:val="%4."/>
-      <w:lvlJc w:val="left"/>
-      <w:pPr>
-        <w:tabs>
-          <w:tab w:val="num" w:pos="0"/>
-        </w:tabs>
-        <w:ind w:left="2880" w:hanging="480"/>
-      </w:pPr>
-      <w:rPr/>
-    </w:lvl>
-    <w:lvl w:ilvl="4">
-      <w:start w:val="2"/>
-      <w:numFmt w:val="decimal"/>
-      <w:lvlText w:val="%5."/>
-      <w:lvlJc w:val="left"/>
-      <w:pPr>
-        <w:tabs>
-          <w:tab w:val="num" w:pos="0"/>
-        </w:tabs>
-        <w:ind w:left="3600" w:hanging="480"/>
-      </w:pPr>
-      <w:rPr/>
-    </w:lvl>
-    <w:lvl w:ilvl="5">
-      <w:start w:val="2"/>
-      <w:numFmt w:val="decimal"/>
-      <w:lvlText w:val="%6."/>
-      <w:lvlJc w:val="left"/>
-      <w:pPr>
-        <w:tabs>
-          <w:tab w:val="num" w:pos="0"/>
-        </w:tabs>
-        <w:ind w:left="4320" w:hanging="480"/>
-      </w:pPr>
-      <w:rPr/>
-    </w:lvl>
-    <w:lvl w:ilvl="6">
-      <w:start w:val="2"/>
-      <w:numFmt w:val="decimal"/>
-      <w:lvlText w:val="%7."/>
-      <w:lvlJc w:val="left"/>
-      <w:pPr>
-        <w:tabs>
-          <w:tab w:val="num" w:pos="0"/>
-        </w:tabs>
-        <w:ind w:left="5040" w:hanging="480"/>
-      </w:pPr>
-      <w:rPr/>
-    </w:lvl>
-    <w:lvl w:ilvl="7">
-      <w:start w:val="2"/>
-      <w:numFmt w:val="decimal"/>
-      <w:lvlText w:val="%8."/>
-      <w:lvlJc w:val="left"/>
-      <w:pPr>
-        <w:tabs>
-          <w:tab w:val="num" w:pos="0"/>
-        </w:tabs>
-        <w:ind w:left="5760" w:hanging="480"/>
-      </w:pPr>
-      <w:rPr/>
-    </w:lvl>
-    <w:lvl w:ilvl="8">
-      <w:start w:val="2"/>
-      <w:numFmt w:val="decimal"/>
-      <w:lvlText w:val="%9."/>
-      <w:lvlJc w:val="left"/>
-      <w:pPr>
-        <w:tabs>
-          <w:tab w:val="num" w:pos="0"/>
-        </w:tabs>
-        <w:ind w:left="6480" w:hanging="480"/>
-      </w:pPr>
-      <w:rPr/>
-    </w:lvl>
-  </w:abstractNum>
-  <w:abstractNum w:abstractNumId="16">
-    <w:lvl w:ilvl="0">
-      <w:start w:val="3"/>
-      <w:numFmt w:val="decimal"/>
-      <w:lvlText w:val="%1."/>
-      <w:lvlJc w:val="left"/>
-      <w:pPr>
-        <w:tabs>
-          <w:tab w:val="num" w:pos="0"/>
-        </w:tabs>
-        <w:ind w:left="720" w:hanging="480"/>
-      </w:pPr>
-      <w:rPr/>
-    </w:lvl>
-    <w:lvl w:ilvl="1">
-      <w:start w:val="3"/>
-      <w:numFmt w:val="decimal"/>
-      <w:lvlText w:val="%2."/>
-      <w:lvlJc w:val="left"/>
-      <w:pPr>
-        <w:tabs>
-          <w:tab w:val="num" w:pos="0"/>
-        </w:tabs>
-        <w:ind w:left="1440" w:hanging="480"/>
-      </w:pPr>
-      <w:rPr/>
-    </w:lvl>
-    <w:lvl w:ilvl="2">
-      <w:start w:val="3"/>
-      <w:numFmt w:val="decimal"/>
-      <w:lvlText w:val="%3."/>
-      <w:lvlJc w:val="left"/>
-      <w:pPr>
-        <w:tabs>
-          <w:tab w:val="num" w:pos="0"/>
-        </w:tabs>
-        <w:ind w:left="2160" w:hanging="480"/>
-      </w:pPr>
-      <w:rPr/>
-    </w:lvl>
-    <w:lvl w:ilvl="3">
-      <w:start w:val="3"/>
-      <w:numFmt w:val="decimal"/>
-      <w:lvlText w:val="%4."/>
-      <w:lvlJc w:val="left"/>
-      <w:pPr>
-        <w:tabs>
-          <w:tab w:val="num" w:pos="0"/>
-        </w:tabs>
-        <w:ind w:left="2880" w:hanging="480"/>
-      </w:pPr>
-      <w:rPr/>
-    </w:lvl>
-    <w:lvl w:ilvl="4">
-      <w:start w:val="3"/>
-      <w:numFmt w:val="decimal"/>
-      <w:lvlText w:val="%5."/>
-      <w:lvlJc w:val="left"/>
-      <w:pPr>
-        <w:tabs>
-          <w:tab w:val="num" w:pos="0"/>
-        </w:tabs>
-        <w:ind w:left="3600" w:hanging="480"/>
-      </w:pPr>
-      <w:rPr/>
-    </w:lvl>
-    <w:lvl w:ilvl="5">
-      <w:start w:val="3"/>
-      <w:numFmt w:val="decimal"/>
-      <w:lvlText w:val="%6."/>
-      <w:lvlJc w:val="left"/>
-      <w:pPr>
-        <w:tabs>
-          <w:tab w:val="num" w:pos="0"/>
-        </w:tabs>
-        <w:ind w:left="4320" w:hanging="480"/>
-      </w:pPr>
-      <w:rPr/>
-    </w:lvl>
-    <w:lvl w:ilvl="6">
-      <w:start w:val="3"/>
-      <w:numFmt w:val="decimal"/>
-      <w:lvlText w:val="%7."/>
-      <w:lvlJc w:val="left"/>
-      <w:pPr>
-        <w:tabs>
-          <w:tab w:val="num" w:pos="0"/>
-        </w:tabs>
-        <w:ind w:left="5040" w:hanging="480"/>
-      </w:pPr>
-      <w:rPr/>
-    </w:lvl>
-    <w:lvl w:ilvl="7">
-      <w:start w:val="3"/>
-      <w:numFmt w:val="decimal"/>
-      <w:lvlText w:val="%8."/>
-      <w:lvlJc w:val="left"/>
-      <w:pPr>
-        <w:tabs>
-          <w:tab w:val="num" w:pos="0"/>
-        </w:tabs>
-        <w:ind w:left="5760" w:hanging="480"/>
-      </w:pPr>
-      <w:rPr/>
-    </w:lvl>
-    <w:lvl w:ilvl="8">
-      <w:start w:val="3"/>
-      <w:numFmt w:val="decimal"/>
-      <w:lvlText w:val="%9."/>
-      <w:lvlJc w:val="left"/>
-      <w:pPr>
-        <w:tabs>
-          <w:tab w:val="num" w:pos="0"/>
-        </w:tabs>
-        <w:ind w:left="6480" w:hanging="480"/>
-      </w:pPr>
-      <w:rPr/>
-    </w:lvl>
-  </w:abstractNum>
-  <w:abstractNum w:abstractNumId="17">
-    <w:lvl w:ilvl="0">
-      <w:start w:val="4"/>
-      <w:numFmt w:val="decimal"/>
-      <w:lvlText w:val="%1."/>
-      <w:lvlJc w:val="left"/>
-      <w:pPr>
-        <w:tabs>
-          <w:tab w:val="num" w:pos="0"/>
-        </w:tabs>
-        <w:ind w:left="720" w:hanging="480"/>
-      </w:pPr>
-      <w:rPr/>
-    </w:lvl>
-    <w:lvl w:ilvl="1">
-      <w:start w:val="4"/>
-      <w:numFmt w:val="decimal"/>
-      <w:lvlText w:val="%2."/>
-      <w:lvlJc w:val="left"/>
-      <w:pPr>
-        <w:tabs>
-          <w:tab w:val="num" w:pos="0"/>
-        </w:tabs>
-        <w:ind w:left="1440" w:hanging="480"/>
-      </w:pPr>
-      <w:rPr/>
-    </w:lvl>
-    <w:lvl w:ilvl="2">
-      <w:start w:val="4"/>
-      <w:numFmt w:val="decimal"/>
-      <w:lvlText w:val="%3."/>
-      <w:lvlJc w:val="left"/>
-      <w:pPr>
-        <w:tabs>
-          <w:tab w:val="num" w:pos="0"/>
-        </w:tabs>
-        <w:ind w:left="2160" w:hanging="480"/>
-      </w:pPr>
-      <w:rPr/>
-    </w:lvl>
-    <w:lvl w:ilvl="3">
-      <w:start w:val="4"/>
-      <w:numFmt w:val="decimal"/>
-      <w:lvlText w:val="%4."/>
-      <w:lvlJc w:val="left"/>
-      <w:pPr>
-        <w:tabs>
-          <w:tab w:val="num" w:pos="0"/>
-        </w:tabs>
-        <w:ind w:left="2880" w:hanging="480"/>
-      </w:pPr>
-      <w:rPr/>
-    </w:lvl>
-    <w:lvl w:ilvl="4">
-      <w:start w:val="4"/>
-      <w:numFmt w:val="decimal"/>
-      <w:lvlText w:val="%5."/>
-      <w:lvlJc w:val="left"/>
-      <w:pPr>
-        <w:tabs>
-          <w:tab w:val="num" w:pos="0"/>
-        </w:tabs>
-        <w:ind w:left="3600" w:hanging="480"/>
-      </w:pPr>
-      <w:rPr/>
-    </w:lvl>
-    <w:lvl w:ilvl="5">
-      <w:start w:val="4"/>
-      <w:numFmt w:val="decimal"/>
-      <w:lvlText w:val="%6."/>
-      <w:lvlJc w:val="left"/>
-      <w:pPr>
-        <w:tabs>
-          <w:tab w:val="num" w:pos="0"/>
-        </w:tabs>
-        <w:ind w:left="4320" w:hanging="480"/>
-      </w:pPr>
-      <w:rPr/>
-    </w:lvl>
-    <w:lvl w:ilvl="6">
-      <w:start w:val="4"/>
-      <w:numFmt w:val="decimal"/>
-      <w:lvlText w:val="%7."/>
-      <w:lvlJc w:val="left"/>
-      <w:pPr>
-        <w:tabs>
-          <w:tab w:val="num" w:pos="0"/>
-        </w:tabs>
-        <w:ind w:left="5040" w:hanging="480"/>
-      </w:pPr>
-      <w:rPr/>
-    </w:lvl>
-    <w:lvl w:ilvl="7">
-      <w:start w:val="4"/>
-      <w:numFmt w:val="decimal"/>
-      <w:lvlText w:val="%8."/>
-      <w:lvlJc w:val="left"/>
-      <w:pPr>
-        <w:tabs>
-          <w:tab w:val="num" w:pos="0"/>
-        </w:tabs>
-        <w:ind w:left="5760" w:hanging="480"/>
-      </w:pPr>
-      <w:rPr/>
-    </w:lvl>
-    <w:lvl w:ilvl="8">
-      <w:start w:val="4"/>
-      <w:numFmt w:val="decimal"/>
-      <w:lvlText w:val="%9."/>
-      <w:lvlJc w:val="left"/>
-      <w:pPr>
-        <w:tabs>
-          <w:tab w:val="num" w:pos="0"/>
-        </w:tabs>
-        <w:ind w:left="6480" w:hanging="480"/>
-      </w:pPr>
-      <w:rPr/>
-    </w:lvl>
-  </w:abstractNum>
-  <w:abstractNum w:abstractNumId="18">
     <w:lvl w:ilvl="0">
       <w:start w:val="1"/>
       <w:numFmt w:val="none"/>
@@ -7490,73 +6892,61 @@
     <w:abstractNumId w:val="14"/>
   </w:num>
   <w:num w:numId="15">
-    <w:abstractNumId w:val="15"/>
-  </w:num>
-  <w:num w:numId="16">
-    <w:abstractNumId w:val="16"/>
-  </w:num>
-  <w:num w:numId="17">
-    <w:abstractNumId w:val="17"/>
-  </w:num>
-  <w:num w:numId="18">
-    <w:abstractNumId w:val="18"/>
-  </w:num>
-  <w:num w:numId="19">
-    <w:abstractNumId w:val="1"/>
+    <w:abstractNumId w:val="4"/>
     <w:lvlOverride w:ilvl="0">
       <w:startOverride w:val="1"/>
     </w:lvlOverride>
   </w:num>
-  <w:num w:numId="20">
-    <w:abstractNumId w:val="2"/>
+  <w:num w:numId="16">
+    <w:abstractNumId w:val="5"/>
     <w:lvlOverride w:ilvl="0">
       <w:startOverride w:val="4"/>
     </w:lvlOverride>
   </w:num>
-  <w:num w:numId="21">
-    <w:abstractNumId w:val="3"/>
+  <w:num w:numId="17">
+    <w:abstractNumId w:val="6"/>
     <w:lvlOverride w:ilvl="0">
       <w:startOverride w:val="7"/>
     </w:lvlOverride>
   </w:num>
-  <w:num w:numId="22">
-    <w:abstractNumId w:val="5"/>
+  <w:num w:numId="18">
+    <w:abstractNumId w:val="7"/>
     <w:lvlOverride w:ilvl="0">
       <w:startOverride w:val="3"/>
     </w:lvlOverride>
   </w:num>
-  <w:num w:numId="23">
-    <w:abstractNumId w:val="2"/>
+  <w:num w:numId="19">
+    <w:abstractNumId w:val="5"/>
     <w:lvlOverride w:ilvl="0">
       <w:startOverride w:val="4"/>
     </w:lvlOverride>
   </w:num>
-  <w:num w:numId="24">
-    <w:abstractNumId w:val="1"/>
+  <w:num w:numId="20">
+    <w:abstractNumId w:val="4"/>
     <w:lvlOverride w:ilvl="0">
       <w:startOverride w:val="1"/>
     </w:lvlOverride>
   </w:num>
-  <w:num w:numId="25">
-    <w:abstractNumId w:val="1"/>
+  <w:num w:numId="21">
+    <w:abstractNumId w:val="4"/>
     <w:lvlOverride w:ilvl="0">
       <w:startOverride w:val="1"/>
     </w:lvlOverride>
   </w:num>
-  <w:num w:numId="26">
-    <w:abstractNumId w:val="15"/>
+  <w:num w:numId="22">
+    <w:abstractNumId w:val="11"/>
     <w:lvlOverride w:ilvl="0">
       <w:startOverride w:val="2"/>
     </w:lvlOverride>
   </w:num>
-  <w:num w:numId="27">
-    <w:abstractNumId w:val="5"/>
+  <w:num w:numId="23">
+    <w:abstractNumId w:val="7"/>
     <w:lvlOverride w:ilvl="0">
       <w:startOverride w:val="3"/>
     </w:lvlOverride>
   </w:num>
-  <w:num w:numId="28">
-    <w:abstractNumId w:val="2"/>
+  <w:num w:numId="24">
+    <w:abstractNumId w:val="5"/>
     <w:lvlOverride w:ilvl="0">
       <w:startOverride w:val="4"/>
     </w:lvlOverride>
@@ -7587,6 +6977,7 @@
     <w:qFormat/>
     <w:pPr>
       <w:widowControl/>
+      <w:suppressAutoHyphens w:val="true"/>
       <w:bidi w:val="0"/>
       <w:spacing w:before="0" w:after="200"/>
       <w:jc w:val="left"/>
@@ -7816,9 +7207,16 @@
     <w:qFormat/>
     <w:rPr/>
   </w:style>
+  <w:style w:type="character" w:styleId="FootnoteCharactersuser">
+    <w:name w:val="Footnote Characters (user)"/>
+    <w:basedOn w:val="BodyTextChar"/>
+    <w:qFormat/>
+    <w:rPr>
+      <w:vertAlign w:val="superscript"/>
+    </w:rPr>
+  </w:style>
   <w:style w:type="character" w:styleId="FootnoteCharacters">
     <w:name w:val="Footnote Characters"/>
-    <w:basedOn w:val="BodyTextChar"/>
     <w:qFormat/>
     <w:rPr>
       <w:vertAlign w:val="superscript"/>
@@ -8211,6 +7609,7 @@
       <w:keepNext w:val="true"/>
       <w:keepLines/>
       <w:widowControl/>
+      <w:suppressAutoHyphens w:val="true"/>
       <w:bidi w:val="0"/>
       <w:spacing w:before="0" w:after="200"/>
       <w:jc w:val="center"/>
@@ -8232,6 +7631,7 @@
       <w:keepNext w:val="true"/>
       <w:keepLines/>
       <w:widowControl/>
+      <w:suppressAutoHyphens w:val="true"/>
       <w:bidi w:val="0"/>
       <w:spacing w:before="0" w:after="200"/>
       <w:jc w:val="center"/>
@@ -8314,6 +7714,7 @@
     <w:qFormat/>
     <w:pPr>
       <w:widowControl/>
+      <w:suppressAutoHyphens w:val="true"/>
       <w:bidi w:val="0"/>
       <w:spacing w:before="100" w:after="100"/>
       <w:ind w:hanging="0" w:left="480" w:right="480"/>

</xml_diff>

<commit_message>
added mirror in readme
</commit_message>
<xml_diff>
--- a/README.docx
+++ b/README.docx
@@ -67,7 +67,7 @@
         <w:pStyle w:val="Compact"/>
         <w:numPr>
           <w:ilvl w:val="0"/>
-          <w:numId w:val="4"/>
+          <w:numId w:val="12"/>
         </w:numPr>
         <w:rPr/>
       </w:pPr>
@@ -81,7 +81,7 @@
         <w:pStyle w:val="Compact"/>
         <w:numPr>
           <w:ilvl w:val="0"/>
-          <w:numId w:val="4"/>
+          <w:numId w:val="12"/>
         </w:numPr>
         <w:rPr/>
       </w:pPr>
@@ -131,7 +131,7 @@
         <w:pStyle w:val="Compact"/>
         <w:numPr>
           <w:ilvl w:val="0"/>
-          <w:numId w:val="5"/>
+          <w:numId w:val="13"/>
         </w:numPr>
         <w:rPr/>
       </w:pPr>
@@ -155,7 +155,7 @@
         <w:pStyle w:val="Compact"/>
         <w:numPr>
           <w:ilvl w:val="0"/>
-          <w:numId w:val="5"/>
+          <w:numId w:val="13"/>
         </w:numPr>
         <w:rPr/>
       </w:pPr>
@@ -738,7 +738,7 @@
         <w:pStyle w:val="BodyText"/>
         <w:numPr>
           <w:ilvl w:val="0"/>
-          <w:numId w:val="14"/>
+          <w:numId w:val="2"/>
         </w:numPr>
         <w:rPr/>
       </w:pPr>
@@ -765,7 +765,7 @@
         <w:pStyle w:val="BodyText"/>
         <w:numPr>
           <w:ilvl w:val="0"/>
-          <w:numId w:val="15"/>
+          <w:numId w:val="3"/>
         </w:numPr>
         <w:rPr/>
       </w:pPr>
@@ -1225,7 +1225,7 @@
         <w:pStyle w:val="FirstParagraph"/>
         <w:numPr>
           <w:ilvl w:val="0"/>
-          <w:numId w:val="16"/>
+          <w:numId w:val="4"/>
         </w:numPr>
         <w:rPr/>
       </w:pPr>
@@ -1245,7 +1245,7 @@
         <w:pStyle w:val="FirstParagraph"/>
         <w:numPr>
           <w:ilvl w:val="0"/>
-          <w:numId w:val="16"/>
+          <w:numId w:val="4"/>
         </w:numPr>
         <w:rPr/>
       </w:pPr>
@@ -1287,7 +1287,7 @@
         <w:pStyle w:val="FirstParagraph"/>
         <w:numPr>
           <w:ilvl w:val="0"/>
-          <w:numId w:val="16"/>
+          <w:numId w:val="4"/>
         </w:numPr>
         <w:rPr/>
       </w:pPr>
@@ -1604,7 +1604,7 @@
         <w:pStyle w:val="Normal"/>
         <w:numPr>
           <w:ilvl w:val="0"/>
-          <w:numId w:val="3"/>
+          <w:numId w:val="1"/>
         </w:numPr>
         <w:rPr/>
       </w:pPr>
@@ -1635,7 +1635,7 @@
         <w:pStyle w:val="Normal"/>
         <w:numPr>
           <w:ilvl w:val="0"/>
-          <w:numId w:val="3"/>
+          <w:numId w:val="1"/>
         </w:numPr>
         <w:rPr/>
       </w:pPr>
@@ -1672,7 +1672,7 @@
         <w:pStyle w:val="FirstParagraph"/>
         <w:numPr>
           <w:ilvl w:val="0"/>
-          <w:numId w:val="17"/>
+          <w:numId w:val="5"/>
         </w:numPr>
         <w:rPr/>
       </w:pPr>
@@ -1692,7 +1692,7 @@
         <w:pStyle w:val="FirstParagraph"/>
         <w:numPr>
           <w:ilvl w:val="0"/>
-          <w:numId w:val="17"/>
+          <w:numId w:val="5"/>
         </w:numPr>
         <w:rPr/>
       </w:pPr>
@@ -1777,7 +1777,7 @@
         <w:pStyle w:val="BodyText"/>
         <w:numPr>
           <w:ilvl w:val="0"/>
-          <w:numId w:val="18"/>
+          <w:numId w:val="6"/>
         </w:numPr>
         <w:rPr/>
       </w:pPr>
@@ -1791,7 +1791,7 @@
         <w:pStyle w:val="BodyText"/>
         <w:numPr>
           <w:ilvl w:val="0"/>
-          <w:numId w:val="18"/>
+          <w:numId w:val="6"/>
         </w:numPr>
         <w:rPr/>
       </w:pPr>
@@ -1815,7 +1815,7 @@
         <w:pStyle w:val="BodyText"/>
         <w:numPr>
           <w:ilvl w:val="0"/>
-          <w:numId w:val="18"/>
+          <w:numId w:val="6"/>
         </w:numPr>
         <w:rPr/>
       </w:pPr>
@@ -1839,7 +1839,7 @@
         <w:pStyle w:val="BodyText"/>
         <w:numPr>
           <w:ilvl w:val="0"/>
-          <w:numId w:val="18"/>
+          <w:numId w:val="6"/>
         </w:numPr>
         <w:rPr/>
       </w:pPr>
@@ -2279,18 +2279,11 @@
         <w:rPr>
           <w:rStyle w:val="NormalTok"/>
         </w:rPr>
-        <w:t>.</w:t>
-      </w:r>
-      <w:r>
-        <w:rPr>
-          <w:rStyle w:val="NormalTok"/>
-        </w:rPr>
-        <w:t xml:space="preserve">zip </w:t>
-      </w:r>
-      <w:r>
-        <w:rPr>
-          <w:rStyle w:val="NormalTok"/>
-          <w:rFonts w:ascii="Cambria" w:hAnsi="Cambria"/>
+        <w:t xml:space="preserve">.zip </w:t>
+      </w:r>
+      <w:r>
+        <w:rPr>
+          <w:rStyle w:val="NormalTok"/>
           <w:sz w:val="24"/>
           <w:szCs w:val="24"/>
         </w:rPr>
@@ -2300,13 +2293,21 @@
         <w:r>
           <w:rPr>
             <w:rStyle w:val="Hyperlink"/>
-            <w:rFonts w:ascii="Cambria" w:hAnsi="Cambria"/>
             <w:sz w:val="24"/>
             <w:szCs w:val="24"/>
           </w:rPr>
-          <w:t>https://codeberg.org/wilhembk/cisco-nxapi-wrapper</w:t>
+          <w:t>Codeberg</w:t>
         </w:r>
       </w:hyperlink>
+      <w:r>
+        <w:rPr>
+          <w:rStyle w:val="Hyperlink"/>
+          <w:color w:val="auto"/>
+          <w:sz w:val="24"/>
+          <w:szCs w:val="24"/>
+        </w:rPr>
+        <w:t>:</w:t>
+      </w:r>
     </w:p>
     <w:p>
       <w:pPr>
@@ -2314,9 +2315,8 @@
         <w:rPr/>
       </w:pPr>
       <w:r>
-        <w:rPr/>
         <w:drawing>
-          <wp:anchor distT="0" distB="0" distL="0" distR="0" simplePos="0" relativeHeight="8" behindDoc="0" locked="0" layoutInCell="0" allowOverlap="1">
+          <wp:anchor distT="0" distB="0" distL="0" distR="0" simplePos="0" relativeHeight="7" behindDoc="0" locked="0" layoutInCell="0" allowOverlap="1">
             <wp:simplePos x="0" y="0"/>
             <wp:positionH relativeFrom="column">
               <wp:align>center</wp:align>
@@ -2362,10 +2362,87 @@
           </wp:anchor>
         </w:drawing>
       </w:r>
+      <w:r>
+        <w:rPr/>
+        <w:t xml:space="preserve">Ou sur </w:t>
+      </w:r>
+      <w:hyperlink r:id="rId9">
+        <w:r>
+          <w:rPr>
+            <w:rStyle w:val="Hyperlink"/>
+          </w:rPr>
+          <w:t>GitHub</w:t>
+        </w:r>
+      </w:hyperlink>
+      <w:r>
+        <w:rPr>
+          <w:rStyle w:val="Hyperlink"/>
+          <w:color w:val="auto"/>
+        </w:rPr>
+        <w:t>:</w:t>
+      </w:r>
     </w:p>
     <w:p>
       <w:pPr>
         <w:pStyle w:val="BodyText"/>
+        <w:rPr>
+          <w:rStyle w:val="Hyperlink"/>
+          <w:color w:val="auto"/>
+        </w:rPr>
+      </w:pPr>
+      <w:r>
+        <w:rPr/>
+        <w:drawing>
+          <wp:anchor distT="0" distB="0" distL="0" distR="0" simplePos="0" relativeHeight="9" behindDoc="0" locked="0" layoutInCell="0" allowOverlap="1">
+            <wp:simplePos x="0" y="0"/>
+            <wp:positionH relativeFrom="column">
+              <wp:align>center</wp:align>
+            </wp:positionH>
+            <wp:positionV relativeFrom="paragraph">
+              <wp:posOffset>635</wp:posOffset>
+            </wp:positionV>
+            <wp:extent cx="5943600" cy="2675890"/>
+            <wp:effectExtent l="0" t="0" r="0" b="0"/>
+            <wp:wrapSquare wrapText="largest"/>
+            <wp:docPr id="6" name="Image7"/>
+            <wp:cNvGraphicFramePr>
+              <a:graphicFrameLocks xmlns:a="http://schemas.openxmlformats.org/drawingml/2006/main" noChangeAspect="1"/>
+            </wp:cNvGraphicFramePr>
+            <a:graphic xmlns:a="http://schemas.openxmlformats.org/drawingml/2006/main">
+              <a:graphicData uri="http://schemas.openxmlformats.org/drawingml/2006/picture">
+                <pic:pic xmlns:pic="http://schemas.openxmlformats.org/drawingml/2006/picture">
+                  <pic:nvPicPr>
+                    <pic:cNvPr id="6" name="Image7"/>
+                    <pic:cNvPicPr>
+                      <a:picLocks noChangeAspect="1" noChangeArrowheads="1"/>
+                    </pic:cNvPicPr>
+                  </pic:nvPicPr>
+                  <pic:blipFill>
+                    <a:blip r:embed="rId10"/>
+                    <a:stretch>
+                      <a:fillRect/>
+                    </a:stretch>
+                  </pic:blipFill>
+                  <pic:spPr bwMode="auto">
+                    <a:xfrm>
+                      <a:off x="0" y="0"/>
+                      <a:ext cx="5943600" cy="2675890"/>
+                    </a:xfrm>
+                    <a:prstGeom prst="rect">
+                      <a:avLst/>
+                    </a:prstGeom>
+                    <a:noFill/>
+                  </pic:spPr>
+                </pic:pic>
+              </a:graphicData>
+            </a:graphic>
+          </wp:anchor>
+        </w:drawing>
+      </w:r>
+    </w:p>
+    <w:p>
+      <w:pPr>
+        <w:pStyle w:val="BodyText"/>
         <w:rPr/>
       </w:pPr>
       <w:r>
@@ -2376,7 +2453,7 @@
         <w:rPr>
           <w:rStyle w:val="NormalTok"/>
         </w:rPr>
-        <w:t>it</w:t>
+        <w:t xml:space="preserve">it </w:t>
       </w:r>
       <w:r>
         <w:rPr>
@@ -2385,7 +2462,7 @@
           <w:sz w:val="24"/>
           <w:szCs w:val="24"/>
         </w:rPr>
-        <w:t>:</w:t>
+        <w:t>de Codeberg</w:t>
       </w:r>
     </w:p>
     <w:p>
@@ -2403,7 +2480,82 @@
           <w:sz w:val="22"/>
           <w:szCs w:val="22"/>
         </w:rPr>
-        <w:t>git clone https://codeberg.org/wilhembk/cisco-nxapi-wrapper.git</w:t>
+        <w:t xml:space="preserve">git clone </w:t>
+      </w:r>
+      <w:hyperlink r:id="rId11">
+        <w:r>
+          <w:rPr>
+            <w:rStyle w:val="Hyperlink"/>
+            <w:rFonts w:ascii="Consolas" w:hAnsi="Consolas"/>
+            <w:sz w:val="22"/>
+            <w:szCs w:val="22"/>
+          </w:rPr>
+          <w:t>https://codeberg.org/wilhembk/cisco-nxapi-wrapper.git</w:t>
+        </w:r>
+      </w:hyperlink>
+    </w:p>
+    <w:p>
+      <w:pPr>
+        <w:pStyle w:val="BodyText"/>
+        <w:rPr>
+          <w:rFonts w:ascii="Cambria" w:hAnsi="Cambria"/>
+          <w:sz w:val="24"/>
+          <w:szCs w:val="24"/>
+        </w:rPr>
+      </w:pPr>
+      <w:r>
+        <w:rPr>
+          <w:rFonts w:ascii="Cambria" w:hAnsi="Cambria"/>
+          <w:sz w:val="24"/>
+          <w:szCs w:val="24"/>
+        </w:rPr>
+        <w:t>Ou le répertoire miroir disponible sur GitHub</w:t>
+      </w:r>
+    </w:p>
+    <w:p>
+      <w:pPr>
+        <w:pStyle w:val="BodyText"/>
+        <w:rPr>
+          <w:rFonts w:ascii="Consolas" w:hAnsi="Consolas"/>
+          <w:sz w:val="22"/>
+          <w:szCs w:val="22"/>
+        </w:rPr>
+      </w:pPr>
+      <w:r>
+        <w:rPr>
+          <w:rFonts w:ascii="Consolas" w:hAnsi="Consolas"/>
+          <w:sz w:val="22"/>
+          <w:szCs w:val="22"/>
+        </w:rPr>
+        <w:t xml:space="preserve">git clone </w:t>
+      </w:r>
+      <w:hyperlink r:id="rId12">
+        <w:r>
+          <w:rPr>
+            <w:rStyle w:val="Hyperlink"/>
+            <w:rFonts w:ascii="Consolas" w:hAnsi="Consolas"/>
+            <w:sz w:val="22"/>
+            <w:szCs w:val="22"/>
+          </w:rPr>
+          <w:t>https://github.com/wilhembk/cisco-nxapi-wrapper.git</w:t>
+        </w:r>
+      </w:hyperlink>
+    </w:p>
+    <w:p>
+      <w:pPr>
+        <w:pStyle w:val="BodyText"/>
+        <w:rPr>
+          <w:rFonts w:ascii="Consolas" w:hAnsi="Consolas"/>
+          <w:sz w:val="22"/>
+          <w:szCs w:val="22"/>
+        </w:rPr>
+      </w:pPr>
+      <w:r>
+        <w:rPr>
+          <w:rFonts w:ascii="Consolas" w:hAnsi="Consolas"/>
+          <w:sz w:val="22"/>
+          <w:szCs w:val="22"/>
+        </w:rPr>
       </w:r>
     </w:p>
     <w:p>
@@ -3193,7 +3345,7 @@
         <w:pStyle w:val="Compact"/>
         <w:numPr>
           <w:ilvl w:val="0"/>
-          <w:numId w:val="3"/>
+          <w:numId w:val="1"/>
         </w:numPr>
         <w:rPr/>
       </w:pPr>
@@ -3213,7 +3365,7 @@
         <w:pStyle w:val="Compact"/>
         <w:numPr>
           <w:ilvl w:val="0"/>
-          <w:numId w:val="3"/>
+          <w:numId w:val="1"/>
         </w:numPr>
         <w:rPr/>
       </w:pPr>
@@ -3233,7 +3385,7 @@
         <w:pStyle w:val="Compact"/>
         <w:numPr>
           <w:ilvl w:val="0"/>
-          <w:numId w:val="3"/>
+          <w:numId w:val="1"/>
         </w:numPr>
         <w:rPr/>
       </w:pPr>
@@ -3265,7 +3417,7 @@
         <w:pStyle w:val="Compact"/>
         <w:numPr>
           <w:ilvl w:val="0"/>
-          <w:numId w:val="3"/>
+          <w:numId w:val="1"/>
         </w:numPr>
         <w:rPr/>
       </w:pPr>
@@ -3441,7 +3593,7 @@
         <w:pStyle w:val="Compact"/>
         <w:numPr>
           <w:ilvl w:val="0"/>
-          <w:numId w:val="3"/>
+          <w:numId w:val="1"/>
         </w:numPr>
         <w:rPr/>
       </w:pPr>
@@ -3472,7 +3624,7 @@
         <w:pStyle w:val="Compact"/>
         <w:numPr>
           <w:ilvl w:val="0"/>
-          <w:numId w:val="3"/>
+          <w:numId w:val="1"/>
         </w:numPr>
         <w:rPr/>
       </w:pPr>
@@ -3492,7 +3644,7 @@
         <w:pStyle w:val="Compact"/>
         <w:numPr>
           <w:ilvl w:val="0"/>
-          <w:numId w:val="3"/>
+          <w:numId w:val="1"/>
         </w:numPr>
         <w:rPr/>
       </w:pPr>
@@ -3532,7 +3684,7 @@
         <w:pStyle w:val="Compact"/>
         <w:numPr>
           <w:ilvl w:val="0"/>
-          <w:numId w:val="3"/>
+          <w:numId w:val="1"/>
         </w:numPr>
         <w:rPr/>
       </w:pPr>
@@ -3583,7 +3735,7 @@
         <w:pStyle w:val="Compact"/>
         <w:numPr>
           <w:ilvl w:val="0"/>
-          <w:numId w:val="3"/>
+          <w:numId w:val="1"/>
         </w:numPr>
         <w:rPr/>
       </w:pPr>
@@ -3654,7 +3806,7 @@
         <w:pStyle w:val="Compact"/>
         <w:numPr>
           <w:ilvl w:val="0"/>
-          <w:numId w:val="3"/>
+          <w:numId w:val="1"/>
         </w:numPr>
         <w:rPr/>
       </w:pPr>
@@ -3674,7 +3826,7 @@
         <w:pStyle w:val="Compact"/>
         <w:numPr>
           <w:ilvl w:val="0"/>
-          <w:numId w:val="3"/>
+          <w:numId w:val="1"/>
         </w:numPr>
         <w:rPr/>
       </w:pPr>
@@ -3930,7 +4082,7 @@
       </w:pPr>
       <w:r>
         <w:object w:dxaOrig="9638" w:dyaOrig="1701">
-          <v:shapetype id="_x0000_tole_rId9" coordsize="21600,21600" o:spt="9" o:preferrelative="t" path="m@4@5l@4@11@9@11@9@5xe" filled="f" stroked="f">
+          <v:shapetype id="_x0000_tole_rId13" coordsize="21600,21600" o:spt="13" o:preferrelative="t" path="m@4@5l@4@11@9@11@9@5xe" filled="f" stroked="f">
             <v:stroke joinstyle="miter"/>
             <v:formulas>
               <v:f eqn="if lineDrawn pixelLineWidth 0"/>
@@ -3949,11 +4101,11 @@
             <v:path o:extrusionok="f" gradientshapeok="t" o:connecttype="rect"/>
             <o:lock v:ext="edit" aspectratio="t"/>
           </v:shapetype>
-          <v:shape id="ole_rId9" type="_x0000_tole_rId9" style="position:absolute;margin-left:-6.95pt;margin-top:0pt;width:481.9pt;height:85.05pt;mso-wrap-distance-right:0pt;mso-position-horizontal-relative:text;mso-position-vertical-relative:text" filled="f" o:ole="">
-            <v:imagedata r:id="rId10" o:title=""/>
+          <v:shape id="ole_rId13" type="_x0000_tole_rId13" style="position:absolute;margin-left:-6.95pt;margin-top:0pt;width:481.9pt;height:85.05pt;mso-wrap-distance-right:0pt;mso-position-horizontal-relative:text;mso-position-vertical-relative:text" filled="f" o:ole="">
+            <v:imagedata r:id="rId14" o:title=""/>
             <w10:wrap type="square"/>
           </v:shape>
-          <o:OLEObject Type="Embed" ProgID="Word.Document.12" ShapeID="ole_rId9" DrawAspect="Content" ObjectID="_332439939" r:id="rId9"/>
+          <o:OLEObject Type="Embed" ProgID="Word.Document.12" ShapeID="ole_rId13" DrawAspect="Content" ObjectID="_99969468" r:id="rId13"/>
         </w:object>
       </w:r>
       <w:r>
@@ -4224,7 +4376,7 @@
         <w:rPr/>
         <w:t xml:space="preserve">Récupérez ce conteneur directement depuis </w:t>
       </w:r>
-      <w:hyperlink r:id="rId11">
+      <w:hyperlink r:id="rId15">
         <w:r>
           <w:rPr>
             <w:rStyle w:val="Hyperlink"/>
@@ -4292,19 +4444,7 @@
         <w:rPr>
           <w:rStyle w:val="NormalTok"/>
         </w:rPr>
-        <w:t xml:space="preserve"> </w:t>
-      </w:r>
-      <w:r>
-        <w:rPr>
-          <w:rStyle w:val="NormalTok"/>
-        </w:rPr>
-        <w:t>wilhembk/</w:t>
-      </w:r>
-      <w:r>
-        <w:rPr>
-          <w:rStyle w:val="NormalTok"/>
-        </w:rPr>
-        <w:t>cisco-nxapi-wrapper .</w:t>
+        <w:t xml:space="preserve"> wilhembk/cisco-nxapi-wrapper .</w:t>
       </w:r>
     </w:p>
     <w:p>
@@ -4315,7 +4455,6 @@
       <w:r>
         <w:rPr>
           <w:rStyle w:val="NormalTok"/>
-          <w:rFonts w:ascii="Cambria" w:hAnsi="Cambria"/>
           <w:sz w:val="24"/>
           <w:szCs w:val="24"/>
         </w:rPr>
@@ -4330,29 +4469,10 @@
       <w:r>
         <w:rPr>
           <w:rStyle w:val="NormalTok"/>
-          <w:rFonts w:ascii="Cambria" w:hAnsi="Cambria"/>
           <w:sz w:val="24"/>
           <w:szCs w:val="24"/>
         </w:rPr>
-        <w:t xml:space="preserve">mais veillez à repercutez ce changement </w:t>
-      </w:r>
-      <w:r>
-        <w:rPr>
-          <w:rStyle w:val="NormalTok"/>
-          <w:rFonts w:ascii="Cambria" w:hAnsi="Cambria"/>
-          <w:sz w:val="24"/>
-          <w:szCs w:val="24"/>
-        </w:rPr>
-        <w:t>s</w:t>
-      </w:r>
-      <w:r>
-        <w:rPr>
-          <w:rStyle w:val="NormalTok"/>
-          <w:rFonts w:ascii="Cambria" w:hAnsi="Cambria"/>
-          <w:sz w:val="24"/>
-          <w:szCs w:val="24"/>
-        </w:rPr>
-        <w:t xml:space="preserve">ur la commande </w:t>
+        <w:t xml:space="preserve">mais veillez à repercutez ce changement sur la commande </w:t>
       </w:r>
       <w:r>
         <w:rPr>
@@ -4363,7 +4483,6 @@
       <w:r>
         <w:rPr>
           <w:rStyle w:val="NormalTok"/>
-          <w:rFonts w:ascii="Cambria" w:hAnsi="Cambria"/>
           <w:sz w:val="24"/>
           <w:szCs w:val="24"/>
         </w:rPr>
@@ -4526,7 +4645,7 @@
         <w:pStyle w:val="BodyText"/>
         <w:numPr>
           <w:ilvl w:val="0"/>
-          <w:numId w:val="19"/>
+          <w:numId w:val="7"/>
         </w:numPr>
         <w:rPr/>
       </w:pPr>
@@ -4540,7 +4659,7 @@
         <w:pStyle w:val="BodyText"/>
         <w:numPr>
           <w:ilvl w:val="0"/>
-          <w:numId w:val="19"/>
+          <w:numId w:val="7"/>
         </w:numPr>
         <w:rPr/>
       </w:pPr>
@@ -4554,7 +4673,7 @@
         <w:pStyle w:val="BodyText"/>
         <w:numPr>
           <w:ilvl w:val="0"/>
-          <w:numId w:val="19"/>
+          <w:numId w:val="7"/>
         </w:numPr>
         <w:rPr/>
       </w:pPr>
@@ -4589,7 +4708,7 @@
         <w:pStyle w:val="BodyText"/>
         <w:numPr>
           <w:ilvl w:val="0"/>
-          <w:numId w:val="20"/>
+          <w:numId w:val="8"/>
         </w:numPr>
         <w:rPr/>
       </w:pPr>
@@ -4603,7 +4722,7 @@
         <w:pStyle w:val="BodyText"/>
         <w:numPr>
           <w:ilvl w:val="0"/>
-          <w:numId w:val="20"/>
+          <w:numId w:val="8"/>
         </w:numPr>
         <w:rPr/>
       </w:pPr>
@@ -5232,7 +5351,7 @@
             <wp:extent cx="4354195" cy="7381240"/>
             <wp:effectExtent l="0" t="0" r="0" b="0"/>
             <wp:wrapTopAndBottom/>
-            <wp:docPr id="6" name="Image5"/>
+            <wp:docPr id="7" name="Image5"/>
             <wp:cNvGraphicFramePr>
               <a:graphicFrameLocks xmlns:a="http://schemas.openxmlformats.org/drawingml/2006/main" noChangeAspect="1"/>
             </wp:cNvGraphicFramePr>
@@ -5240,13 +5359,13 @@
               <a:graphicData uri="http://schemas.openxmlformats.org/drawingml/2006/picture">
                 <pic:pic xmlns:pic="http://schemas.openxmlformats.org/drawingml/2006/picture">
                   <pic:nvPicPr>
-                    <pic:cNvPr id="6" name="Image5"/>
+                    <pic:cNvPr id="7" name="Image5"/>
                     <pic:cNvPicPr>
                       <a:picLocks noChangeAspect="1" noChangeArrowheads="1"/>
                     </pic:cNvPicPr>
                   </pic:nvPicPr>
                   <pic:blipFill>
-                    <a:blip r:embed="rId12"/>
+                    <a:blip r:embed="rId16"/>
                     <a:stretch>
                       <a:fillRect/>
                     </a:stretch>
@@ -5301,7 +5420,7 @@
         <w:rPr/>
         <w:t xml:space="preserve">Pour développer, il est recommandé d’utiliser </w:t>
       </w:r>
-      <w:hyperlink r:id="rId13">
+      <w:hyperlink r:id="rId17">
         <w:r>
           <w:rPr>
             <w:rStyle w:val="Hyperlink"/>
@@ -5368,7 +5487,7 @@
         <w:pStyle w:val="FirstParagraph"/>
         <w:numPr>
           <w:ilvl w:val="0"/>
-          <w:numId w:val="21"/>
+          <w:numId w:val="9"/>
         </w:numPr>
         <w:rPr/>
       </w:pPr>
@@ -5382,7 +5501,7 @@
         <w:pStyle w:val="FirstParagraph"/>
         <w:numPr>
           <w:ilvl w:val="1"/>
-          <w:numId w:val="21"/>
+          <w:numId w:val="9"/>
         </w:numPr>
         <w:rPr/>
       </w:pPr>
@@ -5427,7 +5546,7 @@
         <w:pStyle w:val="FirstParagraph"/>
         <w:numPr>
           <w:ilvl w:val="1"/>
-          <w:numId w:val="21"/>
+          <w:numId w:val="9"/>
         </w:numPr>
         <w:rPr/>
       </w:pPr>
@@ -5482,7 +5601,7 @@
         <w:pStyle w:val="FirstParagraph"/>
         <w:numPr>
           <w:ilvl w:val="0"/>
-          <w:numId w:val="21"/>
+          <w:numId w:val="9"/>
         </w:numPr>
         <w:rPr/>
       </w:pPr>
@@ -5516,7 +5635,7 @@
         <w:pStyle w:val="FirstParagraph"/>
         <w:numPr>
           <w:ilvl w:val="1"/>
-          <w:numId w:val="21"/>
+          <w:numId w:val="9"/>
         </w:numPr>
         <w:rPr/>
       </w:pPr>
@@ -5560,7 +5679,7 @@
         <w:pStyle w:val="FirstParagraph"/>
         <w:numPr>
           <w:ilvl w:val="1"/>
-          <w:numId w:val="21"/>
+          <w:numId w:val="9"/>
         </w:numPr>
         <w:rPr/>
       </w:pPr>
@@ -5584,7 +5703,7 @@
         <w:pStyle w:val="FirstParagraph"/>
         <w:numPr>
           <w:ilvl w:val="0"/>
-          <w:numId w:val="21"/>
+          <w:numId w:val="9"/>
         </w:numPr>
         <w:rPr/>
       </w:pPr>
@@ -5730,7 +5849,7 @@
         <w:pStyle w:val="Compact"/>
         <w:numPr>
           <w:ilvl w:val="0"/>
-          <w:numId w:val="4"/>
+          <w:numId w:val="12"/>
         </w:numPr>
         <w:rPr/>
       </w:pPr>
@@ -5754,7 +5873,7 @@
         <w:pStyle w:val="Compact"/>
         <w:numPr>
           <w:ilvl w:val="0"/>
-          <w:numId w:val="4"/>
+          <w:numId w:val="12"/>
         </w:numPr>
         <w:rPr/>
       </w:pPr>
@@ -5818,7 +5937,7 @@
         <w:pStyle w:val="Compact"/>
         <w:numPr>
           <w:ilvl w:val="0"/>
-          <w:numId w:val="4"/>
+          <w:numId w:val="12"/>
         </w:numPr>
         <w:rPr/>
       </w:pPr>
@@ -5882,7 +6001,7 @@
         <w:pStyle w:val="Compact"/>
         <w:numPr>
           <w:ilvl w:val="0"/>
-          <w:numId w:val="4"/>
+          <w:numId w:val="12"/>
         </w:numPr>
         <w:rPr/>
       </w:pPr>
@@ -5963,7 +6082,7 @@
         <w:rPr/>
         <w:t xml:space="preserve">Avec </w:t>
       </w:r>
-      <w:hyperlink r:id="rId14">
+      <w:hyperlink r:id="rId18">
         <w:r>
           <w:rPr>
             <w:rStyle w:val="Hyperlink"/>
@@ -6021,7 +6140,7 @@
         <w:pStyle w:val="Compact"/>
         <w:numPr>
           <w:ilvl w:val="0"/>
-          <w:numId w:val="3"/>
+          <w:numId w:val="1"/>
         </w:numPr>
         <w:rPr/>
       </w:pPr>
@@ -6055,7 +6174,7 @@
         <w:pStyle w:val="Compact"/>
         <w:numPr>
           <w:ilvl w:val="0"/>
-          <w:numId w:val="3"/>
+          <w:numId w:val="1"/>
         </w:numPr>
         <w:rPr/>
       </w:pPr>
@@ -6167,7 +6286,7 @@
         <w:pStyle w:val="Compact"/>
         <w:numPr>
           <w:ilvl w:val="0"/>
-          <w:numId w:val="3"/>
+          <w:numId w:val="1"/>
         </w:numPr>
         <w:rPr/>
       </w:pPr>
@@ -6191,7 +6310,7 @@
         <w:pStyle w:val="Compact"/>
         <w:numPr>
           <w:ilvl w:val="0"/>
-          <w:numId w:val="3"/>
+          <w:numId w:val="1"/>
         </w:numPr>
         <w:rPr/>
       </w:pPr>
@@ -6247,7 +6366,7 @@
         <w:rPr/>
         <w:t xml:space="preserve">La bibliothèque Python native </w:t>
       </w:r>
-      <w:hyperlink r:id="rId15">
+      <w:hyperlink r:id="rId19">
         <w:r>
           <w:rPr>
             <w:rStyle w:val="Hyperlink"/>
@@ -6265,7 +6384,7 @@
         <w:pStyle w:val="Compact"/>
         <w:numPr>
           <w:ilvl w:val="0"/>
-          <w:numId w:val="3"/>
+          <w:numId w:val="1"/>
         </w:numPr>
         <w:rPr/>
       </w:pPr>
@@ -6299,7 +6418,7 @@
         <w:pStyle w:val="Compact"/>
         <w:numPr>
           <w:ilvl w:val="1"/>
-          <w:numId w:val="3"/>
+          <w:numId w:val="1"/>
         </w:numPr>
         <w:rPr/>
       </w:pPr>
@@ -6323,7 +6442,7 @@
         <w:pStyle w:val="Compact"/>
         <w:numPr>
           <w:ilvl w:val="0"/>
-          <w:numId w:val="3"/>
+          <w:numId w:val="1"/>
         </w:numPr>
         <w:rPr/>
       </w:pPr>
@@ -7549,15 +7668,699 @@
 <w:numbering xmlns:w="http://schemas.openxmlformats.org/wordprocessingml/2006/main" xmlns:o="urn:schemas-microsoft-com:office:office" xmlns:r="http://schemas.openxmlformats.org/officeDocument/2006/relationships" xmlns:v="urn:schemas-microsoft-com:vml" xmlns:mc="http://schemas.openxmlformats.org/markup-compatibility/2006" xmlns:w14="http://schemas.microsoft.com/office/word/2010/wordml" mc:Ignorable="w14">
   <w:abstractNum w:abstractNumId="1">
     <w:lvl w:ilvl="0">
+      <w:numFmt w:val="bullet"/>
+      <w:lvlText w:val=""/>
+      <w:lvlJc w:val="left"/>
+      <w:pPr>
+        <w:tabs>
+          <w:tab w:val="num" w:pos="0"/>
+        </w:tabs>
+        <w:ind w:left="720" w:hanging="480"/>
+      </w:pPr>
+      <w:rPr>
+        <w:rFonts w:ascii="Symbol" w:hAnsi="Symbol" w:cs="Symbol" w:hint="default"/>
+      </w:rPr>
+    </w:lvl>
+    <w:lvl w:ilvl="1">
+      <w:start w:val="0"/>
+      <w:numFmt w:val="bullet"/>
+      <w:lvlText w:val=""/>
+      <w:lvlJc w:val="left"/>
+      <w:pPr>
+        <w:tabs>
+          <w:tab w:val="num" w:pos="0"/>
+        </w:tabs>
+        <w:ind w:left="1440" w:hanging="480"/>
+      </w:pPr>
+      <w:rPr>
+        <w:rFonts w:ascii="Symbol" w:hAnsi="Symbol" w:cs="Symbol" w:hint="default"/>
+      </w:rPr>
+    </w:lvl>
+    <w:lvl w:ilvl="2">
+      <w:start w:val="0"/>
+      <w:numFmt w:val="bullet"/>
+      <w:lvlText w:val=""/>
+      <w:lvlJc w:val="left"/>
+      <w:pPr>
+        <w:tabs>
+          <w:tab w:val="num" w:pos="0"/>
+        </w:tabs>
+        <w:ind w:left="2160" w:hanging="480"/>
+      </w:pPr>
+      <w:rPr>
+        <w:rFonts w:ascii="Symbol" w:hAnsi="Symbol" w:cs="Symbol" w:hint="default"/>
+      </w:rPr>
+    </w:lvl>
+    <w:lvl w:ilvl="3">
+      <w:start w:val="0"/>
+      <w:numFmt w:val="bullet"/>
+      <w:lvlText w:val=""/>
+      <w:lvlJc w:val="left"/>
+      <w:pPr>
+        <w:tabs>
+          <w:tab w:val="num" w:pos="0"/>
+        </w:tabs>
+        <w:ind w:left="2880" w:hanging="480"/>
+      </w:pPr>
+      <w:rPr>
+        <w:rFonts w:ascii="Symbol" w:hAnsi="Symbol" w:cs="Symbol" w:hint="default"/>
+      </w:rPr>
+    </w:lvl>
+    <w:lvl w:ilvl="4">
+      <w:start w:val="0"/>
+      <w:numFmt w:val="bullet"/>
+      <w:lvlText w:val=""/>
+      <w:lvlJc w:val="left"/>
+      <w:pPr>
+        <w:tabs>
+          <w:tab w:val="num" w:pos="0"/>
+        </w:tabs>
+        <w:ind w:left="3600" w:hanging="480"/>
+      </w:pPr>
+      <w:rPr>
+        <w:rFonts w:ascii="Symbol" w:hAnsi="Symbol" w:cs="Symbol" w:hint="default"/>
+      </w:rPr>
+    </w:lvl>
+    <w:lvl w:ilvl="5">
+      <w:start w:val="0"/>
+      <w:numFmt w:val="bullet"/>
+      <w:lvlText w:val=""/>
+      <w:lvlJc w:val="left"/>
+      <w:pPr>
+        <w:tabs>
+          <w:tab w:val="num" w:pos="0"/>
+        </w:tabs>
+        <w:ind w:left="4320" w:hanging="480"/>
+      </w:pPr>
+      <w:rPr>
+        <w:rFonts w:ascii="Symbol" w:hAnsi="Symbol" w:cs="Symbol" w:hint="default"/>
+      </w:rPr>
+    </w:lvl>
+    <w:lvl w:ilvl="6">
+      <w:start w:val="0"/>
+      <w:numFmt w:val="bullet"/>
+      <w:lvlText w:val=""/>
+      <w:lvlJc w:val="left"/>
+      <w:pPr>
+        <w:tabs>
+          <w:tab w:val="num" w:pos="0"/>
+        </w:tabs>
+        <w:ind w:left="5040" w:hanging="480"/>
+      </w:pPr>
+      <w:rPr>
+        <w:rFonts w:ascii="Symbol" w:hAnsi="Symbol" w:cs="Symbol" w:hint="default"/>
+      </w:rPr>
+    </w:lvl>
+    <w:lvl w:ilvl="7">
+      <w:start w:val="0"/>
+      <w:numFmt w:val="bullet"/>
+      <w:lvlText w:val=""/>
+      <w:lvlJc w:val="left"/>
+      <w:pPr>
+        <w:tabs>
+          <w:tab w:val="num" w:pos="0"/>
+        </w:tabs>
+        <w:ind w:left="5760" w:hanging="480"/>
+      </w:pPr>
+      <w:rPr>
+        <w:rFonts w:ascii="Symbol" w:hAnsi="Symbol" w:cs="Symbol" w:hint="default"/>
+      </w:rPr>
+    </w:lvl>
+    <w:lvl w:ilvl="8">
+      <w:start w:val="0"/>
+      <w:numFmt w:val="bullet"/>
+      <w:lvlText w:val=""/>
+      <w:lvlJc w:val="left"/>
+      <w:pPr>
+        <w:tabs>
+          <w:tab w:val="num" w:pos="0"/>
+        </w:tabs>
+        <w:ind w:left="6480" w:hanging="480"/>
+      </w:pPr>
+      <w:rPr>
+        <w:rFonts w:ascii="Symbol" w:hAnsi="Symbol" w:cs="Symbol" w:hint="default"/>
+      </w:rPr>
+    </w:lvl>
+  </w:abstractNum>
+  <w:abstractNum w:abstractNumId="2">
+    <w:lvl w:ilvl="0">
+      <w:start w:val="1"/>
+      <w:numFmt w:val="bullet"/>
+      <w:lvlText w:val=""/>
+      <w:lvlJc w:val="left"/>
+      <w:pPr>
+        <w:tabs>
+          <w:tab w:val="num" w:pos="720"/>
+        </w:tabs>
+        <w:ind w:left="720" w:hanging="360"/>
+      </w:pPr>
+      <w:rPr>
+        <w:rFonts w:ascii="Symbol" w:hAnsi="Symbol" w:cs="Symbol" w:hint="default"/>
+      </w:rPr>
+    </w:lvl>
+    <w:lvl w:ilvl="1">
+      <w:start w:val="1"/>
+      <w:numFmt w:val="bullet"/>
+      <w:lvlText w:val="◦"/>
+      <w:lvlJc w:val="left"/>
+      <w:pPr>
+        <w:tabs>
+          <w:tab w:val="num" w:pos="1080"/>
+        </w:tabs>
+        <w:ind w:left="1080" w:hanging="360"/>
+      </w:pPr>
+      <w:rPr>
+        <w:rFonts w:ascii="OpenSymbol" w:hAnsi="OpenSymbol" w:cs="OpenSymbol" w:hint="default"/>
+      </w:rPr>
+    </w:lvl>
+    <w:lvl w:ilvl="2">
+      <w:start w:val="1"/>
+      <w:numFmt w:val="bullet"/>
+      <w:lvlText w:val="▪"/>
+      <w:lvlJc w:val="left"/>
+      <w:pPr>
+        <w:tabs>
+          <w:tab w:val="num" w:pos="1440"/>
+        </w:tabs>
+        <w:ind w:left="1440" w:hanging="360"/>
+      </w:pPr>
+      <w:rPr>
+        <w:rFonts w:ascii="OpenSymbol" w:hAnsi="OpenSymbol" w:cs="OpenSymbol" w:hint="default"/>
+      </w:rPr>
+    </w:lvl>
+    <w:lvl w:ilvl="3">
+      <w:start w:val="1"/>
+      <w:numFmt w:val="bullet"/>
+      <w:lvlText w:val=""/>
+      <w:lvlJc w:val="left"/>
+      <w:pPr>
+        <w:tabs>
+          <w:tab w:val="num" w:pos="1800"/>
+        </w:tabs>
+        <w:ind w:left="1800" w:hanging="360"/>
+      </w:pPr>
+      <w:rPr>
+        <w:rFonts w:ascii="Symbol" w:hAnsi="Symbol" w:cs="Symbol" w:hint="default"/>
+      </w:rPr>
+    </w:lvl>
+    <w:lvl w:ilvl="4">
+      <w:start w:val="1"/>
+      <w:numFmt w:val="bullet"/>
+      <w:lvlText w:val="◦"/>
+      <w:lvlJc w:val="left"/>
+      <w:pPr>
+        <w:tabs>
+          <w:tab w:val="num" w:pos="2160"/>
+        </w:tabs>
+        <w:ind w:left="2160" w:hanging="360"/>
+      </w:pPr>
+      <w:rPr>
+        <w:rFonts w:ascii="OpenSymbol" w:hAnsi="OpenSymbol" w:cs="OpenSymbol" w:hint="default"/>
+      </w:rPr>
+    </w:lvl>
+    <w:lvl w:ilvl="5">
+      <w:start w:val="1"/>
+      <w:numFmt w:val="bullet"/>
+      <w:lvlText w:val="▪"/>
+      <w:lvlJc w:val="left"/>
+      <w:pPr>
+        <w:tabs>
+          <w:tab w:val="num" w:pos="2520"/>
+        </w:tabs>
+        <w:ind w:left="2520" w:hanging="360"/>
+      </w:pPr>
+      <w:rPr>
+        <w:rFonts w:ascii="OpenSymbol" w:hAnsi="OpenSymbol" w:cs="OpenSymbol" w:hint="default"/>
+      </w:rPr>
+    </w:lvl>
+    <w:lvl w:ilvl="6">
+      <w:start w:val="1"/>
+      <w:numFmt w:val="bullet"/>
+      <w:lvlText w:val=""/>
+      <w:lvlJc w:val="left"/>
+      <w:pPr>
+        <w:tabs>
+          <w:tab w:val="num" w:pos="2880"/>
+        </w:tabs>
+        <w:ind w:left="2880" w:hanging="360"/>
+      </w:pPr>
+      <w:rPr>
+        <w:rFonts w:ascii="Symbol" w:hAnsi="Symbol" w:cs="Symbol" w:hint="default"/>
+      </w:rPr>
+    </w:lvl>
+    <w:lvl w:ilvl="7">
+      <w:start w:val="1"/>
+      <w:numFmt w:val="bullet"/>
+      <w:lvlText w:val="◦"/>
+      <w:lvlJc w:val="left"/>
+      <w:pPr>
+        <w:tabs>
+          <w:tab w:val="num" w:pos="3240"/>
+        </w:tabs>
+        <w:ind w:left="3240" w:hanging="360"/>
+      </w:pPr>
+      <w:rPr>
+        <w:rFonts w:ascii="OpenSymbol" w:hAnsi="OpenSymbol" w:cs="OpenSymbol" w:hint="default"/>
+      </w:rPr>
+    </w:lvl>
+    <w:lvl w:ilvl="8">
+      <w:start w:val="1"/>
+      <w:numFmt w:val="bullet"/>
+      <w:lvlText w:val="▪"/>
+      <w:lvlJc w:val="left"/>
+      <w:pPr>
+        <w:tabs>
+          <w:tab w:val="num" w:pos="3600"/>
+        </w:tabs>
+        <w:ind w:left="3600" w:hanging="360"/>
+      </w:pPr>
+      <w:rPr>
+        <w:rFonts w:ascii="OpenSymbol" w:hAnsi="OpenSymbol" w:cs="OpenSymbol" w:hint="default"/>
+      </w:rPr>
+    </w:lvl>
+  </w:abstractNum>
+  <w:abstractNum w:abstractNumId="3">
+    <w:lvl w:ilvl="0">
+      <w:start w:val="1"/>
+      <w:numFmt w:val="bullet"/>
+      <w:lvlText w:val=""/>
+      <w:lvlJc w:val="left"/>
+      <w:pPr>
+        <w:tabs>
+          <w:tab w:val="num" w:pos="720"/>
+        </w:tabs>
+        <w:ind w:left="720" w:hanging="360"/>
+      </w:pPr>
+      <w:rPr>
+        <w:rFonts w:ascii="Symbol" w:hAnsi="Symbol" w:cs="Symbol" w:hint="default"/>
+      </w:rPr>
+    </w:lvl>
+    <w:lvl w:ilvl="1">
+      <w:start w:val="1"/>
+      <w:numFmt w:val="bullet"/>
+      <w:lvlText w:val="◦"/>
+      <w:lvlJc w:val="left"/>
+      <w:pPr>
+        <w:tabs>
+          <w:tab w:val="num" w:pos="1080"/>
+        </w:tabs>
+        <w:ind w:left="1080" w:hanging="360"/>
+      </w:pPr>
+      <w:rPr>
+        <w:rFonts w:ascii="OpenSymbol" w:hAnsi="OpenSymbol" w:cs="OpenSymbol" w:hint="default"/>
+      </w:rPr>
+    </w:lvl>
+    <w:lvl w:ilvl="2">
+      <w:start w:val="1"/>
+      <w:numFmt w:val="bullet"/>
+      <w:lvlText w:val="▪"/>
+      <w:lvlJc w:val="left"/>
+      <w:pPr>
+        <w:tabs>
+          <w:tab w:val="num" w:pos="1440"/>
+        </w:tabs>
+        <w:ind w:left="1440" w:hanging="360"/>
+      </w:pPr>
+      <w:rPr>
+        <w:rFonts w:ascii="OpenSymbol" w:hAnsi="OpenSymbol" w:cs="OpenSymbol" w:hint="default"/>
+      </w:rPr>
+    </w:lvl>
+    <w:lvl w:ilvl="3">
+      <w:start w:val="1"/>
+      <w:numFmt w:val="bullet"/>
+      <w:lvlText w:val=""/>
+      <w:lvlJc w:val="left"/>
+      <w:pPr>
+        <w:tabs>
+          <w:tab w:val="num" w:pos="1800"/>
+        </w:tabs>
+        <w:ind w:left="1800" w:hanging="360"/>
+      </w:pPr>
+      <w:rPr>
+        <w:rFonts w:ascii="Symbol" w:hAnsi="Symbol" w:cs="Symbol" w:hint="default"/>
+      </w:rPr>
+    </w:lvl>
+    <w:lvl w:ilvl="4">
+      <w:start w:val="1"/>
+      <w:numFmt w:val="bullet"/>
+      <w:lvlText w:val="◦"/>
+      <w:lvlJc w:val="left"/>
+      <w:pPr>
+        <w:tabs>
+          <w:tab w:val="num" w:pos="2160"/>
+        </w:tabs>
+        <w:ind w:left="2160" w:hanging="360"/>
+      </w:pPr>
+      <w:rPr>
+        <w:rFonts w:ascii="OpenSymbol" w:hAnsi="OpenSymbol" w:cs="OpenSymbol" w:hint="default"/>
+      </w:rPr>
+    </w:lvl>
+    <w:lvl w:ilvl="5">
+      <w:start w:val="1"/>
+      <w:numFmt w:val="bullet"/>
+      <w:lvlText w:val="▪"/>
+      <w:lvlJc w:val="left"/>
+      <w:pPr>
+        <w:tabs>
+          <w:tab w:val="num" w:pos="2520"/>
+        </w:tabs>
+        <w:ind w:left="2520" w:hanging="360"/>
+      </w:pPr>
+      <w:rPr>
+        <w:rFonts w:ascii="OpenSymbol" w:hAnsi="OpenSymbol" w:cs="OpenSymbol" w:hint="default"/>
+      </w:rPr>
+    </w:lvl>
+    <w:lvl w:ilvl="6">
+      <w:start w:val="1"/>
+      <w:numFmt w:val="bullet"/>
+      <w:lvlText w:val=""/>
+      <w:lvlJc w:val="left"/>
+      <w:pPr>
+        <w:tabs>
+          <w:tab w:val="num" w:pos="2880"/>
+        </w:tabs>
+        <w:ind w:left="2880" w:hanging="360"/>
+      </w:pPr>
+      <w:rPr>
+        <w:rFonts w:ascii="Symbol" w:hAnsi="Symbol" w:cs="Symbol" w:hint="default"/>
+      </w:rPr>
+    </w:lvl>
+    <w:lvl w:ilvl="7">
+      <w:start w:val="1"/>
+      <w:numFmt w:val="bullet"/>
+      <w:lvlText w:val="◦"/>
+      <w:lvlJc w:val="left"/>
+      <w:pPr>
+        <w:tabs>
+          <w:tab w:val="num" w:pos="3240"/>
+        </w:tabs>
+        <w:ind w:left="3240" w:hanging="360"/>
+      </w:pPr>
+      <w:rPr>
+        <w:rFonts w:ascii="OpenSymbol" w:hAnsi="OpenSymbol" w:cs="OpenSymbol" w:hint="default"/>
+      </w:rPr>
+    </w:lvl>
+    <w:lvl w:ilvl="8">
+      <w:start w:val="1"/>
+      <w:numFmt w:val="bullet"/>
+      <w:lvlText w:val="▪"/>
+      <w:lvlJc w:val="left"/>
+      <w:pPr>
+        <w:tabs>
+          <w:tab w:val="num" w:pos="3600"/>
+        </w:tabs>
+        <w:ind w:left="3600" w:hanging="360"/>
+      </w:pPr>
+      <w:rPr>
+        <w:rFonts w:ascii="OpenSymbol" w:hAnsi="OpenSymbol" w:cs="OpenSymbol" w:hint="default"/>
+      </w:rPr>
+    </w:lvl>
+  </w:abstractNum>
+  <w:abstractNum w:abstractNumId="4">
+    <w:lvl w:ilvl="0">
+      <w:start w:val="1"/>
+      <w:numFmt w:val="bullet"/>
+      <w:lvlText w:val=""/>
+      <w:lvlJc w:val="left"/>
+      <w:pPr>
+        <w:tabs>
+          <w:tab w:val="num" w:pos="720"/>
+        </w:tabs>
+        <w:ind w:left="720" w:hanging="360"/>
+      </w:pPr>
+      <w:rPr>
+        <w:rFonts w:ascii="Symbol" w:hAnsi="Symbol" w:cs="Symbol" w:hint="default"/>
+      </w:rPr>
+    </w:lvl>
+    <w:lvl w:ilvl="1">
+      <w:start w:val="1"/>
+      <w:numFmt w:val="bullet"/>
+      <w:lvlText w:val="◦"/>
+      <w:lvlJc w:val="left"/>
+      <w:pPr>
+        <w:tabs>
+          <w:tab w:val="num" w:pos="1080"/>
+        </w:tabs>
+        <w:ind w:left="1080" w:hanging="360"/>
+      </w:pPr>
+      <w:rPr>
+        <w:rFonts w:ascii="OpenSymbol" w:hAnsi="OpenSymbol" w:cs="OpenSymbol" w:hint="default"/>
+      </w:rPr>
+    </w:lvl>
+    <w:lvl w:ilvl="2">
+      <w:start w:val="1"/>
+      <w:numFmt w:val="bullet"/>
+      <w:lvlText w:val="▪"/>
+      <w:lvlJc w:val="left"/>
+      <w:pPr>
+        <w:tabs>
+          <w:tab w:val="num" w:pos="1440"/>
+        </w:tabs>
+        <w:ind w:left="1440" w:hanging="360"/>
+      </w:pPr>
+      <w:rPr>
+        <w:rFonts w:ascii="OpenSymbol" w:hAnsi="OpenSymbol" w:cs="OpenSymbol" w:hint="default"/>
+      </w:rPr>
+    </w:lvl>
+    <w:lvl w:ilvl="3">
+      <w:start w:val="1"/>
+      <w:numFmt w:val="bullet"/>
+      <w:lvlText w:val=""/>
+      <w:lvlJc w:val="left"/>
+      <w:pPr>
+        <w:tabs>
+          <w:tab w:val="num" w:pos="1800"/>
+        </w:tabs>
+        <w:ind w:left="1800" w:hanging="360"/>
+      </w:pPr>
+      <w:rPr>
+        <w:rFonts w:ascii="Symbol" w:hAnsi="Symbol" w:cs="Symbol" w:hint="default"/>
+      </w:rPr>
+    </w:lvl>
+    <w:lvl w:ilvl="4">
+      <w:start w:val="1"/>
+      <w:numFmt w:val="bullet"/>
+      <w:lvlText w:val="◦"/>
+      <w:lvlJc w:val="left"/>
+      <w:pPr>
+        <w:tabs>
+          <w:tab w:val="num" w:pos="2160"/>
+        </w:tabs>
+        <w:ind w:left="2160" w:hanging="360"/>
+      </w:pPr>
+      <w:rPr>
+        <w:rFonts w:ascii="OpenSymbol" w:hAnsi="OpenSymbol" w:cs="OpenSymbol" w:hint="default"/>
+      </w:rPr>
+    </w:lvl>
+    <w:lvl w:ilvl="5">
+      <w:start w:val="1"/>
+      <w:numFmt w:val="bullet"/>
+      <w:lvlText w:val="▪"/>
+      <w:lvlJc w:val="left"/>
+      <w:pPr>
+        <w:tabs>
+          <w:tab w:val="num" w:pos="2520"/>
+        </w:tabs>
+        <w:ind w:left="2520" w:hanging="360"/>
+      </w:pPr>
+      <w:rPr>
+        <w:rFonts w:ascii="OpenSymbol" w:hAnsi="OpenSymbol" w:cs="OpenSymbol" w:hint="default"/>
+      </w:rPr>
+    </w:lvl>
+    <w:lvl w:ilvl="6">
+      <w:start w:val="1"/>
+      <w:numFmt w:val="bullet"/>
+      <w:lvlText w:val=""/>
+      <w:lvlJc w:val="left"/>
+      <w:pPr>
+        <w:tabs>
+          <w:tab w:val="num" w:pos="2880"/>
+        </w:tabs>
+        <w:ind w:left="2880" w:hanging="360"/>
+      </w:pPr>
+      <w:rPr>
+        <w:rFonts w:ascii="Symbol" w:hAnsi="Symbol" w:cs="Symbol" w:hint="default"/>
+      </w:rPr>
+    </w:lvl>
+    <w:lvl w:ilvl="7">
+      <w:start w:val="1"/>
+      <w:numFmt w:val="bullet"/>
+      <w:lvlText w:val="◦"/>
+      <w:lvlJc w:val="left"/>
+      <w:pPr>
+        <w:tabs>
+          <w:tab w:val="num" w:pos="3240"/>
+        </w:tabs>
+        <w:ind w:left="3240" w:hanging="360"/>
+      </w:pPr>
+      <w:rPr>
+        <w:rFonts w:ascii="OpenSymbol" w:hAnsi="OpenSymbol" w:cs="OpenSymbol" w:hint="default"/>
+      </w:rPr>
+    </w:lvl>
+    <w:lvl w:ilvl="8">
+      <w:start w:val="1"/>
+      <w:numFmt w:val="bullet"/>
+      <w:lvlText w:val="▪"/>
+      <w:lvlJc w:val="left"/>
+      <w:pPr>
+        <w:tabs>
+          <w:tab w:val="num" w:pos="3600"/>
+        </w:tabs>
+        <w:ind w:left="3600" w:hanging="360"/>
+      </w:pPr>
+      <w:rPr>
+        <w:rFonts w:ascii="OpenSymbol" w:hAnsi="OpenSymbol" w:cs="OpenSymbol" w:hint="default"/>
+      </w:rPr>
+    </w:lvl>
+  </w:abstractNum>
+  <w:abstractNum w:abstractNumId="5">
+    <w:lvl w:ilvl="0">
+      <w:start w:val="1"/>
+      <w:numFmt w:val="bullet"/>
+      <w:lvlText w:val=""/>
+      <w:lvlJc w:val="left"/>
+      <w:pPr>
+        <w:tabs>
+          <w:tab w:val="num" w:pos="720"/>
+        </w:tabs>
+        <w:ind w:left="720" w:hanging="360"/>
+      </w:pPr>
+      <w:rPr>
+        <w:rFonts w:ascii="Symbol" w:hAnsi="Symbol" w:cs="Symbol" w:hint="default"/>
+      </w:rPr>
+    </w:lvl>
+    <w:lvl w:ilvl="1">
+      <w:start w:val="1"/>
+      <w:numFmt w:val="bullet"/>
+      <w:lvlText w:val="◦"/>
+      <w:lvlJc w:val="left"/>
+      <w:pPr>
+        <w:tabs>
+          <w:tab w:val="num" w:pos="1080"/>
+        </w:tabs>
+        <w:ind w:left="1080" w:hanging="360"/>
+      </w:pPr>
+      <w:rPr>
+        <w:rFonts w:ascii="OpenSymbol" w:hAnsi="OpenSymbol" w:cs="OpenSymbol" w:hint="default"/>
+      </w:rPr>
+    </w:lvl>
+    <w:lvl w:ilvl="2">
+      <w:start w:val="1"/>
+      <w:numFmt w:val="bullet"/>
+      <w:lvlText w:val="▪"/>
+      <w:lvlJc w:val="left"/>
+      <w:pPr>
+        <w:tabs>
+          <w:tab w:val="num" w:pos="1440"/>
+        </w:tabs>
+        <w:ind w:left="1440" w:hanging="360"/>
+      </w:pPr>
+      <w:rPr>
+        <w:rFonts w:ascii="OpenSymbol" w:hAnsi="OpenSymbol" w:cs="OpenSymbol" w:hint="default"/>
+      </w:rPr>
+    </w:lvl>
+    <w:lvl w:ilvl="3">
+      <w:start w:val="1"/>
+      <w:numFmt w:val="bullet"/>
+      <w:lvlText w:val=""/>
+      <w:lvlJc w:val="left"/>
+      <w:pPr>
+        <w:tabs>
+          <w:tab w:val="num" w:pos="1800"/>
+        </w:tabs>
+        <w:ind w:left="1800" w:hanging="360"/>
+      </w:pPr>
+      <w:rPr>
+        <w:rFonts w:ascii="Symbol" w:hAnsi="Symbol" w:cs="Symbol" w:hint="default"/>
+      </w:rPr>
+    </w:lvl>
+    <w:lvl w:ilvl="4">
+      <w:start w:val="1"/>
+      <w:numFmt w:val="bullet"/>
+      <w:lvlText w:val="◦"/>
+      <w:lvlJc w:val="left"/>
+      <w:pPr>
+        <w:tabs>
+          <w:tab w:val="num" w:pos="2160"/>
+        </w:tabs>
+        <w:ind w:left="2160" w:hanging="360"/>
+      </w:pPr>
+      <w:rPr>
+        <w:rFonts w:ascii="OpenSymbol" w:hAnsi="OpenSymbol" w:cs="OpenSymbol" w:hint="default"/>
+      </w:rPr>
+    </w:lvl>
+    <w:lvl w:ilvl="5">
+      <w:start w:val="1"/>
+      <w:numFmt w:val="bullet"/>
+      <w:lvlText w:val="▪"/>
+      <w:lvlJc w:val="left"/>
+      <w:pPr>
+        <w:tabs>
+          <w:tab w:val="num" w:pos="2520"/>
+        </w:tabs>
+        <w:ind w:left="2520" w:hanging="360"/>
+      </w:pPr>
+      <w:rPr>
+        <w:rFonts w:ascii="OpenSymbol" w:hAnsi="OpenSymbol" w:cs="OpenSymbol" w:hint="default"/>
+      </w:rPr>
+    </w:lvl>
+    <w:lvl w:ilvl="6">
+      <w:start w:val="1"/>
+      <w:numFmt w:val="bullet"/>
+      <w:lvlText w:val=""/>
+      <w:lvlJc w:val="left"/>
+      <w:pPr>
+        <w:tabs>
+          <w:tab w:val="num" w:pos="2880"/>
+        </w:tabs>
+        <w:ind w:left="2880" w:hanging="360"/>
+      </w:pPr>
+      <w:rPr>
+        <w:rFonts w:ascii="Symbol" w:hAnsi="Symbol" w:cs="Symbol" w:hint="default"/>
+      </w:rPr>
+    </w:lvl>
+    <w:lvl w:ilvl="7">
+      <w:start w:val="1"/>
+      <w:numFmt w:val="bullet"/>
+      <w:lvlText w:val="◦"/>
+      <w:lvlJc w:val="left"/>
+      <w:pPr>
+        <w:tabs>
+          <w:tab w:val="num" w:pos="3240"/>
+        </w:tabs>
+        <w:ind w:left="3240" w:hanging="360"/>
+      </w:pPr>
+      <w:rPr>
+        <w:rFonts w:ascii="OpenSymbol" w:hAnsi="OpenSymbol" w:cs="OpenSymbol" w:hint="default"/>
+      </w:rPr>
+    </w:lvl>
+    <w:lvl w:ilvl="8">
+      <w:start w:val="1"/>
+      <w:numFmt w:val="bullet"/>
+      <w:lvlText w:val="▪"/>
+      <w:lvlJc w:val="left"/>
+      <w:pPr>
+        <w:tabs>
+          <w:tab w:val="num" w:pos="3600"/>
+        </w:tabs>
+        <w:ind w:left="3600" w:hanging="360"/>
+      </w:pPr>
+      <w:rPr>
+        <w:rFonts w:ascii="OpenSymbol" w:hAnsi="OpenSymbol" w:cs="OpenSymbol" w:hint="default"/>
+      </w:rPr>
+    </w:lvl>
+  </w:abstractNum>
+  <w:abstractNum w:abstractNumId="6">
+    <w:lvl w:ilvl="0">
       <w:start w:val="1"/>
       <w:numFmt w:val="decimal"/>
       <w:lvlText w:val="%1."/>
       <w:lvlJc w:val="left"/>
       <w:pPr>
         <w:tabs>
-          <w:tab w:val="num" w:pos="0"/>
-        </w:tabs>
-        <w:ind w:left="720" w:hanging="480"/>
+          <w:tab w:val="num" w:pos="720"/>
+        </w:tabs>
+        <w:ind w:left="720" w:hanging="360"/>
       </w:pPr>
       <w:rPr/>
     </w:lvl>
@@ -7568,9 +8371,9 @@
       <w:lvlJc w:val="left"/>
       <w:pPr>
         <w:tabs>
-          <w:tab w:val="num" w:pos="0"/>
-        </w:tabs>
-        <w:ind w:left="1440" w:hanging="480"/>
+          <w:tab w:val="num" w:pos="1080"/>
+        </w:tabs>
+        <w:ind w:left="1080" w:hanging="360"/>
       </w:pPr>
       <w:rPr/>
     </w:lvl>
@@ -7581,9 +8384,9 @@
       <w:lvlJc w:val="left"/>
       <w:pPr>
         <w:tabs>
-          <w:tab w:val="num" w:pos="0"/>
-        </w:tabs>
-        <w:ind w:left="2160" w:hanging="480"/>
+          <w:tab w:val="num" w:pos="1440"/>
+        </w:tabs>
+        <w:ind w:left="1440" w:hanging="360"/>
       </w:pPr>
       <w:rPr/>
     </w:lvl>
@@ -7594,9 +8397,9 @@
       <w:lvlJc w:val="left"/>
       <w:pPr>
         <w:tabs>
-          <w:tab w:val="num" w:pos="0"/>
-        </w:tabs>
-        <w:ind w:left="2880" w:hanging="480"/>
+          <w:tab w:val="num" w:pos="1800"/>
+        </w:tabs>
+        <w:ind w:left="1800" w:hanging="360"/>
       </w:pPr>
       <w:rPr/>
     </w:lvl>
@@ -7607,9 +8410,9 @@
       <w:lvlJc w:val="left"/>
       <w:pPr>
         <w:tabs>
-          <w:tab w:val="num" w:pos="0"/>
-        </w:tabs>
-        <w:ind w:left="3600" w:hanging="480"/>
+          <w:tab w:val="num" w:pos="2160"/>
+        </w:tabs>
+        <w:ind w:left="2160" w:hanging="360"/>
       </w:pPr>
       <w:rPr/>
     </w:lvl>
@@ -7620,9 +8423,9 @@
       <w:lvlJc w:val="left"/>
       <w:pPr>
         <w:tabs>
-          <w:tab w:val="num" w:pos="0"/>
-        </w:tabs>
-        <w:ind w:left="4320" w:hanging="480"/>
+          <w:tab w:val="num" w:pos="2520"/>
+        </w:tabs>
+        <w:ind w:left="2520" w:hanging="360"/>
       </w:pPr>
       <w:rPr/>
     </w:lvl>
@@ -7633,9 +8436,9 @@
       <w:lvlJc w:val="left"/>
       <w:pPr>
         <w:tabs>
-          <w:tab w:val="num" w:pos="0"/>
-        </w:tabs>
-        <w:ind w:left="5040" w:hanging="480"/>
+          <w:tab w:val="num" w:pos="2880"/>
+        </w:tabs>
+        <w:ind w:left="2880" w:hanging="360"/>
       </w:pPr>
       <w:rPr/>
     </w:lvl>
@@ -7646,9 +8449,9 @@
       <w:lvlJc w:val="left"/>
       <w:pPr>
         <w:tabs>
-          <w:tab w:val="num" w:pos="0"/>
-        </w:tabs>
-        <w:ind w:left="5760" w:hanging="480"/>
+          <w:tab w:val="num" w:pos="3240"/>
+        </w:tabs>
+        <w:ind w:left="3240" w:hanging="360"/>
       </w:pPr>
       <w:rPr/>
     </w:lvl>
@@ -7659,980 +8462,422 @@
       <w:lvlJc w:val="left"/>
       <w:pPr>
         <w:tabs>
-          <w:tab w:val="num" w:pos="0"/>
-        </w:tabs>
-        <w:ind w:left="6480" w:hanging="480"/>
+          <w:tab w:val="num" w:pos="3600"/>
+        </w:tabs>
+        <w:ind w:left="3600" w:hanging="360"/>
       </w:pPr>
       <w:rPr/>
     </w:lvl>
   </w:abstractNum>
-  <w:abstractNum w:abstractNumId="2">
+  <w:abstractNum w:abstractNumId="7">
     <w:lvl w:ilvl="0">
-      <w:start w:val="4"/>
-      <w:numFmt w:val="decimal"/>
-      <w:lvlText w:val="%1."/>
-      <w:lvlJc w:val="left"/>
-      <w:pPr>
-        <w:tabs>
-          <w:tab w:val="num" w:pos="0"/>
-        </w:tabs>
-        <w:ind w:left="720" w:hanging="480"/>
-      </w:pPr>
-      <w:rPr/>
-    </w:lvl>
-    <w:lvl w:ilvl="1">
-      <w:start w:val="4"/>
-      <w:numFmt w:val="decimal"/>
-      <w:lvlText w:val="%2."/>
-      <w:lvlJc w:val="left"/>
-      <w:pPr>
-        <w:tabs>
-          <w:tab w:val="num" w:pos="0"/>
-        </w:tabs>
-        <w:ind w:left="1440" w:hanging="480"/>
-      </w:pPr>
-      <w:rPr/>
-    </w:lvl>
-    <w:lvl w:ilvl="2">
-      <w:start w:val="4"/>
-      <w:numFmt w:val="decimal"/>
-      <w:lvlText w:val="%3."/>
-      <w:lvlJc w:val="left"/>
-      <w:pPr>
-        <w:tabs>
-          <w:tab w:val="num" w:pos="0"/>
-        </w:tabs>
-        <w:ind w:left="2160" w:hanging="480"/>
-      </w:pPr>
-      <w:rPr/>
-    </w:lvl>
-    <w:lvl w:ilvl="3">
-      <w:start w:val="4"/>
-      <w:numFmt w:val="decimal"/>
-      <w:lvlText w:val="%4."/>
-      <w:lvlJc w:val="left"/>
-      <w:pPr>
-        <w:tabs>
-          <w:tab w:val="num" w:pos="0"/>
-        </w:tabs>
-        <w:ind w:left="2880" w:hanging="480"/>
-      </w:pPr>
-      <w:rPr/>
-    </w:lvl>
-    <w:lvl w:ilvl="4">
-      <w:start w:val="4"/>
-      <w:numFmt w:val="decimal"/>
-      <w:lvlText w:val="%5."/>
-      <w:lvlJc w:val="left"/>
-      <w:pPr>
-        <w:tabs>
-          <w:tab w:val="num" w:pos="0"/>
-        </w:tabs>
-        <w:ind w:left="3600" w:hanging="480"/>
-      </w:pPr>
-      <w:rPr/>
-    </w:lvl>
-    <w:lvl w:ilvl="5">
-      <w:start w:val="4"/>
-      <w:numFmt w:val="decimal"/>
-      <w:lvlText w:val="%6."/>
-      <w:lvlJc w:val="left"/>
-      <w:pPr>
-        <w:tabs>
-          <w:tab w:val="num" w:pos="0"/>
-        </w:tabs>
-        <w:ind w:left="4320" w:hanging="480"/>
-      </w:pPr>
-      <w:rPr/>
-    </w:lvl>
-    <w:lvl w:ilvl="6">
-      <w:start w:val="4"/>
-      <w:numFmt w:val="decimal"/>
-      <w:lvlText w:val="%7."/>
-      <w:lvlJc w:val="left"/>
-      <w:pPr>
-        <w:tabs>
-          <w:tab w:val="num" w:pos="0"/>
-        </w:tabs>
-        <w:ind w:left="5040" w:hanging="480"/>
-      </w:pPr>
-      <w:rPr/>
-    </w:lvl>
-    <w:lvl w:ilvl="7">
-      <w:start w:val="4"/>
-      <w:numFmt w:val="decimal"/>
-      <w:lvlText w:val="%8."/>
-      <w:lvlJc w:val="left"/>
-      <w:pPr>
-        <w:tabs>
-          <w:tab w:val="num" w:pos="0"/>
-        </w:tabs>
-        <w:ind w:left="5760" w:hanging="480"/>
-      </w:pPr>
-      <w:rPr/>
-    </w:lvl>
-    <w:lvl w:ilvl="8">
-      <w:start w:val="4"/>
-      <w:numFmt w:val="decimal"/>
-      <w:lvlText w:val="%9."/>
-      <w:lvlJc w:val="left"/>
-      <w:pPr>
-        <w:tabs>
-          <w:tab w:val="num" w:pos="0"/>
-        </w:tabs>
-        <w:ind w:left="6480" w:hanging="480"/>
-      </w:pPr>
-      <w:rPr/>
-    </w:lvl>
-  </w:abstractNum>
-  <w:abstractNum w:abstractNumId="3">
-    <w:lvl w:ilvl="0">
+      <w:start w:val="1"/>
       <w:numFmt w:val="bullet"/>
       <w:lvlText w:val=""/>
       <w:lvlJc w:val="left"/>
       <w:pPr>
         <w:tabs>
-          <w:tab w:val="num" w:pos="0"/>
-        </w:tabs>
-        <w:ind w:left="720" w:hanging="480"/>
+          <w:tab w:val="num" w:pos="720"/>
+        </w:tabs>
+        <w:ind w:left="720" w:hanging="360"/>
       </w:pPr>
       <w:rPr>
         <w:rFonts w:ascii="Symbol" w:hAnsi="Symbol" w:cs="Symbol" w:hint="default"/>
       </w:rPr>
     </w:lvl>
     <w:lvl w:ilvl="1">
-      <w:start w:val="0"/>
+      <w:start w:val="1"/>
       <w:numFmt w:val="bullet"/>
-      <w:lvlText w:val=""/>
-      <w:lvlJc w:val="left"/>
-      <w:pPr>
-        <w:tabs>
-          <w:tab w:val="num" w:pos="0"/>
-        </w:tabs>
-        <w:ind w:left="1440" w:hanging="480"/>
+      <w:lvlText w:val="◦"/>
+      <w:lvlJc w:val="left"/>
+      <w:pPr>
+        <w:tabs>
+          <w:tab w:val="num" w:pos="1080"/>
+        </w:tabs>
+        <w:ind w:left="1080" w:hanging="360"/>
+      </w:pPr>
+      <w:rPr>
+        <w:rFonts w:ascii="OpenSymbol" w:hAnsi="OpenSymbol" w:cs="OpenSymbol" w:hint="default"/>
+      </w:rPr>
+    </w:lvl>
+    <w:lvl w:ilvl="2">
+      <w:start w:val="1"/>
+      <w:numFmt w:val="bullet"/>
+      <w:lvlText w:val="▪"/>
+      <w:lvlJc w:val="left"/>
+      <w:pPr>
+        <w:tabs>
+          <w:tab w:val="num" w:pos="1440"/>
+        </w:tabs>
+        <w:ind w:left="1440" w:hanging="360"/>
+      </w:pPr>
+      <w:rPr>
+        <w:rFonts w:ascii="OpenSymbol" w:hAnsi="OpenSymbol" w:cs="OpenSymbol" w:hint="default"/>
+      </w:rPr>
+    </w:lvl>
+    <w:lvl w:ilvl="3">
+      <w:start w:val="1"/>
+      <w:numFmt w:val="bullet"/>
+      <w:lvlText w:val=""/>
+      <w:lvlJc w:val="left"/>
+      <w:pPr>
+        <w:tabs>
+          <w:tab w:val="num" w:pos="1800"/>
+        </w:tabs>
+        <w:ind w:left="1800" w:hanging="360"/>
       </w:pPr>
       <w:rPr>
         <w:rFonts w:ascii="Symbol" w:hAnsi="Symbol" w:cs="Symbol" w:hint="default"/>
       </w:rPr>
     </w:lvl>
-    <w:lvl w:ilvl="2">
-      <w:start w:val="0"/>
+    <w:lvl w:ilvl="4">
+      <w:start w:val="1"/>
+      <w:numFmt w:val="bullet"/>
+      <w:lvlText w:val="◦"/>
+      <w:lvlJc w:val="left"/>
+      <w:pPr>
+        <w:tabs>
+          <w:tab w:val="num" w:pos="2160"/>
+        </w:tabs>
+        <w:ind w:left="2160" w:hanging="360"/>
+      </w:pPr>
+      <w:rPr>
+        <w:rFonts w:ascii="OpenSymbol" w:hAnsi="OpenSymbol" w:cs="OpenSymbol" w:hint="default"/>
+      </w:rPr>
+    </w:lvl>
+    <w:lvl w:ilvl="5">
+      <w:start w:val="1"/>
+      <w:numFmt w:val="bullet"/>
+      <w:lvlText w:val="▪"/>
+      <w:lvlJc w:val="left"/>
+      <w:pPr>
+        <w:tabs>
+          <w:tab w:val="num" w:pos="2520"/>
+        </w:tabs>
+        <w:ind w:left="2520" w:hanging="360"/>
+      </w:pPr>
+      <w:rPr>
+        <w:rFonts w:ascii="OpenSymbol" w:hAnsi="OpenSymbol" w:cs="OpenSymbol" w:hint="default"/>
+      </w:rPr>
+    </w:lvl>
+    <w:lvl w:ilvl="6">
+      <w:start w:val="1"/>
       <w:numFmt w:val="bullet"/>
       <w:lvlText w:val=""/>
       <w:lvlJc w:val="left"/>
       <w:pPr>
         <w:tabs>
-          <w:tab w:val="num" w:pos="0"/>
-        </w:tabs>
-        <w:ind w:left="2160" w:hanging="480"/>
+          <w:tab w:val="num" w:pos="2880"/>
+        </w:tabs>
+        <w:ind w:left="2880" w:hanging="360"/>
       </w:pPr>
       <w:rPr>
         <w:rFonts w:ascii="Symbol" w:hAnsi="Symbol" w:cs="Symbol" w:hint="default"/>
       </w:rPr>
     </w:lvl>
-    <w:lvl w:ilvl="3">
-      <w:start w:val="0"/>
+    <w:lvl w:ilvl="7">
+      <w:start w:val="1"/>
       <w:numFmt w:val="bullet"/>
-      <w:lvlText w:val=""/>
-      <w:lvlJc w:val="left"/>
-      <w:pPr>
-        <w:tabs>
-          <w:tab w:val="num" w:pos="0"/>
-        </w:tabs>
-        <w:ind w:left="2880" w:hanging="480"/>
+      <w:lvlText w:val="◦"/>
+      <w:lvlJc w:val="left"/>
+      <w:pPr>
+        <w:tabs>
+          <w:tab w:val="num" w:pos="3240"/>
+        </w:tabs>
+        <w:ind w:left="3240" w:hanging="360"/>
+      </w:pPr>
+      <w:rPr>
+        <w:rFonts w:ascii="OpenSymbol" w:hAnsi="OpenSymbol" w:cs="OpenSymbol" w:hint="default"/>
+      </w:rPr>
+    </w:lvl>
+    <w:lvl w:ilvl="8">
+      <w:start w:val="1"/>
+      <w:numFmt w:val="bullet"/>
+      <w:lvlText w:val="▪"/>
+      <w:lvlJc w:val="left"/>
+      <w:pPr>
+        <w:tabs>
+          <w:tab w:val="num" w:pos="3600"/>
+        </w:tabs>
+        <w:ind w:left="3600" w:hanging="360"/>
+      </w:pPr>
+      <w:rPr>
+        <w:rFonts w:ascii="OpenSymbol" w:hAnsi="OpenSymbol" w:cs="OpenSymbol" w:hint="default"/>
+      </w:rPr>
+    </w:lvl>
+  </w:abstractNum>
+  <w:abstractNum w:abstractNumId="8">
+    <w:lvl w:ilvl="0">
+      <w:start w:val="1"/>
+      <w:numFmt w:val="bullet"/>
+      <w:lvlText w:val=""/>
+      <w:lvlJc w:val="left"/>
+      <w:pPr>
+        <w:tabs>
+          <w:tab w:val="num" w:pos="720"/>
+        </w:tabs>
+        <w:ind w:left="720" w:hanging="360"/>
       </w:pPr>
       <w:rPr>
         <w:rFonts w:ascii="Symbol" w:hAnsi="Symbol" w:cs="Symbol" w:hint="default"/>
       </w:rPr>
     </w:lvl>
-    <w:lvl w:ilvl="4">
-      <w:start w:val="0"/>
+    <w:lvl w:ilvl="1">
+      <w:start w:val="1"/>
+      <w:numFmt w:val="bullet"/>
+      <w:lvlText w:val="◦"/>
+      <w:lvlJc w:val="left"/>
+      <w:pPr>
+        <w:tabs>
+          <w:tab w:val="num" w:pos="1080"/>
+        </w:tabs>
+        <w:ind w:left="1080" w:hanging="360"/>
+      </w:pPr>
+      <w:rPr>
+        <w:rFonts w:ascii="OpenSymbol" w:hAnsi="OpenSymbol" w:cs="OpenSymbol" w:hint="default"/>
+      </w:rPr>
+    </w:lvl>
+    <w:lvl w:ilvl="2">
+      <w:start w:val="1"/>
+      <w:numFmt w:val="bullet"/>
+      <w:lvlText w:val="▪"/>
+      <w:lvlJc w:val="left"/>
+      <w:pPr>
+        <w:tabs>
+          <w:tab w:val="num" w:pos="1440"/>
+        </w:tabs>
+        <w:ind w:left="1440" w:hanging="360"/>
+      </w:pPr>
+      <w:rPr>
+        <w:rFonts w:ascii="OpenSymbol" w:hAnsi="OpenSymbol" w:cs="OpenSymbol" w:hint="default"/>
+      </w:rPr>
+    </w:lvl>
+    <w:lvl w:ilvl="3">
+      <w:start w:val="1"/>
       <w:numFmt w:val="bullet"/>
       <w:lvlText w:val=""/>
       <w:lvlJc w:val="left"/>
       <w:pPr>
         <w:tabs>
-          <w:tab w:val="num" w:pos="0"/>
-        </w:tabs>
-        <w:ind w:left="3600" w:hanging="480"/>
+          <w:tab w:val="num" w:pos="1800"/>
+        </w:tabs>
+        <w:ind w:left="1800" w:hanging="360"/>
       </w:pPr>
       <w:rPr>
         <w:rFonts w:ascii="Symbol" w:hAnsi="Symbol" w:cs="Symbol" w:hint="default"/>
       </w:rPr>
     </w:lvl>
+    <w:lvl w:ilvl="4">
+      <w:start w:val="1"/>
+      <w:numFmt w:val="bullet"/>
+      <w:lvlText w:val="◦"/>
+      <w:lvlJc w:val="left"/>
+      <w:pPr>
+        <w:tabs>
+          <w:tab w:val="num" w:pos="2160"/>
+        </w:tabs>
+        <w:ind w:left="2160" w:hanging="360"/>
+      </w:pPr>
+      <w:rPr>
+        <w:rFonts w:ascii="OpenSymbol" w:hAnsi="OpenSymbol" w:cs="OpenSymbol" w:hint="default"/>
+      </w:rPr>
+    </w:lvl>
     <w:lvl w:ilvl="5">
-      <w:start w:val="0"/>
+      <w:start w:val="1"/>
       <w:numFmt w:val="bullet"/>
-      <w:lvlText w:val=""/>
-      <w:lvlJc w:val="left"/>
-      <w:pPr>
-        <w:tabs>
-          <w:tab w:val="num" w:pos="0"/>
-        </w:tabs>
-        <w:ind w:left="4320" w:hanging="480"/>
+      <w:lvlText w:val="▪"/>
+      <w:lvlJc w:val="left"/>
+      <w:pPr>
+        <w:tabs>
+          <w:tab w:val="num" w:pos="2520"/>
+        </w:tabs>
+        <w:ind w:left="2520" w:hanging="360"/>
+      </w:pPr>
+      <w:rPr>
+        <w:rFonts w:ascii="OpenSymbol" w:hAnsi="OpenSymbol" w:cs="OpenSymbol" w:hint="default"/>
+      </w:rPr>
+    </w:lvl>
+    <w:lvl w:ilvl="6">
+      <w:start w:val="1"/>
+      <w:numFmt w:val="bullet"/>
+      <w:lvlText w:val=""/>
+      <w:lvlJc w:val="left"/>
+      <w:pPr>
+        <w:tabs>
+          <w:tab w:val="num" w:pos="2880"/>
+        </w:tabs>
+        <w:ind w:left="2880" w:hanging="360"/>
       </w:pPr>
       <w:rPr>
         <w:rFonts w:ascii="Symbol" w:hAnsi="Symbol" w:cs="Symbol" w:hint="default"/>
       </w:rPr>
     </w:lvl>
-    <w:lvl w:ilvl="6">
-      <w:start w:val="0"/>
-      <w:numFmt w:val="bullet"/>
-      <w:lvlText w:val=""/>
-      <w:lvlJc w:val="left"/>
-      <w:pPr>
-        <w:tabs>
-          <w:tab w:val="num" w:pos="0"/>
-        </w:tabs>
-        <w:ind w:left="5040" w:hanging="480"/>
-      </w:pPr>
-      <w:rPr>
-        <w:rFonts w:ascii="Symbol" w:hAnsi="Symbol" w:cs="Symbol" w:hint="default"/>
-      </w:rPr>
-    </w:lvl>
-    <w:lvl w:ilvl="7">
-      <w:start w:val="0"/>
-      <w:numFmt w:val="bullet"/>
-      <w:lvlText w:val=""/>
-      <w:lvlJc w:val="left"/>
-      <w:pPr>
-        <w:tabs>
-          <w:tab w:val="num" w:pos="0"/>
-        </w:tabs>
-        <w:ind w:left="5760" w:hanging="480"/>
-      </w:pPr>
-      <w:rPr>
-        <w:rFonts w:ascii="Symbol" w:hAnsi="Symbol" w:cs="Symbol" w:hint="default"/>
-      </w:rPr>
-    </w:lvl>
-    <w:lvl w:ilvl="8">
-      <w:start w:val="0"/>
-      <w:numFmt w:val="bullet"/>
-      <w:lvlText w:val=""/>
-      <w:lvlJc w:val="left"/>
-      <w:pPr>
-        <w:tabs>
-          <w:tab w:val="num" w:pos="0"/>
-        </w:tabs>
-        <w:ind w:left="6480" w:hanging="480"/>
-      </w:pPr>
-      <w:rPr>
-        <w:rFonts w:ascii="Symbol" w:hAnsi="Symbol" w:cs="Symbol" w:hint="default"/>
-      </w:rPr>
-    </w:lvl>
-  </w:abstractNum>
-  <w:abstractNum w:abstractNumId="4">
-    <w:lvl w:ilvl="0">
-      <w:start w:val="1"/>
-      <w:numFmt w:val="decimal"/>
-      <w:lvlText w:val="%1."/>
-      <w:lvlJc w:val="left"/>
-      <w:pPr>
-        <w:tabs>
-          <w:tab w:val="num" w:pos="0"/>
-        </w:tabs>
-        <w:ind w:left="720" w:hanging="480"/>
-      </w:pPr>
-      <w:rPr/>
-    </w:lvl>
-    <w:lvl w:ilvl="1">
-      <w:start w:val="1"/>
-      <w:numFmt w:val="decimal"/>
-      <w:lvlText w:val="%2."/>
-      <w:lvlJc w:val="left"/>
-      <w:pPr>
-        <w:tabs>
-          <w:tab w:val="num" w:pos="0"/>
-        </w:tabs>
-        <w:ind w:left="1440" w:hanging="480"/>
-      </w:pPr>
-      <w:rPr/>
-    </w:lvl>
-    <w:lvl w:ilvl="2">
-      <w:start w:val="1"/>
-      <w:numFmt w:val="decimal"/>
-      <w:lvlText w:val="%3."/>
-      <w:lvlJc w:val="left"/>
-      <w:pPr>
-        <w:tabs>
-          <w:tab w:val="num" w:pos="0"/>
-        </w:tabs>
-        <w:ind w:left="2160" w:hanging="480"/>
-      </w:pPr>
-      <w:rPr/>
-    </w:lvl>
-    <w:lvl w:ilvl="3">
-      <w:start w:val="1"/>
-      <w:numFmt w:val="decimal"/>
-      <w:lvlText w:val="%4."/>
-      <w:lvlJc w:val="left"/>
-      <w:pPr>
-        <w:tabs>
-          <w:tab w:val="num" w:pos="0"/>
-        </w:tabs>
-        <w:ind w:left="2880" w:hanging="480"/>
-      </w:pPr>
-      <w:rPr/>
-    </w:lvl>
-    <w:lvl w:ilvl="4">
-      <w:start w:val="1"/>
-      <w:numFmt w:val="decimal"/>
-      <w:lvlText w:val="%5."/>
-      <w:lvlJc w:val="left"/>
-      <w:pPr>
-        <w:tabs>
-          <w:tab w:val="num" w:pos="0"/>
-        </w:tabs>
-        <w:ind w:left="3600" w:hanging="480"/>
-      </w:pPr>
-      <w:rPr/>
-    </w:lvl>
-    <w:lvl w:ilvl="5">
-      <w:start w:val="1"/>
-      <w:numFmt w:val="decimal"/>
-      <w:lvlText w:val="%6."/>
-      <w:lvlJc w:val="left"/>
-      <w:pPr>
-        <w:tabs>
-          <w:tab w:val="num" w:pos="0"/>
-        </w:tabs>
-        <w:ind w:left="4320" w:hanging="480"/>
-      </w:pPr>
-      <w:rPr/>
-    </w:lvl>
-    <w:lvl w:ilvl="6">
-      <w:start w:val="1"/>
-      <w:numFmt w:val="decimal"/>
-      <w:lvlText w:val="%7."/>
-      <w:lvlJc w:val="left"/>
-      <w:pPr>
-        <w:tabs>
-          <w:tab w:val="num" w:pos="0"/>
-        </w:tabs>
-        <w:ind w:left="5040" w:hanging="480"/>
-      </w:pPr>
-      <w:rPr/>
-    </w:lvl>
     <w:lvl w:ilvl="7">
       <w:start w:val="1"/>
-      <w:numFmt w:val="decimal"/>
-      <w:lvlText w:val="%8."/>
-      <w:lvlJc w:val="left"/>
-      <w:pPr>
-        <w:tabs>
-          <w:tab w:val="num" w:pos="0"/>
-        </w:tabs>
-        <w:ind w:left="5760" w:hanging="480"/>
-      </w:pPr>
-      <w:rPr/>
+      <w:numFmt w:val="bullet"/>
+      <w:lvlText w:val="◦"/>
+      <w:lvlJc w:val="left"/>
+      <w:pPr>
+        <w:tabs>
+          <w:tab w:val="num" w:pos="3240"/>
+        </w:tabs>
+        <w:ind w:left="3240" w:hanging="360"/>
+      </w:pPr>
+      <w:rPr>
+        <w:rFonts w:ascii="OpenSymbol" w:hAnsi="OpenSymbol" w:cs="OpenSymbol" w:hint="default"/>
+      </w:rPr>
     </w:lvl>
     <w:lvl w:ilvl="8">
       <w:start w:val="1"/>
-      <w:numFmt w:val="decimal"/>
-      <w:lvlText w:val="%9."/>
-      <w:lvlJc w:val="left"/>
-      <w:pPr>
-        <w:tabs>
-          <w:tab w:val="num" w:pos="0"/>
-        </w:tabs>
-        <w:ind w:left="6480" w:hanging="480"/>
-      </w:pPr>
-      <w:rPr/>
-    </w:lvl>
-  </w:abstractNum>
-  <w:abstractNum w:abstractNumId="5">
-    <w:lvl w:ilvl="0">
-      <w:start w:val="4"/>
-      <w:numFmt w:val="decimal"/>
-      <w:lvlText w:val="%1."/>
-      <w:lvlJc w:val="left"/>
-      <w:pPr>
-        <w:tabs>
-          <w:tab w:val="num" w:pos="0"/>
-        </w:tabs>
-        <w:ind w:left="720" w:hanging="480"/>
-      </w:pPr>
-      <w:rPr/>
-    </w:lvl>
-    <w:lvl w:ilvl="1">
-      <w:start w:val="4"/>
-      <w:numFmt w:val="decimal"/>
-      <w:lvlText w:val="%2."/>
-      <w:lvlJc w:val="left"/>
-      <w:pPr>
-        <w:tabs>
-          <w:tab w:val="num" w:pos="0"/>
-        </w:tabs>
-        <w:ind w:left="1440" w:hanging="480"/>
-      </w:pPr>
-      <w:rPr/>
-    </w:lvl>
-    <w:lvl w:ilvl="2">
-      <w:start w:val="4"/>
-      <w:numFmt w:val="decimal"/>
-      <w:lvlText w:val="%3."/>
-      <w:lvlJc w:val="left"/>
-      <w:pPr>
-        <w:tabs>
-          <w:tab w:val="num" w:pos="0"/>
-        </w:tabs>
-        <w:ind w:left="2160" w:hanging="480"/>
-      </w:pPr>
-      <w:rPr/>
-    </w:lvl>
-    <w:lvl w:ilvl="3">
-      <w:start w:val="4"/>
-      <w:numFmt w:val="decimal"/>
-      <w:lvlText w:val="%4."/>
-      <w:lvlJc w:val="left"/>
-      <w:pPr>
-        <w:tabs>
-          <w:tab w:val="num" w:pos="0"/>
-        </w:tabs>
-        <w:ind w:left="2880" w:hanging="480"/>
-      </w:pPr>
-      <w:rPr/>
-    </w:lvl>
-    <w:lvl w:ilvl="4">
-      <w:start w:val="4"/>
-      <w:numFmt w:val="decimal"/>
-      <w:lvlText w:val="%5."/>
-      <w:lvlJc w:val="left"/>
-      <w:pPr>
-        <w:tabs>
-          <w:tab w:val="num" w:pos="0"/>
-        </w:tabs>
-        <w:ind w:left="3600" w:hanging="480"/>
-      </w:pPr>
-      <w:rPr/>
-    </w:lvl>
-    <w:lvl w:ilvl="5">
-      <w:start w:val="4"/>
-      <w:numFmt w:val="decimal"/>
-      <w:lvlText w:val="%6."/>
-      <w:lvlJc w:val="left"/>
-      <w:pPr>
-        <w:tabs>
-          <w:tab w:val="num" w:pos="0"/>
-        </w:tabs>
-        <w:ind w:left="4320" w:hanging="480"/>
-      </w:pPr>
-      <w:rPr/>
-    </w:lvl>
-    <w:lvl w:ilvl="6">
-      <w:start w:val="4"/>
-      <w:numFmt w:val="decimal"/>
-      <w:lvlText w:val="%7."/>
-      <w:lvlJc w:val="left"/>
-      <w:pPr>
-        <w:tabs>
-          <w:tab w:val="num" w:pos="0"/>
-        </w:tabs>
-        <w:ind w:left="5040" w:hanging="480"/>
-      </w:pPr>
-      <w:rPr/>
-    </w:lvl>
-    <w:lvl w:ilvl="7">
-      <w:start w:val="4"/>
-      <w:numFmt w:val="decimal"/>
-      <w:lvlText w:val="%8."/>
-      <w:lvlJc w:val="left"/>
-      <w:pPr>
-        <w:tabs>
-          <w:tab w:val="num" w:pos="0"/>
-        </w:tabs>
-        <w:ind w:left="5760" w:hanging="480"/>
-      </w:pPr>
-      <w:rPr/>
-    </w:lvl>
-    <w:lvl w:ilvl="8">
-      <w:start w:val="4"/>
-      <w:numFmt w:val="decimal"/>
-      <w:lvlText w:val="%9."/>
-      <w:lvlJc w:val="left"/>
-      <w:pPr>
-        <w:tabs>
-          <w:tab w:val="num" w:pos="0"/>
-        </w:tabs>
-        <w:ind w:left="6480" w:hanging="480"/>
-      </w:pPr>
-      <w:rPr/>
-    </w:lvl>
-  </w:abstractNum>
-  <w:abstractNum w:abstractNumId="6">
-    <w:lvl w:ilvl="0">
-      <w:start w:val="7"/>
-      <w:numFmt w:val="decimal"/>
-      <w:lvlText w:val="%1."/>
-      <w:lvlJc w:val="left"/>
-      <w:pPr>
-        <w:tabs>
-          <w:tab w:val="num" w:pos="0"/>
-        </w:tabs>
-        <w:ind w:left="720" w:hanging="480"/>
-      </w:pPr>
-      <w:rPr/>
-    </w:lvl>
-    <w:lvl w:ilvl="1">
-      <w:start w:val="7"/>
-      <w:numFmt w:val="decimal"/>
-      <w:lvlText w:val="%2."/>
-      <w:lvlJc w:val="left"/>
-      <w:pPr>
-        <w:tabs>
-          <w:tab w:val="num" w:pos="0"/>
-        </w:tabs>
-        <w:ind w:left="1440" w:hanging="480"/>
-      </w:pPr>
-      <w:rPr/>
-    </w:lvl>
-    <w:lvl w:ilvl="2">
-      <w:start w:val="7"/>
-      <w:numFmt w:val="decimal"/>
-      <w:lvlText w:val="%3."/>
-      <w:lvlJc w:val="left"/>
-      <w:pPr>
-        <w:tabs>
-          <w:tab w:val="num" w:pos="0"/>
-        </w:tabs>
-        <w:ind w:left="2160" w:hanging="480"/>
-      </w:pPr>
-      <w:rPr/>
-    </w:lvl>
-    <w:lvl w:ilvl="3">
-      <w:start w:val="7"/>
-      <w:numFmt w:val="decimal"/>
-      <w:lvlText w:val="%4."/>
-      <w:lvlJc w:val="left"/>
-      <w:pPr>
-        <w:tabs>
-          <w:tab w:val="num" w:pos="0"/>
-        </w:tabs>
-        <w:ind w:left="2880" w:hanging="480"/>
-      </w:pPr>
-      <w:rPr/>
-    </w:lvl>
-    <w:lvl w:ilvl="4">
-      <w:start w:val="7"/>
-      <w:numFmt w:val="decimal"/>
-      <w:lvlText w:val="%5."/>
-      <w:lvlJc w:val="left"/>
-      <w:pPr>
-        <w:tabs>
-          <w:tab w:val="num" w:pos="0"/>
-        </w:tabs>
-        <w:ind w:left="3600" w:hanging="480"/>
-      </w:pPr>
-      <w:rPr/>
-    </w:lvl>
-    <w:lvl w:ilvl="5">
-      <w:start w:val="7"/>
-      <w:numFmt w:val="decimal"/>
-      <w:lvlText w:val="%6."/>
-      <w:lvlJc w:val="left"/>
-      <w:pPr>
-        <w:tabs>
-          <w:tab w:val="num" w:pos="0"/>
-        </w:tabs>
-        <w:ind w:left="4320" w:hanging="480"/>
-      </w:pPr>
-      <w:rPr/>
-    </w:lvl>
-    <w:lvl w:ilvl="6">
-      <w:start w:val="7"/>
-      <w:numFmt w:val="decimal"/>
-      <w:lvlText w:val="%7."/>
-      <w:lvlJc w:val="left"/>
-      <w:pPr>
-        <w:tabs>
-          <w:tab w:val="num" w:pos="0"/>
-        </w:tabs>
-        <w:ind w:left="5040" w:hanging="480"/>
-      </w:pPr>
-      <w:rPr/>
-    </w:lvl>
-    <w:lvl w:ilvl="7">
-      <w:start w:val="7"/>
-      <w:numFmt w:val="decimal"/>
-      <w:lvlText w:val="%8."/>
-      <w:lvlJc w:val="left"/>
-      <w:pPr>
-        <w:tabs>
-          <w:tab w:val="num" w:pos="0"/>
-        </w:tabs>
-        <w:ind w:left="5760" w:hanging="480"/>
-      </w:pPr>
-      <w:rPr/>
-    </w:lvl>
-    <w:lvl w:ilvl="8">
-      <w:start w:val="7"/>
-      <w:numFmt w:val="decimal"/>
-      <w:lvlText w:val="%9."/>
-      <w:lvlJc w:val="left"/>
-      <w:pPr>
-        <w:tabs>
-          <w:tab w:val="num" w:pos="0"/>
-        </w:tabs>
-        <w:ind w:left="6480" w:hanging="480"/>
-      </w:pPr>
-      <w:rPr/>
-    </w:lvl>
-  </w:abstractNum>
-  <w:abstractNum w:abstractNumId="7">
-    <w:lvl w:ilvl="0">
-      <w:start w:val="3"/>
-      <w:numFmt w:val="decimal"/>
-      <w:lvlText w:val="%1."/>
-      <w:lvlJc w:val="left"/>
-      <w:pPr>
-        <w:tabs>
-          <w:tab w:val="num" w:pos="0"/>
-        </w:tabs>
-        <w:ind w:left="720" w:hanging="480"/>
-      </w:pPr>
-      <w:rPr/>
-    </w:lvl>
-    <w:lvl w:ilvl="1">
-      <w:start w:val="3"/>
-      <w:numFmt w:val="decimal"/>
-      <w:lvlText w:val="%2."/>
-      <w:lvlJc w:val="left"/>
-      <w:pPr>
-        <w:tabs>
-          <w:tab w:val="num" w:pos="0"/>
-        </w:tabs>
-        <w:ind w:left="1440" w:hanging="480"/>
-      </w:pPr>
-      <w:rPr/>
-    </w:lvl>
-    <w:lvl w:ilvl="2">
-      <w:start w:val="3"/>
-      <w:numFmt w:val="decimal"/>
-      <w:lvlText w:val="%3."/>
-      <w:lvlJc w:val="left"/>
-      <w:pPr>
-        <w:tabs>
-          <w:tab w:val="num" w:pos="0"/>
-        </w:tabs>
-        <w:ind w:left="2160" w:hanging="480"/>
-      </w:pPr>
-      <w:rPr/>
-    </w:lvl>
-    <w:lvl w:ilvl="3">
-      <w:start w:val="3"/>
-      <w:numFmt w:val="decimal"/>
-      <w:lvlText w:val="%4."/>
-      <w:lvlJc w:val="left"/>
-      <w:pPr>
-        <w:tabs>
-          <w:tab w:val="num" w:pos="0"/>
-        </w:tabs>
-        <w:ind w:left="2880" w:hanging="480"/>
-      </w:pPr>
-      <w:rPr/>
-    </w:lvl>
-    <w:lvl w:ilvl="4">
-      <w:start w:val="3"/>
-      <w:numFmt w:val="decimal"/>
-      <w:lvlText w:val="%5."/>
-      <w:lvlJc w:val="left"/>
-      <w:pPr>
-        <w:tabs>
-          <w:tab w:val="num" w:pos="0"/>
-        </w:tabs>
-        <w:ind w:left="3600" w:hanging="480"/>
-      </w:pPr>
-      <w:rPr/>
-    </w:lvl>
-    <w:lvl w:ilvl="5">
-      <w:start w:val="3"/>
-      <w:numFmt w:val="decimal"/>
-      <w:lvlText w:val="%6."/>
-      <w:lvlJc w:val="left"/>
-      <w:pPr>
-        <w:tabs>
-          <w:tab w:val="num" w:pos="0"/>
-        </w:tabs>
-        <w:ind w:left="4320" w:hanging="480"/>
-      </w:pPr>
-      <w:rPr/>
-    </w:lvl>
-    <w:lvl w:ilvl="6">
-      <w:start w:val="3"/>
-      <w:numFmt w:val="decimal"/>
-      <w:lvlText w:val="%7."/>
-      <w:lvlJc w:val="left"/>
-      <w:pPr>
-        <w:tabs>
-          <w:tab w:val="num" w:pos="0"/>
-        </w:tabs>
-        <w:ind w:left="5040" w:hanging="480"/>
-      </w:pPr>
-      <w:rPr/>
-    </w:lvl>
-    <w:lvl w:ilvl="7">
-      <w:start w:val="3"/>
-      <w:numFmt w:val="decimal"/>
-      <w:lvlText w:val="%8."/>
-      <w:lvlJc w:val="left"/>
-      <w:pPr>
-        <w:tabs>
-          <w:tab w:val="num" w:pos="0"/>
-        </w:tabs>
-        <w:ind w:left="5760" w:hanging="480"/>
-      </w:pPr>
-      <w:rPr/>
-    </w:lvl>
-    <w:lvl w:ilvl="8">
-      <w:start w:val="3"/>
-      <w:numFmt w:val="decimal"/>
-      <w:lvlText w:val="%9."/>
-      <w:lvlJc w:val="left"/>
-      <w:pPr>
-        <w:tabs>
-          <w:tab w:val="num" w:pos="0"/>
-        </w:tabs>
-        <w:ind w:left="6480" w:hanging="480"/>
-      </w:pPr>
-      <w:rPr/>
-    </w:lvl>
-  </w:abstractNum>
-  <w:abstractNum w:abstractNumId="8">
-    <w:lvl w:ilvl="0">
-      <w:start w:val="4"/>
-      <w:numFmt w:val="decimal"/>
-      <w:lvlText w:val="%1."/>
-      <w:lvlJc w:val="left"/>
-      <w:pPr>
-        <w:tabs>
-          <w:tab w:val="num" w:pos="0"/>
-        </w:tabs>
-        <w:ind w:left="720" w:hanging="480"/>
-      </w:pPr>
-      <w:rPr/>
-    </w:lvl>
-    <w:lvl w:ilvl="1">
-      <w:start w:val="4"/>
-      <w:numFmt w:val="decimal"/>
-      <w:lvlText w:val="%2."/>
-      <w:lvlJc w:val="left"/>
-      <w:pPr>
-        <w:tabs>
-          <w:tab w:val="num" w:pos="0"/>
-        </w:tabs>
-        <w:ind w:left="1440" w:hanging="480"/>
-      </w:pPr>
-      <w:rPr/>
-    </w:lvl>
-    <w:lvl w:ilvl="2">
-      <w:start w:val="4"/>
-      <w:numFmt w:val="decimal"/>
-      <w:lvlText w:val="%3."/>
-      <w:lvlJc w:val="left"/>
-      <w:pPr>
-        <w:tabs>
-          <w:tab w:val="num" w:pos="0"/>
-        </w:tabs>
-        <w:ind w:left="2160" w:hanging="480"/>
-      </w:pPr>
-      <w:rPr/>
-    </w:lvl>
-    <w:lvl w:ilvl="3">
-      <w:start w:val="4"/>
-      <w:numFmt w:val="decimal"/>
-      <w:lvlText w:val="%4."/>
-      <w:lvlJc w:val="left"/>
-      <w:pPr>
-        <w:tabs>
-          <w:tab w:val="num" w:pos="0"/>
-        </w:tabs>
-        <w:ind w:left="2880" w:hanging="480"/>
-      </w:pPr>
-      <w:rPr/>
-    </w:lvl>
-    <w:lvl w:ilvl="4">
-      <w:start w:val="4"/>
-      <w:numFmt w:val="decimal"/>
-      <w:lvlText w:val="%5."/>
-      <w:lvlJc w:val="left"/>
-      <w:pPr>
-        <w:tabs>
-          <w:tab w:val="num" w:pos="0"/>
-        </w:tabs>
-        <w:ind w:left="3600" w:hanging="480"/>
-      </w:pPr>
-      <w:rPr/>
-    </w:lvl>
-    <w:lvl w:ilvl="5">
-      <w:start w:val="4"/>
-      <w:numFmt w:val="decimal"/>
-      <w:lvlText w:val="%6."/>
-      <w:lvlJc w:val="left"/>
-      <w:pPr>
-        <w:tabs>
-          <w:tab w:val="num" w:pos="0"/>
-        </w:tabs>
-        <w:ind w:left="4320" w:hanging="480"/>
-      </w:pPr>
-      <w:rPr/>
-    </w:lvl>
-    <w:lvl w:ilvl="6">
-      <w:start w:val="4"/>
-      <w:numFmt w:val="decimal"/>
-      <w:lvlText w:val="%7."/>
-      <w:lvlJc w:val="left"/>
-      <w:pPr>
-        <w:tabs>
-          <w:tab w:val="num" w:pos="0"/>
-        </w:tabs>
-        <w:ind w:left="5040" w:hanging="480"/>
-      </w:pPr>
-      <w:rPr/>
-    </w:lvl>
-    <w:lvl w:ilvl="7">
-      <w:start w:val="4"/>
-      <w:numFmt w:val="decimal"/>
-      <w:lvlText w:val="%8."/>
-      <w:lvlJc w:val="left"/>
-      <w:pPr>
-        <w:tabs>
-          <w:tab w:val="num" w:pos="0"/>
-        </w:tabs>
-        <w:ind w:left="5760" w:hanging="480"/>
-      </w:pPr>
-      <w:rPr/>
-    </w:lvl>
-    <w:lvl w:ilvl="8">
-      <w:start w:val="4"/>
-      <w:numFmt w:val="decimal"/>
-      <w:lvlText w:val="%9."/>
-      <w:lvlJc w:val="left"/>
-      <w:pPr>
-        <w:tabs>
-          <w:tab w:val="num" w:pos="0"/>
-        </w:tabs>
-        <w:ind w:left="6480" w:hanging="480"/>
-      </w:pPr>
-      <w:rPr/>
+      <w:numFmt w:val="bullet"/>
+      <w:lvlText w:val="▪"/>
+      <w:lvlJc w:val="left"/>
+      <w:pPr>
+        <w:tabs>
+          <w:tab w:val="num" w:pos="3600"/>
+        </w:tabs>
+        <w:ind w:left="3600" w:hanging="360"/>
+      </w:pPr>
+      <w:rPr>
+        <w:rFonts w:ascii="OpenSymbol" w:hAnsi="OpenSymbol" w:cs="OpenSymbol" w:hint="default"/>
+      </w:rPr>
     </w:lvl>
   </w:abstractNum>
   <w:abstractNum w:abstractNumId="9">
     <w:lvl w:ilvl="0">
       <w:start w:val="1"/>
-      <w:numFmt w:val="decimal"/>
-      <w:lvlText w:val="%1."/>
-      <w:lvlJc w:val="left"/>
-      <w:pPr>
-        <w:tabs>
-          <w:tab w:val="num" w:pos="0"/>
-        </w:tabs>
-        <w:ind w:left="720" w:hanging="480"/>
-      </w:pPr>
-      <w:rPr/>
+      <w:numFmt w:val="bullet"/>
+      <w:lvlText w:val=""/>
+      <w:lvlJc w:val="left"/>
+      <w:pPr>
+        <w:tabs>
+          <w:tab w:val="num" w:pos="720"/>
+        </w:tabs>
+        <w:ind w:left="720" w:hanging="360"/>
+      </w:pPr>
+      <w:rPr>
+        <w:rFonts w:ascii="Symbol" w:hAnsi="Symbol" w:cs="Symbol" w:hint="default"/>
+      </w:rPr>
     </w:lvl>
     <w:lvl w:ilvl="1">
       <w:start w:val="1"/>
-      <w:numFmt w:val="decimal"/>
-      <w:lvlText w:val="%2."/>
-      <w:lvlJc w:val="left"/>
-      <w:pPr>
-        <w:tabs>
-          <w:tab w:val="num" w:pos="0"/>
-        </w:tabs>
-        <w:ind w:left="1440" w:hanging="480"/>
-      </w:pPr>
-      <w:rPr/>
+      <w:numFmt w:val="bullet"/>
+      <w:lvlText w:val="◦"/>
+      <w:lvlJc w:val="left"/>
+      <w:pPr>
+        <w:tabs>
+          <w:tab w:val="num" w:pos="1080"/>
+        </w:tabs>
+        <w:ind w:left="1080" w:hanging="360"/>
+      </w:pPr>
+      <w:rPr>
+        <w:rFonts w:ascii="OpenSymbol" w:hAnsi="OpenSymbol" w:cs="OpenSymbol" w:hint="default"/>
+      </w:rPr>
     </w:lvl>
     <w:lvl w:ilvl="2">
       <w:start w:val="1"/>
-      <w:numFmt w:val="decimal"/>
-      <w:lvlText w:val="%3."/>
-      <w:lvlJc w:val="left"/>
-      <w:pPr>
-        <w:tabs>
-          <w:tab w:val="num" w:pos="0"/>
-        </w:tabs>
-        <w:ind w:left="2160" w:hanging="480"/>
-      </w:pPr>
-      <w:rPr/>
+      <w:numFmt w:val="bullet"/>
+      <w:lvlText w:val="▪"/>
+      <w:lvlJc w:val="left"/>
+      <w:pPr>
+        <w:tabs>
+          <w:tab w:val="num" w:pos="1440"/>
+        </w:tabs>
+        <w:ind w:left="1440" w:hanging="360"/>
+      </w:pPr>
+      <w:rPr>
+        <w:rFonts w:ascii="OpenSymbol" w:hAnsi="OpenSymbol" w:cs="OpenSymbol" w:hint="default"/>
+      </w:rPr>
     </w:lvl>
     <w:lvl w:ilvl="3">
       <w:start w:val="1"/>
-      <w:numFmt w:val="decimal"/>
-      <w:lvlText w:val="%4."/>
-      <w:lvlJc w:val="left"/>
-      <w:pPr>
-        <w:tabs>
-          <w:tab w:val="num" w:pos="0"/>
-        </w:tabs>
-        <w:ind w:left="2880" w:hanging="480"/>
-      </w:pPr>
-      <w:rPr/>
+      <w:numFmt w:val="bullet"/>
+      <w:lvlText w:val=""/>
+      <w:lvlJc w:val="left"/>
+      <w:pPr>
+        <w:tabs>
+          <w:tab w:val="num" w:pos="1800"/>
+        </w:tabs>
+        <w:ind w:left="1800" w:hanging="360"/>
+      </w:pPr>
+      <w:rPr>
+        <w:rFonts w:ascii="Symbol" w:hAnsi="Symbol" w:cs="Symbol" w:hint="default"/>
+      </w:rPr>
     </w:lvl>
     <w:lvl w:ilvl="4">
       <w:start w:val="1"/>
-      <w:numFmt w:val="decimal"/>
-      <w:lvlText w:val="%5."/>
-      <w:lvlJc w:val="left"/>
-      <w:pPr>
-        <w:tabs>
-          <w:tab w:val="num" w:pos="0"/>
-        </w:tabs>
-        <w:ind w:left="3600" w:hanging="480"/>
-      </w:pPr>
-      <w:rPr/>
+      <w:numFmt w:val="bullet"/>
+      <w:lvlText w:val="◦"/>
+      <w:lvlJc w:val="left"/>
+      <w:pPr>
+        <w:tabs>
+          <w:tab w:val="num" w:pos="2160"/>
+        </w:tabs>
+        <w:ind w:left="2160" w:hanging="360"/>
+      </w:pPr>
+      <w:rPr>
+        <w:rFonts w:ascii="OpenSymbol" w:hAnsi="OpenSymbol" w:cs="OpenSymbol" w:hint="default"/>
+      </w:rPr>
     </w:lvl>
     <w:lvl w:ilvl="5">
       <w:start w:val="1"/>
-      <w:numFmt w:val="decimal"/>
-      <w:lvlText w:val="%6."/>
-      <w:lvlJc w:val="left"/>
-      <w:pPr>
-        <w:tabs>
-          <w:tab w:val="num" w:pos="0"/>
-        </w:tabs>
-        <w:ind w:left="4320" w:hanging="480"/>
-      </w:pPr>
-      <w:rPr/>
+      <w:numFmt w:val="bullet"/>
+      <w:lvlText w:val="▪"/>
+      <w:lvlJc w:val="left"/>
+      <w:pPr>
+        <w:tabs>
+          <w:tab w:val="num" w:pos="2520"/>
+        </w:tabs>
+        <w:ind w:left="2520" w:hanging="360"/>
+      </w:pPr>
+      <w:rPr>
+        <w:rFonts w:ascii="OpenSymbol" w:hAnsi="OpenSymbol" w:cs="OpenSymbol" w:hint="default"/>
+      </w:rPr>
     </w:lvl>
     <w:lvl w:ilvl="6">
       <w:start w:val="1"/>
-      <w:numFmt w:val="decimal"/>
-      <w:lvlText w:val="%7."/>
-      <w:lvlJc w:val="left"/>
-      <w:pPr>
-        <w:tabs>
-          <w:tab w:val="num" w:pos="0"/>
-        </w:tabs>
-        <w:ind w:left="5040" w:hanging="480"/>
-      </w:pPr>
-      <w:rPr/>
+      <w:numFmt w:val="bullet"/>
+      <w:lvlText w:val=""/>
+      <w:lvlJc w:val="left"/>
+      <w:pPr>
+        <w:tabs>
+          <w:tab w:val="num" w:pos="2880"/>
+        </w:tabs>
+        <w:ind w:left="2880" w:hanging="360"/>
+      </w:pPr>
+      <w:rPr>
+        <w:rFonts w:ascii="Symbol" w:hAnsi="Symbol" w:cs="Symbol" w:hint="default"/>
+      </w:rPr>
     </w:lvl>
     <w:lvl w:ilvl="7">
       <w:start w:val="1"/>
-      <w:numFmt w:val="decimal"/>
-      <w:lvlText w:val="%8."/>
-      <w:lvlJc w:val="left"/>
-      <w:pPr>
-        <w:tabs>
-          <w:tab w:val="num" w:pos="0"/>
-        </w:tabs>
-        <w:ind w:left="5760" w:hanging="480"/>
-      </w:pPr>
-      <w:rPr/>
+      <w:numFmt w:val="bullet"/>
+      <w:lvlText w:val="◦"/>
+      <w:lvlJc w:val="left"/>
+      <w:pPr>
+        <w:tabs>
+          <w:tab w:val="num" w:pos="3240"/>
+        </w:tabs>
+        <w:ind w:left="3240" w:hanging="360"/>
+      </w:pPr>
+      <w:rPr>
+        <w:rFonts w:ascii="OpenSymbol" w:hAnsi="OpenSymbol" w:cs="OpenSymbol" w:hint="default"/>
+      </w:rPr>
     </w:lvl>
     <w:lvl w:ilvl="8">
       <w:start w:val="1"/>
-      <w:numFmt w:val="decimal"/>
-      <w:lvlText w:val="%9."/>
-      <w:lvlJc w:val="left"/>
-      <w:pPr>
-        <w:tabs>
-          <w:tab w:val="num" w:pos="0"/>
-        </w:tabs>
-        <w:ind w:left="6480" w:hanging="480"/>
-      </w:pPr>
-      <w:rPr/>
+      <w:numFmt w:val="bullet"/>
+      <w:lvlText w:val="▪"/>
+      <w:lvlJc w:val="left"/>
+      <w:pPr>
+        <w:tabs>
+          <w:tab w:val="num" w:pos="3600"/>
+        </w:tabs>
+        <w:ind w:left="3600" w:hanging="360"/>
+      </w:pPr>
+      <w:rPr>
+        <w:rFonts w:ascii="OpenSymbol" w:hAnsi="OpenSymbol" w:cs="OpenSymbol" w:hint="default"/>
+      </w:rPr>
     </w:lvl>
   </w:abstractNum>
   <w:abstractNum w:abstractNumId="10">
@@ -8756,7 +9001,7 @@
   </w:abstractNum>
   <w:abstractNum w:abstractNumId="11">
     <w:lvl w:ilvl="0">
-      <w:start w:val="2"/>
+      <w:start w:val="4"/>
       <w:numFmt w:val="decimal"/>
       <w:lvlText w:val="%1."/>
       <w:lvlJc w:val="left"/>
@@ -8769,7 +9014,7 @@
       <w:rPr/>
     </w:lvl>
     <w:lvl w:ilvl="1">
-      <w:start w:val="2"/>
+      <w:start w:val="4"/>
       <w:numFmt w:val="decimal"/>
       <w:lvlText w:val="%2."/>
       <w:lvlJc w:val="left"/>
@@ -8782,7 +9027,7 @@
       <w:rPr/>
     </w:lvl>
     <w:lvl w:ilvl="2">
-      <w:start w:val="2"/>
+      <w:start w:val="4"/>
       <w:numFmt w:val="decimal"/>
       <w:lvlText w:val="%3."/>
       <w:lvlJc w:val="left"/>
@@ -8795,7 +9040,7 @@
       <w:rPr/>
     </w:lvl>
     <w:lvl w:ilvl="3">
-      <w:start w:val="2"/>
+      <w:start w:val="4"/>
       <w:numFmt w:val="decimal"/>
       <w:lvlText w:val="%4."/>
       <w:lvlJc w:val="left"/>
@@ -8808,7 +9053,7 @@
       <w:rPr/>
     </w:lvl>
     <w:lvl w:ilvl="4">
-      <w:start w:val="2"/>
+      <w:start w:val="4"/>
       <w:numFmt w:val="decimal"/>
       <w:lvlText w:val="%5."/>
       <w:lvlJc w:val="left"/>
@@ -8821,7 +9066,7 @@
       <w:rPr/>
     </w:lvl>
     <w:lvl w:ilvl="5">
-      <w:start w:val="2"/>
+      <w:start w:val="4"/>
       <w:numFmt w:val="decimal"/>
       <w:lvlText w:val="%6."/>
       <w:lvlJc w:val="left"/>
@@ -8834,7 +9079,7 @@
       <w:rPr/>
     </w:lvl>
     <w:lvl w:ilvl="6">
-      <w:start w:val="2"/>
+      <w:start w:val="4"/>
       <w:numFmt w:val="decimal"/>
       <w:lvlText w:val="%7."/>
       <w:lvlJc w:val="left"/>
@@ -8847,7 +9092,7 @@
       <w:rPr/>
     </w:lvl>
     <w:lvl w:ilvl="7">
-      <w:start w:val="2"/>
+      <w:start w:val="4"/>
       <w:numFmt w:val="decimal"/>
       <w:lvlText w:val="%8."/>
       <w:lvlJc w:val="left"/>
@@ -8860,7 +9105,7 @@
       <w:rPr/>
     </w:lvl>
     <w:lvl w:ilvl="8">
-      <w:start w:val="2"/>
+      <w:start w:val="4"/>
       <w:numFmt w:val="decimal"/>
       <w:lvlText w:val="%9."/>
       <w:lvlJc w:val="left"/>
@@ -8875,7 +9120,7 @@
   </w:abstractNum>
   <w:abstractNum w:abstractNumId="12">
     <w:lvl w:ilvl="0">
-      <w:start w:val="3"/>
+      <w:start w:val="1"/>
       <w:numFmt w:val="decimal"/>
       <w:lvlText w:val="%1."/>
       <w:lvlJc w:val="left"/>
@@ -8888,7 +9133,7 @@
       <w:rPr/>
     </w:lvl>
     <w:lvl w:ilvl="1">
-      <w:start w:val="3"/>
+      <w:start w:val="1"/>
       <w:numFmt w:val="decimal"/>
       <w:lvlText w:val="%2."/>
       <w:lvlJc w:val="left"/>
@@ -8901,7 +9146,7 @@
       <w:rPr/>
     </w:lvl>
     <w:lvl w:ilvl="2">
-      <w:start w:val="3"/>
+      <w:start w:val="1"/>
       <w:numFmt w:val="decimal"/>
       <w:lvlText w:val="%3."/>
       <w:lvlJc w:val="left"/>
@@ -8914,7 +9159,7 @@
       <w:rPr/>
     </w:lvl>
     <w:lvl w:ilvl="3">
-      <w:start w:val="3"/>
+      <w:start w:val="1"/>
       <w:numFmt w:val="decimal"/>
       <w:lvlText w:val="%4."/>
       <w:lvlJc w:val="left"/>
@@ -8927,7 +9172,7 @@
       <w:rPr/>
     </w:lvl>
     <w:lvl w:ilvl="4">
-      <w:start w:val="3"/>
+      <w:start w:val="1"/>
       <w:numFmt w:val="decimal"/>
       <w:lvlText w:val="%5."/>
       <w:lvlJc w:val="left"/>
@@ -8940,7 +9185,7 @@
       <w:rPr/>
     </w:lvl>
     <w:lvl w:ilvl="5">
-      <w:start w:val="3"/>
+      <w:start w:val="1"/>
       <w:numFmt w:val="decimal"/>
       <w:lvlText w:val="%6."/>
       <w:lvlJc w:val="left"/>
@@ -8953,7 +9198,7 @@
       <w:rPr/>
     </w:lvl>
     <w:lvl w:ilvl="6">
-      <w:start w:val="3"/>
+      <w:start w:val="1"/>
       <w:numFmt w:val="decimal"/>
       <w:lvlText w:val="%7."/>
       <w:lvlJc w:val="left"/>
@@ -8966,7 +9211,7 @@
       <w:rPr/>
     </w:lvl>
     <w:lvl w:ilvl="7">
-      <w:start w:val="3"/>
+      <w:start w:val="1"/>
       <w:numFmt w:val="decimal"/>
       <w:lvlText w:val="%8."/>
       <w:lvlJc w:val="left"/>
@@ -8979,7 +9224,7 @@
       <w:rPr/>
     </w:lvl>
     <w:lvl w:ilvl="8">
-      <w:start w:val="3"/>
+      <w:start w:val="1"/>
       <w:numFmt w:val="decimal"/>
       <w:lvlText w:val="%9."/>
       <w:lvlJc w:val="left"/>
@@ -9113,550 +9358,478 @@
   </w:abstractNum>
   <w:abstractNum w:abstractNumId="14">
     <w:lvl w:ilvl="0">
-      <w:start w:val="1"/>
-      <w:numFmt w:val="bullet"/>
-      <w:lvlText w:val=""/>
-      <w:lvlJc w:val="left"/>
-      <w:pPr>
-        <w:tabs>
-          <w:tab w:val="num" w:pos="720"/>
-        </w:tabs>
-        <w:ind w:left="720" w:hanging="360"/>
-      </w:pPr>
-      <w:rPr>
-        <w:rFonts w:ascii="Symbol" w:hAnsi="Symbol" w:cs="Symbol" w:hint="default"/>
-      </w:rPr>
+      <w:start w:val="7"/>
+      <w:numFmt w:val="decimal"/>
+      <w:lvlText w:val="%1."/>
+      <w:lvlJc w:val="left"/>
+      <w:pPr>
+        <w:tabs>
+          <w:tab w:val="num" w:pos="0"/>
+        </w:tabs>
+        <w:ind w:left="720" w:hanging="480"/>
+      </w:pPr>
+      <w:rPr/>
     </w:lvl>
     <w:lvl w:ilvl="1">
-      <w:start w:val="1"/>
-      <w:numFmt w:val="bullet"/>
-      <w:lvlText w:val="◦"/>
-      <w:lvlJc w:val="left"/>
-      <w:pPr>
-        <w:tabs>
-          <w:tab w:val="num" w:pos="1080"/>
-        </w:tabs>
-        <w:ind w:left="1080" w:hanging="360"/>
-      </w:pPr>
-      <w:rPr>
-        <w:rFonts w:ascii="OpenSymbol" w:hAnsi="OpenSymbol" w:cs="OpenSymbol" w:hint="default"/>
-      </w:rPr>
+      <w:start w:val="7"/>
+      <w:numFmt w:val="decimal"/>
+      <w:lvlText w:val="%2."/>
+      <w:lvlJc w:val="left"/>
+      <w:pPr>
+        <w:tabs>
+          <w:tab w:val="num" w:pos="0"/>
+        </w:tabs>
+        <w:ind w:left="1440" w:hanging="480"/>
+      </w:pPr>
+      <w:rPr/>
     </w:lvl>
     <w:lvl w:ilvl="2">
-      <w:start w:val="1"/>
-      <w:numFmt w:val="bullet"/>
-      <w:lvlText w:val="▪"/>
-      <w:lvlJc w:val="left"/>
-      <w:pPr>
-        <w:tabs>
-          <w:tab w:val="num" w:pos="1440"/>
-        </w:tabs>
-        <w:ind w:left="1440" w:hanging="360"/>
-      </w:pPr>
-      <w:rPr>
-        <w:rFonts w:ascii="OpenSymbol" w:hAnsi="OpenSymbol" w:cs="OpenSymbol" w:hint="default"/>
-      </w:rPr>
+      <w:start w:val="7"/>
+      <w:numFmt w:val="decimal"/>
+      <w:lvlText w:val="%3."/>
+      <w:lvlJc w:val="left"/>
+      <w:pPr>
+        <w:tabs>
+          <w:tab w:val="num" w:pos="0"/>
+        </w:tabs>
+        <w:ind w:left="2160" w:hanging="480"/>
+      </w:pPr>
+      <w:rPr/>
     </w:lvl>
     <w:lvl w:ilvl="3">
-      <w:start w:val="1"/>
-      <w:numFmt w:val="bullet"/>
-      <w:lvlText w:val=""/>
-      <w:lvlJc w:val="left"/>
-      <w:pPr>
-        <w:tabs>
-          <w:tab w:val="num" w:pos="1800"/>
-        </w:tabs>
-        <w:ind w:left="1800" w:hanging="360"/>
-      </w:pPr>
-      <w:rPr>
-        <w:rFonts w:ascii="Symbol" w:hAnsi="Symbol" w:cs="Symbol" w:hint="default"/>
-      </w:rPr>
+      <w:start w:val="7"/>
+      <w:numFmt w:val="decimal"/>
+      <w:lvlText w:val="%4."/>
+      <w:lvlJc w:val="left"/>
+      <w:pPr>
+        <w:tabs>
+          <w:tab w:val="num" w:pos="0"/>
+        </w:tabs>
+        <w:ind w:left="2880" w:hanging="480"/>
+      </w:pPr>
+      <w:rPr/>
     </w:lvl>
     <w:lvl w:ilvl="4">
-      <w:start w:val="1"/>
-      <w:numFmt w:val="bullet"/>
-      <w:lvlText w:val="◦"/>
-      <w:lvlJc w:val="left"/>
-      <w:pPr>
-        <w:tabs>
-          <w:tab w:val="num" w:pos="2160"/>
-        </w:tabs>
-        <w:ind w:left="2160" w:hanging="360"/>
-      </w:pPr>
-      <w:rPr>
-        <w:rFonts w:ascii="OpenSymbol" w:hAnsi="OpenSymbol" w:cs="OpenSymbol" w:hint="default"/>
-      </w:rPr>
+      <w:start w:val="7"/>
+      <w:numFmt w:val="decimal"/>
+      <w:lvlText w:val="%5."/>
+      <w:lvlJc w:val="left"/>
+      <w:pPr>
+        <w:tabs>
+          <w:tab w:val="num" w:pos="0"/>
+        </w:tabs>
+        <w:ind w:left="3600" w:hanging="480"/>
+      </w:pPr>
+      <w:rPr/>
     </w:lvl>
     <w:lvl w:ilvl="5">
-      <w:start w:val="1"/>
-      <w:numFmt w:val="bullet"/>
-      <w:lvlText w:val="▪"/>
-      <w:lvlJc w:val="left"/>
-      <w:pPr>
-        <w:tabs>
-          <w:tab w:val="num" w:pos="2520"/>
-        </w:tabs>
-        <w:ind w:left="2520" w:hanging="360"/>
-      </w:pPr>
-      <w:rPr>
-        <w:rFonts w:ascii="OpenSymbol" w:hAnsi="OpenSymbol" w:cs="OpenSymbol" w:hint="default"/>
-      </w:rPr>
+      <w:start w:val="7"/>
+      <w:numFmt w:val="decimal"/>
+      <w:lvlText w:val="%6."/>
+      <w:lvlJc w:val="left"/>
+      <w:pPr>
+        <w:tabs>
+          <w:tab w:val="num" w:pos="0"/>
+        </w:tabs>
+        <w:ind w:left="4320" w:hanging="480"/>
+      </w:pPr>
+      <w:rPr/>
     </w:lvl>
     <w:lvl w:ilvl="6">
-      <w:start w:val="1"/>
-      <w:numFmt w:val="bullet"/>
-      <w:lvlText w:val=""/>
-      <w:lvlJc w:val="left"/>
-      <w:pPr>
-        <w:tabs>
-          <w:tab w:val="num" w:pos="2880"/>
-        </w:tabs>
-        <w:ind w:left="2880" w:hanging="360"/>
-      </w:pPr>
-      <w:rPr>
-        <w:rFonts w:ascii="Symbol" w:hAnsi="Symbol" w:cs="Symbol" w:hint="default"/>
-      </w:rPr>
+      <w:start w:val="7"/>
+      <w:numFmt w:val="decimal"/>
+      <w:lvlText w:val="%7."/>
+      <w:lvlJc w:val="left"/>
+      <w:pPr>
+        <w:tabs>
+          <w:tab w:val="num" w:pos="0"/>
+        </w:tabs>
+        <w:ind w:left="5040" w:hanging="480"/>
+      </w:pPr>
+      <w:rPr/>
     </w:lvl>
     <w:lvl w:ilvl="7">
-      <w:start w:val="1"/>
-      <w:numFmt w:val="bullet"/>
-      <w:lvlText w:val="◦"/>
-      <w:lvlJc w:val="left"/>
-      <w:pPr>
-        <w:tabs>
-          <w:tab w:val="num" w:pos="3240"/>
-        </w:tabs>
-        <w:ind w:left="3240" w:hanging="360"/>
-      </w:pPr>
-      <w:rPr>
-        <w:rFonts w:ascii="OpenSymbol" w:hAnsi="OpenSymbol" w:cs="OpenSymbol" w:hint="default"/>
-      </w:rPr>
+      <w:start w:val="7"/>
+      <w:numFmt w:val="decimal"/>
+      <w:lvlText w:val="%8."/>
+      <w:lvlJc w:val="left"/>
+      <w:pPr>
+        <w:tabs>
+          <w:tab w:val="num" w:pos="0"/>
+        </w:tabs>
+        <w:ind w:left="5760" w:hanging="480"/>
+      </w:pPr>
+      <w:rPr/>
     </w:lvl>
     <w:lvl w:ilvl="8">
-      <w:start w:val="1"/>
-      <w:numFmt w:val="bullet"/>
-      <w:lvlText w:val="▪"/>
-      <w:lvlJc w:val="left"/>
-      <w:pPr>
-        <w:tabs>
-          <w:tab w:val="num" w:pos="3600"/>
-        </w:tabs>
-        <w:ind w:left="3600" w:hanging="360"/>
-      </w:pPr>
-      <w:rPr>
-        <w:rFonts w:ascii="OpenSymbol" w:hAnsi="OpenSymbol" w:cs="OpenSymbol" w:hint="default"/>
-      </w:rPr>
+      <w:start w:val="7"/>
+      <w:numFmt w:val="decimal"/>
+      <w:lvlText w:val="%9."/>
+      <w:lvlJc w:val="left"/>
+      <w:pPr>
+        <w:tabs>
+          <w:tab w:val="num" w:pos="0"/>
+        </w:tabs>
+        <w:ind w:left="6480" w:hanging="480"/>
+      </w:pPr>
+      <w:rPr/>
     </w:lvl>
   </w:abstractNum>
   <w:abstractNum w:abstractNumId="15">
     <w:lvl w:ilvl="0">
-      <w:start w:val="1"/>
-      <w:numFmt w:val="bullet"/>
-      <w:lvlText w:val=""/>
-      <w:lvlJc w:val="left"/>
-      <w:pPr>
-        <w:tabs>
-          <w:tab w:val="num" w:pos="720"/>
-        </w:tabs>
-        <w:ind w:left="720" w:hanging="360"/>
-      </w:pPr>
-      <w:rPr>
-        <w:rFonts w:ascii="Symbol" w:hAnsi="Symbol" w:cs="Symbol" w:hint="default"/>
-      </w:rPr>
+      <w:start w:val="3"/>
+      <w:numFmt w:val="decimal"/>
+      <w:lvlText w:val="%1."/>
+      <w:lvlJc w:val="left"/>
+      <w:pPr>
+        <w:tabs>
+          <w:tab w:val="num" w:pos="0"/>
+        </w:tabs>
+        <w:ind w:left="720" w:hanging="480"/>
+      </w:pPr>
+      <w:rPr/>
     </w:lvl>
     <w:lvl w:ilvl="1">
-      <w:start w:val="1"/>
-      <w:numFmt w:val="bullet"/>
-      <w:lvlText w:val="◦"/>
-      <w:lvlJc w:val="left"/>
-      <w:pPr>
-        <w:tabs>
-          <w:tab w:val="num" w:pos="1080"/>
-        </w:tabs>
-        <w:ind w:left="1080" w:hanging="360"/>
-      </w:pPr>
-      <w:rPr>
-        <w:rFonts w:ascii="OpenSymbol" w:hAnsi="OpenSymbol" w:cs="OpenSymbol" w:hint="default"/>
-      </w:rPr>
+      <w:start w:val="3"/>
+      <w:numFmt w:val="decimal"/>
+      <w:lvlText w:val="%2."/>
+      <w:lvlJc w:val="left"/>
+      <w:pPr>
+        <w:tabs>
+          <w:tab w:val="num" w:pos="0"/>
+        </w:tabs>
+        <w:ind w:left="1440" w:hanging="480"/>
+      </w:pPr>
+      <w:rPr/>
     </w:lvl>
     <w:lvl w:ilvl="2">
-      <w:start w:val="1"/>
-      <w:numFmt w:val="bullet"/>
-      <w:lvlText w:val="▪"/>
-      <w:lvlJc w:val="left"/>
-      <w:pPr>
-        <w:tabs>
-          <w:tab w:val="num" w:pos="1440"/>
-        </w:tabs>
-        <w:ind w:left="1440" w:hanging="360"/>
-      </w:pPr>
-      <w:rPr>
-        <w:rFonts w:ascii="OpenSymbol" w:hAnsi="OpenSymbol" w:cs="OpenSymbol" w:hint="default"/>
-      </w:rPr>
+      <w:start w:val="3"/>
+      <w:numFmt w:val="decimal"/>
+      <w:lvlText w:val="%3."/>
+      <w:lvlJc w:val="left"/>
+      <w:pPr>
+        <w:tabs>
+          <w:tab w:val="num" w:pos="0"/>
+        </w:tabs>
+        <w:ind w:left="2160" w:hanging="480"/>
+      </w:pPr>
+      <w:rPr/>
     </w:lvl>
     <w:lvl w:ilvl="3">
-      <w:start w:val="1"/>
-      <w:numFmt w:val="bullet"/>
-      <w:lvlText w:val=""/>
-      <w:lvlJc w:val="left"/>
-      <w:pPr>
-        <w:tabs>
-          <w:tab w:val="num" w:pos="1800"/>
-        </w:tabs>
-        <w:ind w:left="1800" w:hanging="360"/>
-      </w:pPr>
-      <w:rPr>
-        <w:rFonts w:ascii="Symbol" w:hAnsi="Symbol" w:cs="Symbol" w:hint="default"/>
-      </w:rPr>
+      <w:start w:val="3"/>
+      <w:numFmt w:val="decimal"/>
+      <w:lvlText w:val="%4."/>
+      <w:lvlJc w:val="left"/>
+      <w:pPr>
+        <w:tabs>
+          <w:tab w:val="num" w:pos="0"/>
+        </w:tabs>
+        <w:ind w:left="2880" w:hanging="480"/>
+      </w:pPr>
+      <w:rPr/>
     </w:lvl>
     <w:lvl w:ilvl="4">
-      <w:start w:val="1"/>
-      <w:numFmt w:val="bullet"/>
-      <w:lvlText w:val="◦"/>
-      <w:lvlJc w:val="left"/>
-      <w:pPr>
-        <w:tabs>
-          <w:tab w:val="num" w:pos="2160"/>
-        </w:tabs>
-        <w:ind w:left="2160" w:hanging="360"/>
-      </w:pPr>
-      <w:rPr>
-        <w:rFonts w:ascii="OpenSymbol" w:hAnsi="OpenSymbol" w:cs="OpenSymbol" w:hint="default"/>
-      </w:rPr>
+      <w:start w:val="3"/>
+      <w:numFmt w:val="decimal"/>
+      <w:lvlText w:val="%5."/>
+      <w:lvlJc w:val="left"/>
+      <w:pPr>
+        <w:tabs>
+          <w:tab w:val="num" w:pos="0"/>
+        </w:tabs>
+        <w:ind w:left="3600" w:hanging="480"/>
+      </w:pPr>
+      <w:rPr/>
     </w:lvl>
     <w:lvl w:ilvl="5">
-      <w:start w:val="1"/>
-      <w:numFmt w:val="bullet"/>
-      <w:lvlText w:val="▪"/>
-      <w:lvlJc w:val="left"/>
-      <w:pPr>
-        <w:tabs>
-          <w:tab w:val="num" w:pos="2520"/>
-        </w:tabs>
-        <w:ind w:left="2520" w:hanging="360"/>
-      </w:pPr>
-      <w:rPr>
-        <w:rFonts w:ascii="OpenSymbol" w:hAnsi="OpenSymbol" w:cs="OpenSymbol" w:hint="default"/>
-      </w:rPr>
+      <w:start w:val="3"/>
+      <w:numFmt w:val="decimal"/>
+      <w:lvlText w:val="%6."/>
+      <w:lvlJc w:val="left"/>
+      <w:pPr>
+        <w:tabs>
+          <w:tab w:val="num" w:pos="0"/>
+        </w:tabs>
+        <w:ind w:left="4320" w:hanging="480"/>
+      </w:pPr>
+      <w:rPr/>
     </w:lvl>
     <w:lvl w:ilvl="6">
-      <w:start w:val="1"/>
-      <w:numFmt w:val="bullet"/>
-      <w:lvlText w:val=""/>
-      <w:lvlJc w:val="left"/>
-      <w:pPr>
-        <w:tabs>
-          <w:tab w:val="num" w:pos="2880"/>
-        </w:tabs>
-        <w:ind w:left="2880" w:hanging="360"/>
-      </w:pPr>
-      <w:rPr>
-        <w:rFonts w:ascii="Symbol" w:hAnsi="Symbol" w:cs="Symbol" w:hint="default"/>
-      </w:rPr>
+      <w:start w:val="3"/>
+      <w:numFmt w:val="decimal"/>
+      <w:lvlText w:val="%7."/>
+      <w:lvlJc w:val="left"/>
+      <w:pPr>
+        <w:tabs>
+          <w:tab w:val="num" w:pos="0"/>
+        </w:tabs>
+        <w:ind w:left="5040" w:hanging="480"/>
+      </w:pPr>
+      <w:rPr/>
     </w:lvl>
     <w:lvl w:ilvl="7">
-      <w:start w:val="1"/>
-      <w:numFmt w:val="bullet"/>
-      <w:lvlText w:val="◦"/>
-      <w:lvlJc w:val="left"/>
-      <w:pPr>
-        <w:tabs>
-          <w:tab w:val="num" w:pos="3240"/>
-        </w:tabs>
-        <w:ind w:left="3240" w:hanging="360"/>
-      </w:pPr>
-      <w:rPr>
-        <w:rFonts w:ascii="OpenSymbol" w:hAnsi="OpenSymbol" w:cs="OpenSymbol" w:hint="default"/>
-      </w:rPr>
+      <w:start w:val="3"/>
+      <w:numFmt w:val="decimal"/>
+      <w:lvlText w:val="%8."/>
+      <w:lvlJc w:val="left"/>
+      <w:pPr>
+        <w:tabs>
+          <w:tab w:val="num" w:pos="0"/>
+        </w:tabs>
+        <w:ind w:left="5760" w:hanging="480"/>
+      </w:pPr>
+      <w:rPr/>
     </w:lvl>
     <w:lvl w:ilvl="8">
-      <w:start w:val="1"/>
-      <w:numFmt w:val="bullet"/>
-      <w:lvlText w:val="▪"/>
-      <w:lvlJc w:val="left"/>
-      <w:pPr>
-        <w:tabs>
-          <w:tab w:val="num" w:pos="3600"/>
-        </w:tabs>
-        <w:ind w:left="3600" w:hanging="360"/>
-      </w:pPr>
-      <w:rPr>
-        <w:rFonts w:ascii="OpenSymbol" w:hAnsi="OpenSymbol" w:cs="OpenSymbol" w:hint="default"/>
-      </w:rPr>
+      <w:start w:val="3"/>
+      <w:numFmt w:val="decimal"/>
+      <w:lvlText w:val="%9."/>
+      <w:lvlJc w:val="left"/>
+      <w:pPr>
+        <w:tabs>
+          <w:tab w:val="num" w:pos="0"/>
+        </w:tabs>
+        <w:ind w:left="6480" w:hanging="480"/>
+      </w:pPr>
+      <w:rPr/>
     </w:lvl>
   </w:abstractNum>
   <w:abstractNum w:abstractNumId="16">
     <w:lvl w:ilvl="0">
-      <w:start w:val="1"/>
-      <w:numFmt w:val="bullet"/>
-      <w:lvlText w:val=""/>
-      <w:lvlJc w:val="left"/>
-      <w:pPr>
-        <w:tabs>
-          <w:tab w:val="num" w:pos="720"/>
-        </w:tabs>
-        <w:ind w:left="720" w:hanging="360"/>
-      </w:pPr>
-      <w:rPr>
-        <w:rFonts w:ascii="Symbol" w:hAnsi="Symbol" w:cs="Symbol" w:hint="default"/>
-      </w:rPr>
+      <w:start w:val="4"/>
+      <w:numFmt w:val="decimal"/>
+      <w:lvlText w:val="%1."/>
+      <w:lvlJc w:val="left"/>
+      <w:pPr>
+        <w:tabs>
+          <w:tab w:val="num" w:pos="0"/>
+        </w:tabs>
+        <w:ind w:left="720" w:hanging="480"/>
+      </w:pPr>
+      <w:rPr/>
     </w:lvl>
     <w:lvl w:ilvl="1">
-      <w:start w:val="1"/>
-      <w:numFmt w:val="bullet"/>
-      <w:lvlText w:val="◦"/>
-      <w:lvlJc w:val="left"/>
-      <w:pPr>
-        <w:tabs>
-          <w:tab w:val="num" w:pos="1080"/>
-        </w:tabs>
-        <w:ind w:left="1080" w:hanging="360"/>
-      </w:pPr>
-      <w:rPr>
-        <w:rFonts w:ascii="OpenSymbol" w:hAnsi="OpenSymbol" w:cs="OpenSymbol" w:hint="default"/>
-      </w:rPr>
+      <w:start w:val="4"/>
+      <w:numFmt w:val="decimal"/>
+      <w:lvlText w:val="%2."/>
+      <w:lvlJc w:val="left"/>
+      <w:pPr>
+        <w:tabs>
+          <w:tab w:val="num" w:pos="0"/>
+        </w:tabs>
+        <w:ind w:left="1440" w:hanging="480"/>
+      </w:pPr>
+      <w:rPr/>
     </w:lvl>
     <w:lvl w:ilvl="2">
-      <w:start w:val="1"/>
-      <w:numFmt w:val="bullet"/>
-      <w:lvlText w:val="▪"/>
-      <w:lvlJc w:val="left"/>
-      <w:pPr>
-        <w:tabs>
-          <w:tab w:val="num" w:pos="1440"/>
-        </w:tabs>
-        <w:ind w:left="1440" w:hanging="360"/>
-      </w:pPr>
-      <w:rPr>
-        <w:rFonts w:ascii="OpenSymbol" w:hAnsi="OpenSymbol" w:cs="OpenSymbol" w:hint="default"/>
-      </w:rPr>
+      <w:start w:val="4"/>
+      <w:numFmt w:val="decimal"/>
+      <w:lvlText w:val="%3."/>
+      <w:lvlJc w:val="left"/>
+      <w:pPr>
+        <w:tabs>
+          <w:tab w:val="num" w:pos="0"/>
+        </w:tabs>
+        <w:ind w:left="2160" w:hanging="480"/>
+      </w:pPr>
+      <w:rPr/>
     </w:lvl>
     <w:lvl w:ilvl="3">
-      <w:start w:val="1"/>
-      <w:numFmt w:val="bullet"/>
-      <w:lvlText w:val=""/>
-      <w:lvlJc w:val="left"/>
-      <w:pPr>
-        <w:tabs>
-          <w:tab w:val="num" w:pos="1800"/>
-        </w:tabs>
-        <w:ind w:left="1800" w:hanging="360"/>
-      </w:pPr>
-      <w:rPr>
-        <w:rFonts w:ascii="Symbol" w:hAnsi="Symbol" w:cs="Symbol" w:hint="default"/>
-      </w:rPr>
+      <w:start w:val="4"/>
+      <w:numFmt w:val="decimal"/>
+      <w:lvlText w:val="%4."/>
+      <w:lvlJc w:val="left"/>
+      <w:pPr>
+        <w:tabs>
+          <w:tab w:val="num" w:pos="0"/>
+        </w:tabs>
+        <w:ind w:left="2880" w:hanging="480"/>
+      </w:pPr>
+      <w:rPr/>
     </w:lvl>
     <w:lvl w:ilvl="4">
-      <w:start w:val="1"/>
-      <w:numFmt w:val="bullet"/>
-      <w:lvlText w:val="◦"/>
-      <w:lvlJc w:val="left"/>
-      <w:pPr>
-        <w:tabs>
-          <w:tab w:val="num" w:pos="2160"/>
-        </w:tabs>
-        <w:ind w:left="2160" w:hanging="360"/>
-      </w:pPr>
-      <w:rPr>
-        <w:rFonts w:ascii="OpenSymbol" w:hAnsi="OpenSymbol" w:cs="OpenSymbol" w:hint="default"/>
-      </w:rPr>
+      <w:start w:val="4"/>
+      <w:numFmt w:val="decimal"/>
+      <w:lvlText w:val="%5."/>
+      <w:lvlJc w:val="left"/>
+      <w:pPr>
+        <w:tabs>
+          <w:tab w:val="num" w:pos="0"/>
+        </w:tabs>
+        <w:ind w:left="3600" w:hanging="480"/>
+      </w:pPr>
+      <w:rPr/>
     </w:lvl>
     <w:lvl w:ilvl="5">
-      <w:start w:val="1"/>
-      <w:numFmt w:val="bullet"/>
-      <w:lvlText w:val="▪"/>
-      <w:lvlJc w:val="left"/>
-      <w:pPr>
-        <w:tabs>
-          <w:tab w:val="num" w:pos="2520"/>
-        </w:tabs>
-        <w:ind w:left="2520" w:hanging="360"/>
-      </w:pPr>
-      <w:rPr>
-        <w:rFonts w:ascii="OpenSymbol" w:hAnsi="OpenSymbol" w:cs="OpenSymbol" w:hint="default"/>
-      </w:rPr>
+      <w:start w:val="4"/>
+      <w:numFmt w:val="decimal"/>
+      <w:lvlText w:val="%6."/>
+      <w:lvlJc w:val="left"/>
+      <w:pPr>
+        <w:tabs>
+          <w:tab w:val="num" w:pos="0"/>
+        </w:tabs>
+        <w:ind w:left="4320" w:hanging="480"/>
+      </w:pPr>
+      <w:rPr/>
     </w:lvl>
     <w:lvl w:ilvl="6">
-      <w:start w:val="1"/>
-      <w:numFmt w:val="bullet"/>
-      <w:lvlText w:val=""/>
-      <w:lvlJc w:val="left"/>
-      <w:pPr>
-        <w:tabs>
-          <w:tab w:val="num" w:pos="2880"/>
-        </w:tabs>
-        <w:ind w:left="2880" w:hanging="360"/>
-      </w:pPr>
-      <w:rPr>
-        <w:rFonts w:ascii="Symbol" w:hAnsi="Symbol" w:cs="Symbol" w:hint="default"/>
-      </w:rPr>
+      <w:start w:val="4"/>
+      <w:numFmt w:val="decimal"/>
+      <w:lvlText w:val="%7."/>
+      <w:lvlJc w:val="left"/>
+      <w:pPr>
+        <w:tabs>
+          <w:tab w:val="num" w:pos="0"/>
+        </w:tabs>
+        <w:ind w:left="5040" w:hanging="480"/>
+      </w:pPr>
+      <w:rPr/>
     </w:lvl>
     <w:lvl w:ilvl="7">
-      <w:start w:val="1"/>
-      <w:numFmt w:val="bullet"/>
-      <w:lvlText w:val="◦"/>
-      <w:lvlJc w:val="left"/>
-      <w:pPr>
-        <w:tabs>
-          <w:tab w:val="num" w:pos="3240"/>
-        </w:tabs>
-        <w:ind w:left="3240" w:hanging="360"/>
-      </w:pPr>
-      <w:rPr>
-        <w:rFonts w:ascii="OpenSymbol" w:hAnsi="OpenSymbol" w:cs="OpenSymbol" w:hint="default"/>
-      </w:rPr>
+      <w:start w:val="4"/>
+      <w:numFmt w:val="decimal"/>
+      <w:lvlText w:val="%8."/>
+      <w:lvlJc w:val="left"/>
+      <w:pPr>
+        <w:tabs>
+          <w:tab w:val="num" w:pos="0"/>
+        </w:tabs>
+        <w:ind w:left="5760" w:hanging="480"/>
+      </w:pPr>
+      <w:rPr/>
     </w:lvl>
     <w:lvl w:ilvl="8">
-      <w:start w:val="1"/>
-      <w:numFmt w:val="bullet"/>
-      <w:lvlText w:val="▪"/>
-      <w:lvlJc w:val="left"/>
-      <w:pPr>
-        <w:tabs>
-          <w:tab w:val="num" w:pos="3600"/>
-        </w:tabs>
-        <w:ind w:left="3600" w:hanging="360"/>
-      </w:pPr>
-      <w:rPr>
-        <w:rFonts w:ascii="OpenSymbol" w:hAnsi="OpenSymbol" w:cs="OpenSymbol" w:hint="default"/>
-      </w:rPr>
+      <w:start w:val="4"/>
+      <w:numFmt w:val="decimal"/>
+      <w:lvlText w:val="%9."/>
+      <w:lvlJc w:val="left"/>
+      <w:pPr>
+        <w:tabs>
+          <w:tab w:val="num" w:pos="0"/>
+        </w:tabs>
+        <w:ind w:left="6480" w:hanging="480"/>
+      </w:pPr>
+      <w:rPr/>
     </w:lvl>
   </w:abstractNum>
   <w:abstractNum w:abstractNumId="17">
     <w:lvl w:ilvl="0">
       <w:start w:val="1"/>
-      <w:numFmt w:val="bullet"/>
-      <w:lvlText w:val=""/>
-      <w:lvlJc w:val="left"/>
-      <w:pPr>
-        <w:tabs>
-          <w:tab w:val="num" w:pos="720"/>
-        </w:tabs>
-        <w:ind w:left="720" w:hanging="360"/>
-      </w:pPr>
-      <w:rPr>
-        <w:rFonts w:ascii="Symbol" w:hAnsi="Symbol" w:cs="Symbol" w:hint="default"/>
-      </w:rPr>
+      <w:numFmt w:val="decimal"/>
+      <w:lvlText w:val="%1."/>
+      <w:lvlJc w:val="left"/>
+      <w:pPr>
+        <w:tabs>
+          <w:tab w:val="num" w:pos="0"/>
+        </w:tabs>
+        <w:ind w:left="720" w:hanging="480"/>
+      </w:pPr>
+      <w:rPr/>
     </w:lvl>
     <w:lvl w:ilvl="1">
       <w:start w:val="1"/>
-      <w:numFmt w:val="bullet"/>
-      <w:lvlText w:val="◦"/>
-      <w:lvlJc w:val="left"/>
-      <w:pPr>
-        <w:tabs>
-          <w:tab w:val="num" w:pos="1080"/>
-        </w:tabs>
-        <w:ind w:left="1080" w:hanging="360"/>
-      </w:pPr>
-      <w:rPr>
-        <w:rFonts w:ascii="OpenSymbol" w:hAnsi="OpenSymbol" w:cs="OpenSymbol" w:hint="default"/>
-      </w:rPr>
+      <w:numFmt w:val="decimal"/>
+      <w:lvlText w:val="%2."/>
+      <w:lvlJc w:val="left"/>
+      <w:pPr>
+        <w:tabs>
+          <w:tab w:val="num" w:pos="0"/>
+        </w:tabs>
+        <w:ind w:left="1440" w:hanging="480"/>
+      </w:pPr>
+      <w:rPr/>
     </w:lvl>
     <w:lvl w:ilvl="2">
       <w:start w:val="1"/>
-      <w:numFmt w:val="bullet"/>
-      <w:lvlText w:val="▪"/>
-      <w:lvlJc w:val="left"/>
-      <w:pPr>
-        <w:tabs>
-          <w:tab w:val="num" w:pos="1440"/>
-        </w:tabs>
-        <w:ind w:left="1440" w:hanging="360"/>
-      </w:pPr>
-      <w:rPr>
-        <w:rFonts w:ascii="OpenSymbol" w:hAnsi="OpenSymbol" w:cs="OpenSymbol" w:hint="default"/>
-      </w:rPr>
+      <w:numFmt w:val="decimal"/>
+      <w:lvlText w:val="%3."/>
+      <w:lvlJc w:val="left"/>
+      <w:pPr>
+        <w:tabs>
+          <w:tab w:val="num" w:pos="0"/>
+        </w:tabs>
+        <w:ind w:left="2160" w:hanging="480"/>
+      </w:pPr>
+      <w:rPr/>
     </w:lvl>
     <w:lvl w:ilvl="3">
       <w:start w:val="1"/>
-      <w:numFmt w:val="bullet"/>
-      <w:lvlText w:val=""/>
-      <w:lvlJc w:val="left"/>
-      <w:pPr>
-        <w:tabs>
-          <w:tab w:val="num" w:pos="1800"/>
-        </w:tabs>
-        <w:ind w:left="1800" w:hanging="360"/>
-      </w:pPr>
-      <w:rPr>
-        <w:rFonts w:ascii="Symbol" w:hAnsi="Symbol" w:cs="Symbol" w:hint="default"/>
-      </w:rPr>
+      <w:numFmt w:val="decimal"/>
+      <w:lvlText w:val="%4."/>
+      <w:lvlJc w:val="left"/>
+      <w:pPr>
+        <w:tabs>
+          <w:tab w:val="num" w:pos="0"/>
+        </w:tabs>
+        <w:ind w:left="2880" w:hanging="480"/>
+      </w:pPr>
+      <w:rPr/>
     </w:lvl>
     <w:lvl w:ilvl="4">
       <w:start w:val="1"/>
-      <w:numFmt w:val="bullet"/>
-      <w:lvlText w:val="◦"/>
-      <w:lvlJc w:val="left"/>
-      <w:pPr>
-        <w:tabs>
-          <w:tab w:val="num" w:pos="2160"/>
-        </w:tabs>
-        <w:ind w:left="2160" w:hanging="360"/>
-      </w:pPr>
-      <w:rPr>
-        <w:rFonts w:ascii="OpenSymbol" w:hAnsi="OpenSymbol" w:cs="OpenSymbol" w:hint="default"/>
-      </w:rPr>
+      <w:numFmt w:val="decimal"/>
+      <w:lvlText w:val="%5."/>
+      <w:lvlJc w:val="left"/>
+      <w:pPr>
+        <w:tabs>
+          <w:tab w:val="num" w:pos="0"/>
+        </w:tabs>
+        <w:ind w:left="3600" w:hanging="480"/>
+      </w:pPr>
+      <w:rPr/>
     </w:lvl>
     <w:lvl w:ilvl="5">
       <w:start w:val="1"/>
-      <w:numFmt w:val="bullet"/>
-      <w:lvlText w:val="▪"/>
-      <w:lvlJc w:val="left"/>
-      <w:pPr>
-        <w:tabs>
-          <w:tab w:val="num" w:pos="2520"/>
-        </w:tabs>
-        <w:ind w:left="2520" w:hanging="360"/>
-      </w:pPr>
-      <w:rPr>
-        <w:rFonts w:ascii="OpenSymbol" w:hAnsi="OpenSymbol" w:cs="OpenSymbol" w:hint="default"/>
-      </w:rPr>
+      <w:numFmt w:val="decimal"/>
+      <w:lvlText w:val="%6."/>
+      <w:lvlJc w:val="left"/>
+      <w:pPr>
+        <w:tabs>
+          <w:tab w:val="num" w:pos="0"/>
+        </w:tabs>
+        <w:ind w:left="4320" w:hanging="480"/>
+      </w:pPr>
+      <w:rPr/>
     </w:lvl>
     <w:lvl w:ilvl="6">
       <w:start w:val="1"/>
-      <w:numFmt w:val="bullet"/>
-      <w:lvlText w:val=""/>
-      <w:lvlJc w:val="left"/>
-      <w:pPr>
-        <w:tabs>
-          <w:tab w:val="num" w:pos="2880"/>
-        </w:tabs>
-        <w:ind w:left="2880" w:hanging="360"/>
-      </w:pPr>
-      <w:rPr>
-        <w:rFonts w:ascii="Symbol" w:hAnsi="Symbol" w:cs="Symbol" w:hint="default"/>
-      </w:rPr>
+      <w:numFmt w:val="decimal"/>
+      <w:lvlText w:val="%7."/>
+      <w:lvlJc w:val="left"/>
+      <w:pPr>
+        <w:tabs>
+          <w:tab w:val="num" w:pos="0"/>
+        </w:tabs>
+        <w:ind w:left="5040" w:hanging="480"/>
+      </w:pPr>
+      <w:rPr/>
     </w:lvl>
     <w:lvl w:ilvl="7">
       <w:start w:val="1"/>
-      <w:numFmt w:val="bullet"/>
-      <w:lvlText w:val="◦"/>
-      <w:lvlJc w:val="left"/>
-      <w:pPr>
-        <w:tabs>
-          <w:tab w:val="num" w:pos="3240"/>
-        </w:tabs>
-        <w:ind w:left="3240" w:hanging="360"/>
-      </w:pPr>
-      <w:rPr>
-        <w:rFonts w:ascii="OpenSymbol" w:hAnsi="OpenSymbol" w:cs="OpenSymbol" w:hint="default"/>
-      </w:rPr>
+      <w:numFmt w:val="decimal"/>
+      <w:lvlText w:val="%8."/>
+      <w:lvlJc w:val="left"/>
+      <w:pPr>
+        <w:tabs>
+          <w:tab w:val="num" w:pos="0"/>
+        </w:tabs>
+        <w:ind w:left="5760" w:hanging="480"/>
+      </w:pPr>
+      <w:rPr/>
     </w:lvl>
     <w:lvl w:ilvl="8">
       <w:start w:val="1"/>
-      <w:numFmt w:val="bullet"/>
-      <w:lvlText w:val="▪"/>
-      <w:lvlJc w:val="left"/>
-      <w:pPr>
-        <w:tabs>
-          <w:tab w:val="num" w:pos="3600"/>
-        </w:tabs>
-        <w:ind w:left="3600" w:hanging="360"/>
-      </w:pPr>
-      <w:rPr>
-        <w:rFonts w:ascii="OpenSymbol" w:hAnsi="OpenSymbol" w:cs="OpenSymbol" w:hint="default"/>
-      </w:rPr>
+      <w:numFmt w:val="decimal"/>
+      <w:lvlText w:val="%9."/>
+      <w:lvlJc w:val="left"/>
+      <w:pPr>
+        <w:tabs>
+          <w:tab w:val="num" w:pos="0"/>
+        </w:tabs>
+        <w:ind w:left="6480" w:hanging="480"/>
+      </w:pPr>
+      <w:rPr/>
     </w:lvl>
   </w:abstractNum>
   <w:abstractNum w:abstractNumId="18">
@@ -9667,9 +9840,9 @@
       <w:lvlJc w:val="left"/>
       <w:pPr>
         <w:tabs>
-          <w:tab w:val="num" w:pos="720"/>
-        </w:tabs>
-        <w:ind w:left="720" w:hanging="360"/>
+          <w:tab w:val="num" w:pos="0"/>
+        </w:tabs>
+        <w:ind w:left="720" w:hanging="480"/>
       </w:pPr>
       <w:rPr/>
     </w:lvl>
@@ -9680,9 +9853,9 @@
       <w:lvlJc w:val="left"/>
       <w:pPr>
         <w:tabs>
-          <w:tab w:val="num" w:pos="1080"/>
-        </w:tabs>
-        <w:ind w:left="1080" w:hanging="360"/>
+          <w:tab w:val="num" w:pos="0"/>
+        </w:tabs>
+        <w:ind w:left="1440" w:hanging="480"/>
       </w:pPr>
       <w:rPr/>
     </w:lvl>
@@ -9693,9 +9866,9 @@
       <w:lvlJc w:val="left"/>
       <w:pPr>
         <w:tabs>
-          <w:tab w:val="num" w:pos="1440"/>
-        </w:tabs>
-        <w:ind w:left="1440" w:hanging="360"/>
+          <w:tab w:val="num" w:pos="0"/>
+        </w:tabs>
+        <w:ind w:left="2160" w:hanging="480"/>
       </w:pPr>
       <w:rPr/>
     </w:lvl>
@@ -9706,9 +9879,9 @@
       <w:lvlJc w:val="left"/>
       <w:pPr>
         <w:tabs>
-          <w:tab w:val="num" w:pos="1800"/>
-        </w:tabs>
-        <w:ind w:left="1800" w:hanging="360"/>
+          <w:tab w:val="num" w:pos="0"/>
+        </w:tabs>
+        <w:ind w:left="2880" w:hanging="480"/>
       </w:pPr>
       <w:rPr/>
     </w:lvl>
@@ -9719,9 +9892,9 @@
       <w:lvlJc w:val="left"/>
       <w:pPr>
         <w:tabs>
-          <w:tab w:val="num" w:pos="2160"/>
-        </w:tabs>
-        <w:ind w:left="2160" w:hanging="360"/>
+          <w:tab w:val="num" w:pos="0"/>
+        </w:tabs>
+        <w:ind w:left="3600" w:hanging="480"/>
       </w:pPr>
       <w:rPr/>
     </w:lvl>
@@ -9732,9 +9905,9 @@
       <w:lvlJc w:val="left"/>
       <w:pPr>
         <w:tabs>
-          <w:tab w:val="num" w:pos="2520"/>
-        </w:tabs>
-        <w:ind w:left="2520" w:hanging="360"/>
+          <w:tab w:val="num" w:pos="0"/>
+        </w:tabs>
+        <w:ind w:left="4320" w:hanging="480"/>
       </w:pPr>
       <w:rPr/>
     </w:lvl>
@@ -9745,9 +9918,9 @@
       <w:lvlJc w:val="left"/>
       <w:pPr>
         <w:tabs>
-          <w:tab w:val="num" w:pos="2880"/>
-        </w:tabs>
-        <w:ind w:left="2880" w:hanging="360"/>
+          <w:tab w:val="num" w:pos="0"/>
+        </w:tabs>
+        <w:ind w:left="5040" w:hanging="480"/>
       </w:pPr>
       <w:rPr/>
     </w:lvl>
@@ -9758,9 +9931,9 @@
       <w:lvlJc w:val="left"/>
       <w:pPr>
         <w:tabs>
-          <w:tab w:val="num" w:pos="3240"/>
-        </w:tabs>
-        <w:ind w:left="3240" w:hanging="360"/>
+          <w:tab w:val="num" w:pos="0"/>
+        </w:tabs>
+        <w:ind w:left="5760" w:hanging="480"/>
       </w:pPr>
       <w:rPr/>
     </w:lvl>
@@ -9771,422 +9944,368 @@
       <w:lvlJc w:val="left"/>
       <w:pPr>
         <w:tabs>
-          <w:tab w:val="num" w:pos="3600"/>
-        </w:tabs>
-        <w:ind w:left="3600" w:hanging="360"/>
+          <w:tab w:val="num" w:pos="0"/>
+        </w:tabs>
+        <w:ind w:left="6480" w:hanging="480"/>
       </w:pPr>
       <w:rPr/>
     </w:lvl>
   </w:abstractNum>
   <w:abstractNum w:abstractNumId="19">
     <w:lvl w:ilvl="0">
-      <w:start w:val="1"/>
-      <w:numFmt w:val="bullet"/>
-      <w:lvlText w:val=""/>
-      <w:lvlJc w:val="left"/>
-      <w:pPr>
-        <w:tabs>
-          <w:tab w:val="num" w:pos="720"/>
-        </w:tabs>
-        <w:ind w:left="720" w:hanging="360"/>
-      </w:pPr>
-      <w:rPr>
-        <w:rFonts w:ascii="Symbol" w:hAnsi="Symbol" w:cs="Symbol" w:hint="default"/>
-      </w:rPr>
+      <w:start w:val="2"/>
+      <w:numFmt w:val="decimal"/>
+      <w:lvlText w:val="%1."/>
+      <w:lvlJc w:val="left"/>
+      <w:pPr>
+        <w:tabs>
+          <w:tab w:val="num" w:pos="0"/>
+        </w:tabs>
+        <w:ind w:left="720" w:hanging="480"/>
+      </w:pPr>
+      <w:rPr/>
     </w:lvl>
     <w:lvl w:ilvl="1">
-      <w:start w:val="1"/>
-      <w:numFmt w:val="bullet"/>
-      <w:lvlText w:val="◦"/>
-      <w:lvlJc w:val="left"/>
-      <w:pPr>
-        <w:tabs>
-          <w:tab w:val="num" w:pos="1080"/>
-        </w:tabs>
-        <w:ind w:left="1080" w:hanging="360"/>
-      </w:pPr>
-      <w:rPr>
-        <w:rFonts w:ascii="OpenSymbol" w:hAnsi="OpenSymbol" w:cs="OpenSymbol" w:hint="default"/>
-      </w:rPr>
+      <w:start w:val="2"/>
+      <w:numFmt w:val="decimal"/>
+      <w:lvlText w:val="%2."/>
+      <w:lvlJc w:val="left"/>
+      <w:pPr>
+        <w:tabs>
+          <w:tab w:val="num" w:pos="0"/>
+        </w:tabs>
+        <w:ind w:left="1440" w:hanging="480"/>
+      </w:pPr>
+      <w:rPr/>
     </w:lvl>
     <w:lvl w:ilvl="2">
-      <w:start w:val="1"/>
-      <w:numFmt w:val="bullet"/>
-      <w:lvlText w:val="▪"/>
-      <w:lvlJc w:val="left"/>
-      <w:pPr>
-        <w:tabs>
-          <w:tab w:val="num" w:pos="1440"/>
-        </w:tabs>
-        <w:ind w:left="1440" w:hanging="360"/>
-      </w:pPr>
-      <w:rPr>
-        <w:rFonts w:ascii="OpenSymbol" w:hAnsi="OpenSymbol" w:cs="OpenSymbol" w:hint="default"/>
-      </w:rPr>
+      <w:start w:val="2"/>
+      <w:numFmt w:val="decimal"/>
+      <w:lvlText w:val="%3."/>
+      <w:lvlJc w:val="left"/>
+      <w:pPr>
+        <w:tabs>
+          <w:tab w:val="num" w:pos="0"/>
+        </w:tabs>
+        <w:ind w:left="2160" w:hanging="480"/>
+      </w:pPr>
+      <w:rPr/>
     </w:lvl>
     <w:lvl w:ilvl="3">
-      <w:start w:val="1"/>
-      <w:numFmt w:val="bullet"/>
-      <w:lvlText w:val=""/>
-      <w:lvlJc w:val="left"/>
-      <w:pPr>
-        <w:tabs>
-          <w:tab w:val="num" w:pos="1800"/>
-        </w:tabs>
-        <w:ind w:left="1800" w:hanging="360"/>
-      </w:pPr>
-      <w:rPr>
-        <w:rFonts w:ascii="Symbol" w:hAnsi="Symbol" w:cs="Symbol" w:hint="default"/>
-      </w:rPr>
+      <w:start w:val="2"/>
+      <w:numFmt w:val="decimal"/>
+      <w:lvlText w:val="%4."/>
+      <w:lvlJc w:val="left"/>
+      <w:pPr>
+        <w:tabs>
+          <w:tab w:val="num" w:pos="0"/>
+        </w:tabs>
+        <w:ind w:left="2880" w:hanging="480"/>
+      </w:pPr>
+      <w:rPr/>
     </w:lvl>
     <w:lvl w:ilvl="4">
-      <w:start w:val="1"/>
-      <w:numFmt w:val="bullet"/>
-      <w:lvlText w:val="◦"/>
-      <w:lvlJc w:val="left"/>
-      <w:pPr>
-        <w:tabs>
-          <w:tab w:val="num" w:pos="2160"/>
-        </w:tabs>
-        <w:ind w:left="2160" w:hanging="360"/>
-      </w:pPr>
-      <w:rPr>
-        <w:rFonts w:ascii="OpenSymbol" w:hAnsi="OpenSymbol" w:cs="OpenSymbol" w:hint="default"/>
-      </w:rPr>
+      <w:start w:val="2"/>
+      <w:numFmt w:val="decimal"/>
+      <w:lvlText w:val="%5."/>
+      <w:lvlJc w:val="left"/>
+      <w:pPr>
+        <w:tabs>
+          <w:tab w:val="num" w:pos="0"/>
+        </w:tabs>
+        <w:ind w:left="3600" w:hanging="480"/>
+      </w:pPr>
+      <w:rPr/>
     </w:lvl>
     <w:lvl w:ilvl="5">
-      <w:start w:val="1"/>
-      <w:numFmt w:val="bullet"/>
-      <w:lvlText w:val="▪"/>
-      <w:lvlJc w:val="left"/>
-      <w:pPr>
-        <w:tabs>
-          <w:tab w:val="num" w:pos="2520"/>
-        </w:tabs>
-        <w:ind w:left="2520" w:hanging="360"/>
-      </w:pPr>
-      <w:rPr>
-        <w:rFonts w:ascii="OpenSymbol" w:hAnsi="OpenSymbol" w:cs="OpenSymbol" w:hint="default"/>
-      </w:rPr>
+      <w:start w:val="2"/>
+      <w:numFmt w:val="decimal"/>
+      <w:lvlText w:val="%6."/>
+      <w:lvlJc w:val="left"/>
+      <w:pPr>
+        <w:tabs>
+          <w:tab w:val="num" w:pos="0"/>
+        </w:tabs>
+        <w:ind w:left="4320" w:hanging="480"/>
+      </w:pPr>
+      <w:rPr/>
     </w:lvl>
     <w:lvl w:ilvl="6">
-      <w:start w:val="1"/>
-      <w:numFmt w:val="bullet"/>
-      <w:lvlText w:val=""/>
-      <w:lvlJc w:val="left"/>
-      <w:pPr>
-        <w:tabs>
-          <w:tab w:val="num" w:pos="2880"/>
-        </w:tabs>
-        <w:ind w:left="2880" w:hanging="360"/>
-      </w:pPr>
-      <w:rPr>
-        <w:rFonts w:ascii="Symbol" w:hAnsi="Symbol" w:cs="Symbol" w:hint="default"/>
-      </w:rPr>
+      <w:start w:val="2"/>
+      <w:numFmt w:val="decimal"/>
+      <w:lvlText w:val="%7."/>
+      <w:lvlJc w:val="left"/>
+      <w:pPr>
+        <w:tabs>
+          <w:tab w:val="num" w:pos="0"/>
+        </w:tabs>
+        <w:ind w:left="5040" w:hanging="480"/>
+      </w:pPr>
+      <w:rPr/>
     </w:lvl>
     <w:lvl w:ilvl="7">
-      <w:start w:val="1"/>
-      <w:numFmt w:val="bullet"/>
-      <w:lvlText w:val="◦"/>
-      <w:lvlJc w:val="left"/>
-      <w:pPr>
-        <w:tabs>
-          <w:tab w:val="num" w:pos="3240"/>
-        </w:tabs>
-        <w:ind w:left="3240" w:hanging="360"/>
-      </w:pPr>
-      <w:rPr>
-        <w:rFonts w:ascii="OpenSymbol" w:hAnsi="OpenSymbol" w:cs="OpenSymbol" w:hint="default"/>
-      </w:rPr>
+      <w:start w:val="2"/>
+      <w:numFmt w:val="decimal"/>
+      <w:lvlText w:val="%8."/>
+      <w:lvlJc w:val="left"/>
+      <w:pPr>
+        <w:tabs>
+          <w:tab w:val="num" w:pos="0"/>
+        </w:tabs>
+        <w:ind w:left="5760" w:hanging="480"/>
+      </w:pPr>
+      <w:rPr/>
     </w:lvl>
     <w:lvl w:ilvl="8">
-      <w:start w:val="1"/>
-      <w:numFmt w:val="bullet"/>
-      <w:lvlText w:val="▪"/>
-      <w:lvlJc w:val="left"/>
-      <w:pPr>
-        <w:tabs>
-          <w:tab w:val="num" w:pos="3600"/>
-        </w:tabs>
-        <w:ind w:left="3600" w:hanging="360"/>
-      </w:pPr>
-      <w:rPr>
-        <w:rFonts w:ascii="OpenSymbol" w:hAnsi="OpenSymbol" w:cs="OpenSymbol" w:hint="default"/>
-      </w:rPr>
+      <w:start w:val="2"/>
+      <w:numFmt w:val="decimal"/>
+      <w:lvlText w:val="%9."/>
+      <w:lvlJc w:val="left"/>
+      <w:pPr>
+        <w:tabs>
+          <w:tab w:val="num" w:pos="0"/>
+        </w:tabs>
+        <w:ind w:left="6480" w:hanging="480"/>
+      </w:pPr>
+      <w:rPr/>
     </w:lvl>
   </w:abstractNum>
   <w:abstractNum w:abstractNumId="20">
     <w:lvl w:ilvl="0">
-      <w:start w:val="1"/>
-      <w:numFmt w:val="bullet"/>
-      <w:lvlText w:val=""/>
-      <w:lvlJc w:val="left"/>
-      <w:pPr>
-        <w:tabs>
-          <w:tab w:val="num" w:pos="720"/>
-        </w:tabs>
-        <w:ind w:left="720" w:hanging="360"/>
-      </w:pPr>
-      <w:rPr>
-        <w:rFonts w:ascii="Symbol" w:hAnsi="Symbol" w:cs="Symbol" w:hint="default"/>
-      </w:rPr>
+      <w:start w:val="3"/>
+      <w:numFmt w:val="decimal"/>
+      <w:lvlText w:val="%1."/>
+      <w:lvlJc w:val="left"/>
+      <w:pPr>
+        <w:tabs>
+          <w:tab w:val="num" w:pos="0"/>
+        </w:tabs>
+        <w:ind w:left="720" w:hanging="480"/>
+      </w:pPr>
+      <w:rPr/>
     </w:lvl>
     <w:lvl w:ilvl="1">
-      <w:start w:val="1"/>
-      <w:numFmt w:val="bullet"/>
-      <w:lvlText w:val="◦"/>
-      <w:lvlJc w:val="left"/>
-      <w:pPr>
-        <w:tabs>
-          <w:tab w:val="num" w:pos="1080"/>
-        </w:tabs>
-        <w:ind w:left="1080" w:hanging="360"/>
-      </w:pPr>
-      <w:rPr>
-        <w:rFonts w:ascii="OpenSymbol" w:hAnsi="OpenSymbol" w:cs="OpenSymbol" w:hint="default"/>
-      </w:rPr>
+      <w:start w:val="3"/>
+      <w:numFmt w:val="decimal"/>
+      <w:lvlText w:val="%2."/>
+      <w:lvlJc w:val="left"/>
+      <w:pPr>
+        <w:tabs>
+          <w:tab w:val="num" w:pos="0"/>
+        </w:tabs>
+        <w:ind w:left="1440" w:hanging="480"/>
+      </w:pPr>
+      <w:rPr/>
     </w:lvl>
     <w:lvl w:ilvl="2">
-      <w:start w:val="1"/>
-      <w:numFmt w:val="bullet"/>
-      <w:lvlText w:val="▪"/>
-      <w:lvlJc w:val="left"/>
-      <w:pPr>
-        <w:tabs>
-          <w:tab w:val="num" w:pos="1440"/>
-        </w:tabs>
-        <w:ind w:left="1440" w:hanging="360"/>
-      </w:pPr>
-      <w:rPr>
-        <w:rFonts w:ascii="OpenSymbol" w:hAnsi="OpenSymbol" w:cs="OpenSymbol" w:hint="default"/>
-      </w:rPr>
+      <w:start w:val="3"/>
+      <w:numFmt w:val="decimal"/>
+      <w:lvlText w:val="%3."/>
+      <w:lvlJc w:val="left"/>
+      <w:pPr>
+        <w:tabs>
+          <w:tab w:val="num" w:pos="0"/>
+        </w:tabs>
+        <w:ind w:left="2160" w:hanging="480"/>
+      </w:pPr>
+      <w:rPr/>
     </w:lvl>
     <w:lvl w:ilvl="3">
-      <w:start w:val="1"/>
-      <w:numFmt w:val="bullet"/>
-      <w:lvlText w:val=""/>
-      <w:lvlJc w:val="left"/>
-      <w:pPr>
-        <w:tabs>
-          <w:tab w:val="num" w:pos="1800"/>
-        </w:tabs>
-        <w:ind w:left="1800" w:hanging="360"/>
-      </w:pPr>
-      <w:rPr>
-        <w:rFonts w:ascii="Symbol" w:hAnsi="Symbol" w:cs="Symbol" w:hint="default"/>
-      </w:rPr>
+      <w:start w:val="3"/>
+      <w:numFmt w:val="decimal"/>
+      <w:lvlText w:val="%4."/>
+      <w:lvlJc w:val="left"/>
+      <w:pPr>
+        <w:tabs>
+          <w:tab w:val="num" w:pos="0"/>
+        </w:tabs>
+        <w:ind w:left="2880" w:hanging="480"/>
+      </w:pPr>
+      <w:rPr/>
     </w:lvl>
     <w:lvl w:ilvl="4">
-      <w:start w:val="1"/>
-      <w:numFmt w:val="bullet"/>
-      <w:lvlText w:val="◦"/>
-      <w:lvlJc w:val="left"/>
-      <w:pPr>
-        <w:tabs>
-          <w:tab w:val="num" w:pos="2160"/>
-        </w:tabs>
-        <w:ind w:left="2160" w:hanging="360"/>
-      </w:pPr>
-      <w:rPr>
-        <w:rFonts w:ascii="OpenSymbol" w:hAnsi="OpenSymbol" w:cs="OpenSymbol" w:hint="default"/>
-      </w:rPr>
+      <w:start w:val="3"/>
+      <w:numFmt w:val="decimal"/>
+      <w:lvlText w:val="%5."/>
+      <w:lvlJc w:val="left"/>
+      <w:pPr>
+        <w:tabs>
+          <w:tab w:val="num" w:pos="0"/>
+        </w:tabs>
+        <w:ind w:left="3600" w:hanging="480"/>
+      </w:pPr>
+      <w:rPr/>
     </w:lvl>
     <w:lvl w:ilvl="5">
-      <w:start w:val="1"/>
-      <w:numFmt w:val="bullet"/>
-      <w:lvlText w:val="▪"/>
-      <w:lvlJc w:val="left"/>
-      <w:pPr>
-        <w:tabs>
-          <w:tab w:val="num" w:pos="2520"/>
-        </w:tabs>
-        <w:ind w:left="2520" w:hanging="360"/>
-      </w:pPr>
-      <w:rPr>
-        <w:rFonts w:ascii="OpenSymbol" w:hAnsi="OpenSymbol" w:cs="OpenSymbol" w:hint="default"/>
-      </w:rPr>
+      <w:start w:val="3"/>
+      <w:numFmt w:val="decimal"/>
+      <w:lvlText w:val="%6."/>
+      <w:lvlJc w:val="left"/>
+      <w:pPr>
+        <w:tabs>
+          <w:tab w:val="num" w:pos="0"/>
+        </w:tabs>
+        <w:ind w:left="4320" w:hanging="480"/>
+      </w:pPr>
+      <w:rPr/>
     </w:lvl>
     <w:lvl w:ilvl="6">
-      <w:start w:val="1"/>
-      <w:numFmt w:val="bullet"/>
-      <w:lvlText w:val=""/>
-      <w:lvlJc w:val="left"/>
-      <w:pPr>
-        <w:tabs>
-          <w:tab w:val="num" w:pos="2880"/>
-        </w:tabs>
-        <w:ind w:left="2880" w:hanging="360"/>
-      </w:pPr>
-      <w:rPr>
-        <w:rFonts w:ascii="Symbol" w:hAnsi="Symbol" w:cs="Symbol" w:hint="default"/>
-      </w:rPr>
+      <w:start w:val="3"/>
+      <w:numFmt w:val="decimal"/>
+      <w:lvlText w:val="%7."/>
+      <w:lvlJc w:val="left"/>
+      <w:pPr>
+        <w:tabs>
+          <w:tab w:val="num" w:pos="0"/>
+        </w:tabs>
+        <w:ind w:left="5040" w:hanging="480"/>
+      </w:pPr>
+      <w:rPr/>
     </w:lvl>
     <w:lvl w:ilvl="7">
-      <w:start w:val="1"/>
-      <w:numFmt w:val="bullet"/>
-      <w:lvlText w:val="◦"/>
-      <w:lvlJc w:val="left"/>
-      <w:pPr>
-        <w:tabs>
-          <w:tab w:val="num" w:pos="3240"/>
-        </w:tabs>
-        <w:ind w:left="3240" w:hanging="360"/>
-      </w:pPr>
-      <w:rPr>
-        <w:rFonts w:ascii="OpenSymbol" w:hAnsi="OpenSymbol" w:cs="OpenSymbol" w:hint="default"/>
-      </w:rPr>
+      <w:start w:val="3"/>
+      <w:numFmt w:val="decimal"/>
+      <w:lvlText w:val="%8."/>
+      <w:lvlJc w:val="left"/>
+      <w:pPr>
+        <w:tabs>
+          <w:tab w:val="num" w:pos="0"/>
+        </w:tabs>
+        <w:ind w:left="5760" w:hanging="480"/>
+      </w:pPr>
+      <w:rPr/>
     </w:lvl>
     <w:lvl w:ilvl="8">
-      <w:start w:val="1"/>
-      <w:numFmt w:val="bullet"/>
-      <w:lvlText w:val="▪"/>
-      <w:lvlJc w:val="left"/>
-      <w:pPr>
-        <w:tabs>
-          <w:tab w:val="num" w:pos="3600"/>
-        </w:tabs>
-        <w:ind w:left="3600" w:hanging="360"/>
-      </w:pPr>
-      <w:rPr>
-        <w:rFonts w:ascii="OpenSymbol" w:hAnsi="OpenSymbol" w:cs="OpenSymbol" w:hint="default"/>
-      </w:rPr>
+      <w:start w:val="3"/>
+      <w:numFmt w:val="decimal"/>
+      <w:lvlText w:val="%9."/>
+      <w:lvlJc w:val="left"/>
+      <w:pPr>
+        <w:tabs>
+          <w:tab w:val="num" w:pos="0"/>
+        </w:tabs>
+        <w:ind w:left="6480" w:hanging="480"/>
+      </w:pPr>
+      <w:rPr/>
     </w:lvl>
   </w:abstractNum>
   <w:abstractNum w:abstractNumId="21">
     <w:lvl w:ilvl="0">
-      <w:start w:val="1"/>
-      <w:numFmt w:val="bullet"/>
-      <w:lvlText w:val=""/>
-      <w:lvlJc w:val="left"/>
-      <w:pPr>
-        <w:tabs>
-          <w:tab w:val="num" w:pos="720"/>
-        </w:tabs>
-        <w:ind w:left="720" w:hanging="360"/>
-      </w:pPr>
-      <w:rPr>
-        <w:rFonts w:ascii="Symbol" w:hAnsi="Symbol" w:cs="Symbol" w:hint="default"/>
-      </w:rPr>
+      <w:start w:val="4"/>
+      <w:numFmt w:val="decimal"/>
+      <w:lvlText w:val="%1."/>
+      <w:lvlJc w:val="left"/>
+      <w:pPr>
+        <w:tabs>
+          <w:tab w:val="num" w:pos="0"/>
+        </w:tabs>
+        <w:ind w:left="720" w:hanging="480"/>
+      </w:pPr>
+      <w:rPr/>
     </w:lvl>
     <w:lvl w:ilvl="1">
-      <w:start w:val="1"/>
-      <w:numFmt w:val="bullet"/>
-      <w:lvlText w:val="◦"/>
-      <w:lvlJc w:val="left"/>
-      <w:pPr>
-        <w:tabs>
-          <w:tab w:val="num" w:pos="1080"/>
-        </w:tabs>
-        <w:ind w:left="1080" w:hanging="360"/>
-      </w:pPr>
-      <w:rPr>
-        <w:rFonts w:ascii="OpenSymbol" w:hAnsi="OpenSymbol" w:cs="OpenSymbol" w:hint="default"/>
-      </w:rPr>
+      <w:start w:val="4"/>
+      <w:numFmt w:val="decimal"/>
+      <w:lvlText w:val="%2."/>
+      <w:lvlJc w:val="left"/>
+      <w:pPr>
+        <w:tabs>
+          <w:tab w:val="num" w:pos="0"/>
+        </w:tabs>
+        <w:ind w:left="1440" w:hanging="480"/>
+      </w:pPr>
+      <w:rPr/>
     </w:lvl>
     <w:lvl w:ilvl="2">
-      <w:start w:val="1"/>
-      <w:numFmt w:val="bullet"/>
-      <w:lvlText w:val="▪"/>
-      <w:lvlJc w:val="left"/>
-      <w:pPr>
-        <w:tabs>
-          <w:tab w:val="num" w:pos="1440"/>
-        </w:tabs>
-        <w:ind w:left="1440" w:hanging="360"/>
-      </w:pPr>
-      <w:rPr>
-        <w:rFonts w:ascii="OpenSymbol" w:hAnsi="OpenSymbol" w:cs="OpenSymbol" w:hint="default"/>
-      </w:rPr>
+      <w:start w:val="4"/>
+      <w:numFmt w:val="decimal"/>
+      <w:lvlText w:val="%3."/>
+      <w:lvlJc w:val="left"/>
+      <w:pPr>
+        <w:tabs>
+          <w:tab w:val="num" w:pos="0"/>
+        </w:tabs>
+        <w:ind w:left="2160" w:hanging="480"/>
+      </w:pPr>
+      <w:rPr/>
     </w:lvl>
     <w:lvl w:ilvl="3">
-      <w:start w:val="1"/>
-      <w:numFmt w:val="bullet"/>
-      <w:lvlText w:val=""/>
-      <w:lvlJc w:val="left"/>
-      <w:pPr>
-        <w:tabs>
-          <w:tab w:val="num" w:pos="1800"/>
-        </w:tabs>
-        <w:ind w:left="1800" w:hanging="360"/>
-      </w:pPr>
-      <w:rPr>
-        <w:rFonts w:ascii="Symbol" w:hAnsi="Symbol" w:cs="Symbol" w:hint="default"/>
-      </w:rPr>
+      <w:start w:val="4"/>
+      <w:numFmt w:val="decimal"/>
+      <w:lvlText w:val="%4."/>
+      <w:lvlJc w:val="left"/>
+      <w:pPr>
+        <w:tabs>
+          <w:tab w:val="num" w:pos="0"/>
+        </w:tabs>
+        <w:ind w:left="2880" w:hanging="480"/>
+      </w:pPr>
+      <w:rPr/>
     </w:lvl>
     <w:lvl w:ilvl="4">
-      <w:start w:val="1"/>
-      <w:numFmt w:val="bullet"/>
-      <w:lvlText w:val="◦"/>
-      <w:lvlJc w:val="left"/>
-      <w:pPr>
-        <w:tabs>
-          <w:tab w:val="num" w:pos="2160"/>
-        </w:tabs>
-        <w:ind w:left="2160" w:hanging="360"/>
-      </w:pPr>
-      <w:rPr>
-        <w:rFonts w:ascii="OpenSymbol" w:hAnsi="OpenSymbol" w:cs="OpenSymbol" w:hint="default"/>
-      </w:rPr>
+      <w:start w:val="4"/>
+      <w:numFmt w:val="decimal"/>
+      <w:lvlText w:val="%5."/>
+      <w:lvlJc w:val="left"/>
+      <w:pPr>
+        <w:tabs>
+          <w:tab w:val="num" w:pos="0"/>
+        </w:tabs>
+        <w:ind w:left="3600" w:hanging="480"/>
+      </w:pPr>
+      <w:rPr/>
     </w:lvl>
     <w:lvl w:ilvl="5">
-      <w:start w:val="1"/>
-      <w:numFmt w:val="bullet"/>
-      <w:lvlText w:val="▪"/>
-      <w:lvlJc w:val="left"/>
-      <w:pPr>
-        <w:tabs>
-          <w:tab w:val="num" w:pos="2520"/>
-        </w:tabs>
-        <w:ind w:left="2520" w:hanging="360"/>
-      </w:pPr>
-      <w:rPr>
-        <w:rFonts w:ascii="OpenSymbol" w:hAnsi="OpenSymbol" w:cs="OpenSymbol" w:hint="default"/>
-      </w:rPr>
+      <w:start w:val="4"/>
+      <w:numFmt w:val="decimal"/>
+      <w:lvlText w:val="%6."/>
+      <w:lvlJc w:val="left"/>
+      <w:pPr>
+        <w:tabs>
+          <w:tab w:val="num" w:pos="0"/>
+        </w:tabs>
+        <w:ind w:left="4320" w:hanging="480"/>
+      </w:pPr>
+      <w:rPr/>
     </w:lvl>
     <w:lvl w:ilvl="6">
-      <w:start w:val="1"/>
-      <w:numFmt w:val="bullet"/>
-      <w:lvlText w:val=""/>
-      <w:lvlJc w:val="left"/>
-      <w:pPr>
-        <w:tabs>
-          <w:tab w:val="num" w:pos="2880"/>
-        </w:tabs>
-        <w:ind w:left="2880" w:hanging="360"/>
-      </w:pPr>
-      <w:rPr>
-        <w:rFonts w:ascii="Symbol" w:hAnsi="Symbol" w:cs="Symbol" w:hint="default"/>
-      </w:rPr>
+      <w:start w:val="4"/>
+      <w:numFmt w:val="decimal"/>
+      <w:lvlText w:val="%7."/>
+      <w:lvlJc w:val="left"/>
+      <w:pPr>
+        <w:tabs>
+          <w:tab w:val="num" w:pos="0"/>
+        </w:tabs>
+        <w:ind w:left="5040" w:hanging="480"/>
+      </w:pPr>
+      <w:rPr/>
     </w:lvl>
     <w:lvl w:ilvl="7">
-      <w:start w:val="1"/>
-      <w:numFmt w:val="bullet"/>
-      <w:lvlText w:val="◦"/>
-      <w:lvlJc w:val="left"/>
-      <w:pPr>
-        <w:tabs>
-          <w:tab w:val="num" w:pos="3240"/>
-        </w:tabs>
-        <w:ind w:left="3240" w:hanging="360"/>
-      </w:pPr>
-      <w:rPr>
-        <w:rFonts w:ascii="OpenSymbol" w:hAnsi="OpenSymbol" w:cs="OpenSymbol" w:hint="default"/>
-      </w:rPr>
+      <w:start w:val="4"/>
+      <w:numFmt w:val="decimal"/>
+      <w:lvlText w:val="%8."/>
+      <w:lvlJc w:val="left"/>
+      <w:pPr>
+        <w:tabs>
+          <w:tab w:val="num" w:pos="0"/>
+        </w:tabs>
+        <w:ind w:left="5760" w:hanging="480"/>
+      </w:pPr>
+      <w:rPr/>
     </w:lvl>
     <w:lvl w:ilvl="8">
-      <w:start w:val="1"/>
-      <w:numFmt w:val="bullet"/>
-      <w:lvlText w:val="▪"/>
-      <w:lvlJc w:val="left"/>
-      <w:pPr>
-        <w:tabs>
-          <w:tab w:val="num" w:pos="3600"/>
-        </w:tabs>
-        <w:ind w:left="3600" w:hanging="360"/>
-      </w:pPr>
-      <w:rPr>
-        <w:rFonts w:ascii="OpenSymbol" w:hAnsi="OpenSymbol" w:cs="OpenSymbol" w:hint="default"/>
-      </w:rPr>
+      <w:start w:val="4"/>
+      <w:numFmt w:val="decimal"/>
+      <w:lvlText w:val="%9."/>
+      <w:lvlJc w:val="left"/>
+      <w:pPr>
+        <w:tabs>
+          <w:tab w:val="num" w:pos="0"/>
+        </w:tabs>
+        <w:ind w:left="6480" w:hanging="480"/>
+      </w:pPr>
+      <w:rPr/>
     </w:lvl>
   </w:abstractNum>
   <w:abstractNum w:abstractNumId="22">
@@ -10375,61 +10494,61 @@
     <w:abstractNumId w:val="22"/>
   </w:num>
   <w:num w:numId="23">
-    <w:abstractNumId w:val="4"/>
+    <w:abstractNumId w:val="12"/>
     <w:lvlOverride w:ilvl="0">
       <w:startOverride w:val="1"/>
     </w:lvlOverride>
   </w:num>
   <w:num w:numId="24">
-    <w:abstractNumId w:val="5"/>
+    <w:abstractNumId w:val="13"/>
     <w:lvlOverride w:ilvl="0">
       <w:startOverride w:val="4"/>
     </w:lvlOverride>
   </w:num>
   <w:num w:numId="25">
-    <w:abstractNumId w:val="6"/>
+    <w:abstractNumId w:val="14"/>
     <w:lvlOverride w:ilvl="0">
       <w:startOverride w:val="7"/>
     </w:lvlOverride>
   </w:num>
   <w:num w:numId="26">
-    <w:abstractNumId w:val="7"/>
+    <w:abstractNumId w:val="15"/>
     <w:lvlOverride w:ilvl="0">
       <w:startOverride w:val="3"/>
     </w:lvlOverride>
   </w:num>
   <w:num w:numId="27">
-    <w:abstractNumId w:val="5"/>
+    <w:abstractNumId w:val="13"/>
     <w:lvlOverride w:ilvl="0">
       <w:startOverride w:val="4"/>
     </w:lvlOverride>
   </w:num>
   <w:num w:numId="28">
-    <w:abstractNumId w:val="4"/>
+    <w:abstractNumId w:val="12"/>
     <w:lvlOverride w:ilvl="0">
       <w:startOverride w:val="1"/>
     </w:lvlOverride>
   </w:num>
   <w:num w:numId="29">
-    <w:abstractNumId w:val="4"/>
+    <w:abstractNumId w:val="12"/>
     <w:lvlOverride w:ilvl="0">
       <w:startOverride w:val="1"/>
     </w:lvlOverride>
   </w:num>
   <w:num w:numId="30">
-    <w:abstractNumId w:val="11"/>
+    <w:abstractNumId w:val="19"/>
     <w:lvlOverride w:ilvl="0">
       <w:startOverride w:val="2"/>
     </w:lvlOverride>
   </w:num>
   <w:num w:numId="31">
-    <w:abstractNumId w:val="7"/>
+    <w:abstractNumId w:val="15"/>
     <w:lvlOverride w:ilvl="0">
       <w:startOverride w:val="3"/>
     </w:lvlOverride>
   </w:num>
   <w:num w:numId="32">
-    <w:abstractNumId w:val="5"/>
+    <w:abstractNumId w:val="13"/>
     <w:lvlOverride w:ilvl="0">
       <w:startOverride w:val="4"/>
     </w:lvlOverride>
@@ -10692,7 +10811,6 @@
   </w:style>
   <w:style w:type="character" w:styleId="FootnoteCharactersuser">
     <w:name w:val="Footnote Characters (user)"/>
-    <w:basedOn w:val="BodyTextChar"/>
     <w:qFormat/>
     <w:rPr>
       <w:vertAlign w:val="superscript"/>

</xml_diff>